<commit_message>
Fase 2: agrega diario de Felipe Monsalve, guia 2.4 y informe final 2.6
</commit_message>
<xml_diff>
--- a/Fase 2/Evidencias Grupales/2.4_GuiaEstudiante_Fase 2_DesarrolloProyecto APT (Español).docx
+++ b/Fase 2/Evidencias Grupales/2.4_GuiaEstudiante_Fase 2_DesarrolloProyecto APT (Español).docx
@@ -1,11 +1,8 @@
 
 <file path=word/document.xml><?xml version="1.0" encoding="utf-8"?>
-<w:document xmlns:wpc="http://schemas.microsoft.com/office/word/2010/wordprocessingCanvas" xmlns:cx="http://schemas.microsoft.com/office/drawing/2014/chartex" xmlns:mc="http://schemas.openxmlformats.org/markup-compatibility/2006" xmlns:o="urn:schemas-microsoft-com:office:office" xmlns:r="http://schemas.openxmlformats.org/officeDocument/2006/relationships" xmlns:m="http://schemas.openxmlformats.org/officeDocument/2006/math" xmlns:v="urn:schemas-microsoft-com:vml" xmlns:wp14="http://schemas.microsoft.com/office/word/2010/wordprocessingDrawing" xmlns:wp="http://schemas.openxmlformats.org/drawingml/2006/wordprocessingDrawing" xmlns:w10="urn:schemas-microsoft-com:office:word" xmlns:w="http://schemas.openxmlformats.org/wordprocessingml/2006/main" xmlns:w14="http://schemas.microsoft.com/office/word/2010/wordml" xmlns:w15="http://schemas.microsoft.com/office/word/2012/wordml" xmlns:w16se="http://schemas.microsoft.com/office/word/2015/wordml/symex" xmlns:wpg="http://schemas.microsoft.com/office/word/2010/wordprocessingGroup" xmlns:wpi="http://schemas.microsoft.com/office/word/2010/wordprocessingInk" xmlns:wne="http://schemas.microsoft.com/office/word/2006/wordml" xmlns:wps="http://schemas.microsoft.com/office/word/2010/wordprocessingShape" mc:Ignorable="w14 w15 w16se wp14">
+<w:document xmlns:wpc="http://schemas.microsoft.com/office/word/2010/wordprocessingCanvas" xmlns:cx="http://schemas.microsoft.com/office/drawing/2014/chartex" xmlns:cx1="http://schemas.microsoft.com/office/drawing/2015/9/8/chartex" xmlns:cx2="http://schemas.microsoft.com/office/drawing/2015/10/21/chartex" xmlns:cx3="http://schemas.microsoft.com/office/drawing/2016/5/9/chartex" xmlns:cx4="http://schemas.microsoft.com/office/drawing/2016/5/10/chartex" xmlns:cx5="http://schemas.microsoft.com/office/drawing/2016/5/11/chartex" xmlns:cx6="http://schemas.microsoft.com/office/drawing/2016/5/12/chartex" xmlns:cx7="http://schemas.microsoft.com/office/drawing/2016/5/13/chartex" xmlns:cx8="http://schemas.microsoft.com/office/drawing/2016/5/14/chartex" xmlns:mc="http://schemas.openxmlformats.org/markup-compatibility/2006" xmlns:aink="http://schemas.microsoft.com/office/drawing/2016/ink" xmlns:am3d="http://schemas.microsoft.com/office/drawing/2017/model3d" xmlns:o="urn:schemas-microsoft-com:office:office" xmlns:oel="http://schemas.microsoft.com/office/2019/extlst" xmlns:r="http://schemas.openxmlformats.org/officeDocument/2006/relationships" xmlns:m="http://schemas.openxmlformats.org/officeDocument/2006/math" xmlns:v="urn:schemas-microsoft-com:vml" xmlns:wp14="http://schemas.microsoft.com/office/word/2010/wordprocessingDrawing" xmlns:wp="http://schemas.openxmlformats.org/drawingml/2006/wordprocessingDrawing" xmlns:w10="urn:schemas-microsoft-com:office:word" xmlns:w="http://schemas.openxmlformats.org/wordprocessingml/2006/main" xmlns:w14="http://schemas.microsoft.com/office/word/2010/wordml" xmlns:w15="http://schemas.microsoft.com/office/word/2012/wordml" xmlns:w16cex="http://schemas.microsoft.com/office/word/2018/wordml/cex" xmlns:w16cid="http://schemas.microsoft.com/office/word/2016/wordml/cid" xmlns:w16="http://schemas.microsoft.com/office/word/2018/wordml" xmlns:w16du="http://schemas.microsoft.com/office/word/2023/wordml/word16du" xmlns:w16sdtdh="http://schemas.microsoft.com/office/word/2020/wordml/sdtdatahash" xmlns:w16sdtfl="http://schemas.microsoft.com/office/word/2024/wordml/sdtformatlock" xmlns:w16se="http://schemas.microsoft.com/office/word/2015/wordml/symex" xmlns:wpg="http://schemas.microsoft.com/office/word/2010/wordprocessingGroup" xmlns:wpi="http://schemas.microsoft.com/office/word/2010/wordprocessingInk" xmlns:wne="http://schemas.microsoft.com/office/word/2006/wordml" xmlns:wps="http://schemas.microsoft.com/office/word/2010/wordprocessingShape" mc:Ignorable="w14 w15 w16se w16cid w16 w16cex w16sdtdh w16sdtfl w16du wp14">
   <w:body>
-    <w:p>
-      <w:bookmarkStart w:id="0" w:name="_GoBack"/>
-      <w:bookmarkEnd w:id="0"/>
-    </w:p>
+    <w:p/>
     <w:p>
       <w:pPr>
         <w:rPr>
@@ -238,7 +235,7 @@
           </mc:Choice>
           <mc:Fallback>
             <w:pict>
-              <v:group w14:anchorId="39581AEC" id="Grupo 27" o:spid="_x0000_s1026" style="position:absolute;margin-left:0;margin-top:.75pt;width:491.25pt;height:123pt;z-index:251659264;mso-position-horizontal:center;mso-position-horizontal-relative:margin;mso-width-relative:margin;mso-height-relative:margin" coordsize="59912,15621" o:gfxdata="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">
+              <v:group w14:anchorId="39581AEC" id="Grupo 27" o:spid="_x0000_s1026" style="position:absolute;margin-left:0;margin-top:.75pt;width:491.25pt;height:123pt;z-index:251659264;mso-position-horizontal:center;mso-position-horizontal-relative:margin;mso-width-relative:margin;mso-height-relative:margin" coordsize="59912,15621" o:gfxdata="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">
                 <v:shapetype id="_x0000_t202" coordsize="21600,21600" o:spt="202" path="m,l,21600r21600,l21600,xe">
                   <v:stroke joinstyle="miter"/>
                   <v:path gradientshapeok="t" o:connecttype="rect"/>
@@ -430,7 +427,7 @@
     </w:p>
     <w:tbl>
       <w:tblPr>
-        <w:tblStyle w:val="Tablaconcuadrcula"/>
+        <w:tblStyle w:val="TableGrid"/>
         <w:tblW w:w="9639" w:type="dxa"/>
         <w:tblInd w:w="-572" w:type="dxa"/>
         <w:tblBorders>
@@ -524,7 +521,7 @@
           </w:tcPr>
           <w:p>
             <w:pPr>
-              <w:pStyle w:val="Piedepgina"/>
+              <w:pStyle w:val="Footer"/>
               <w:jc w:val="both"/>
               <w:rPr>
                 <w:rFonts w:ascii="Calibri" w:hAnsi="Calibri"/>
@@ -568,7 +565,7 @@
     </w:p>
     <w:tbl>
       <w:tblPr>
-        <w:tblStyle w:val="Tablaconcuadrcula"/>
+        <w:tblStyle w:val="TableGrid"/>
         <w:tblW w:w="9639" w:type="dxa"/>
         <w:tblInd w:w="-572" w:type="dxa"/>
         <w:tblBorders>
@@ -582,8 +579,8 @@
         <w:tblLook w:val="04A0" w:firstRow="1" w:lastRow="0" w:firstColumn="1" w:lastColumn="0" w:noHBand="0" w:noVBand="1"/>
       </w:tblPr>
       <w:tblGrid>
-        <w:gridCol w:w="2528"/>
-        <w:gridCol w:w="7111"/>
+        <w:gridCol w:w="2053"/>
+        <w:gridCol w:w="7586"/>
       </w:tblGrid>
       <w:tr>
         <w:tc>
@@ -781,6 +778,187 @@
                 <w:lang w:eastAsia="es-CL"/>
               </w:rPr>
               <w:t>En caso que hayas realizado ajustes a los objetivos o metodología, debes incluir dichos apartados nuevamente en este informe, señalando cuáles son dichos ajustes.</w:t>
+            </w:r>
+          </w:p>
+          <w:p>
+            <w:pPr>
+              <w:spacing w:before="60" w:after="60"/>
+              <w:jc w:val="both"/>
+            </w:pPr>
+            <w:r>
+              <w:rPr>
+                <w:rFonts w:ascii="Calibri" w:hAnsi="Calibri" w:cs="Calibri"/>
+              </w:rPr>
+              <w:t>Al 22-10-2026, un día antes de la entrega del producto, el proyecto Volvo Sistema de Gestión tiene la aplicación de escritorio funcionando para el área de Servicios Conectados de Volvo Chile. Como desarrollador full stack, he llevado a cabo las siguientes actividades y objetivos específicos:</w:t>
+            </w:r>
+          </w:p>
+          <w:p>
+            <w:pPr>
+              <w:spacing w:before="60" w:after="60"/>
+              <w:jc w:val="both"/>
+            </w:pPr>
+            <w:r>
+              <w:rPr>
+                <w:rFonts w:ascii="Calibri" w:hAnsi="Calibri" w:cs="Calibri"/>
+              </w:rPr>
+              <w:t xml:space="preserve">• </w:t>
+            </w:r>
+            <w:r>
+              <w:rPr>
+                <w:rFonts w:ascii="Calibri" w:hAnsi="Calibri" w:cs="Calibri"/>
+                <w:b/>
+                <w:bCs/>
+              </w:rPr>
+              <w:t>Base central de contratos (objetivo 1):</w:t>
+            </w:r>
+            <w:r>
+              <w:rPr>
+                <w:rFonts w:ascii="Calibri" w:hAnsi="Calibri" w:cs="Calibri"/>
+              </w:rPr>
+              <w:t xml:space="preserve"> reuní la información que estaba repartida en entre 10 y 15 planillas Excel en una base central donde cada fila es un contrato. Depuré el Registro Maestro original junto con la Product Owner y, en octubre, cambié la llave del VIN al ID de contrato en todas las pantallas, para que la reactivación de un camión no pise el contrato anterior.</w:t>
+            </w:r>
+          </w:p>
+          <w:p>
+            <w:pPr>
+              <w:spacing w:before="60" w:after="60"/>
+              <w:jc w:val="both"/>
+            </w:pPr>
+            <w:r>
+              <w:rPr>
+                <w:rFonts w:ascii="Calibri" w:hAnsi="Calibri" w:cs="Calibri"/>
+              </w:rPr>
+              <w:t xml:space="preserve">• </w:t>
+            </w:r>
+            <w:r>
+              <w:rPr>
+                <w:rFonts w:ascii="Calibri" w:hAnsi="Calibri" w:cs="Calibri"/>
+                <w:b/>
+                <w:bCs/>
+              </w:rPr>
+              <w:t>Módulos de gestión e importaciones (objetivo 2):</w:t>
+            </w:r>
+            <w:r>
+              <w:rPr>
+                <w:rFonts w:ascii="Calibri" w:hAnsi="Calibri" w:cs="Calibri"/>
+              </w:rPr>
+              <w:t xml:space="preserve"> desarrollé los módulos Clientes y Flota, Comercial, Operaciones, Ingresos y Conciliación (Provisiones, Contratos CM, Facturación Manual y JustTime) y Administración, junto con la importación de reportes desde SharePoint, Power BI y los contratos 3PC.</w:t>
+            </w:r>
+          </w:p>
+          <w:p>
+            <w:pPr>
+              <w:spacing w:before="60" w:after="60"/>
+              <w:jc w:val="both"/>
+            </w:pPr>
+            <w:r>
+              <w:rPr>
+                <w:rFonts w:ascii="Calibri" w:hAnsi="Calibri" w:cs="Calibri"/>
+              </w:rPr>
+              <w:t xml:space="preserve">• </w:t>
+            </w:r>
+            <w:r>
+              <w:rPr>
+                <w:rFonts w:ascii="Calibri" w:hAnsi="Calibri" w:cs="Calibri"/>
+                <w:b/>
+                <w:bCs/>
+              </w:rPr>
+              <w:t>Correos (objetivo 3):</w:t>
+            </w:r>
+            <w:r>
+              <w:rPr>
+                <w:rFonts w:ascii="Calibri" w:hAnsi="Calibri" w:cs="Calibri"/>
+              </w:rPr>
+              <w:t xml:space="preserve"> implementé el envío de correos a clientes con plantillas de Outlook, además de un directorio de ejecutivos.</w:t>
+            </w:r>
+          </w:p>
+          <w:p>
+            <w:pPr>
+              <w:spacing w:before="60" w:after="60"/>
+              <w:jc w:val="both"/>
+            </w:pPr>
+            <w:r>
+              <w:rPr>
+                <w:rFonts w:ascii="Calibri" w:hAnsi="Calibri" w:cs="Calibri"/>
+              </w:rPr>
+              <w:t xml:space="preserve">• </w:t>
+            </w:r>
+            <w:r>
+              <w:rPr>
+                <w:rFonts w:ascii="Calibri" w:hAnsi="Calibri" w:cs="Calibri"/>
+                <w:b/>
+                <w:bCs/>
+              </w:rPr>
+              <w:t>Seguridad de los datos (objetivo 4):</w:t>
+            </w:r>
+            <w:r>
+              <w:rPr>
+                <w:rFonts w:ascii="Calibri" w:hAnsi="Calibri" w:cs="Calibri"/>
+              </w:rPr>
+              <w:t xml:space="preserve"> respaldo obligatorio antes de guardar, guardado sobre copia temporal, historial de cambios y aviso cuando otra persona modifica un archivo.</w:t>
+            </w:r>
+          </w:p>
+          <w:p>
+            <w:pPr>
+              <w:spacing w:before="60" w:after="60"/>
+              <w:jc w:val="both"/>
+            </w:pPr>
+            <w:r>
+              <w:rPr>
+                <w:rFonts w:ascii="Calibri" w:hAnsi="Calibri" w:cs="Calibri"/>
+              </w:rPr>
+              <w:t xml:space="preserve">• </w:t>
+            </w:r>
+            <w:r>
+              <w:rPr>
+                <w:rFonts w:ascii="Calibri" w:hAnsi="Calibri" w:cs="Calibri"/>
+                <w:b/>
+                <w:bCs/>
+              </w:rPr>
+              <w:t>Dashboard (objetivo 5):</w:t>
+            </w:r>
+            <w:r>
+              <w:rPr>
+                <w:rFonts w:ascii="Calibri" w:hAnsi="Calibri" w:cs="Calibri"/>
+              </w:rPr>
+              <w:t xml:space="preserve"> lo rehice dentro de la aplicación el 21-10, con indicadores de Volvo Connect y de gestión del negocio.</w:t>
+            </w:r>
+          </w:p>
+          <w:p>
+            <w:pPr>
+              <w:spacing w:before="60" w:after="60"/>
+              <w:jc w:val="both"/>
+            </w:pPr>
+            <w:r>
+              <w:rPr>
+                <w:rFonts w:ascii="Calibri" w:hAnsi="Calibri" w:cs="Calibri"/>
+              </w:rPr>
+              <w:lastRenderedPageBreak/>
+              <w:t xml:space="preserve">• </w:t>
+            </w:r>
+            <w:r>
+              <w:rPr>
+                <w:rFonts w:ascii="Calibri" w:hAnsi="Calibri" w:cs="Calibri"/>
+                <w:b/>
+                <w:bCs/>
+              </w:rPr>
+              <w:t>Rendimiento y pruebas (parte del objetivo 6):</w:t>
+            </w:r>
+            <w:r>
+              <w:rPr>
+                <w:rFonts w:ascii="Calibri" w:hAnsi="Calibri" w:cs="Calibri"/>
+              </w:rPr>
+              <w:t xml:space="preserve"> la carga de la aplicación bajó de 6,2 s a 0,9 s y la lectura de la base de clientes de 11–17 s a 0,5 s. La aplicación cuenta con más de 1.000 pruebas automáticas sobre datos de prueba.</w:t>
+            </w:r>
+          </w:p>
+          <w:p>
+            <w:pPr>
+              <w:spacing w:before="60" w:after="60"/>
+              <w:jc w:val="both"/>
+            </w:pPr>
+            <w:r>
+              <w:rPr>
+                <w:rFonts w:ascii="Calibri" w:hAnsi="Calibri" w:cs="Calibri"/>
+              </w:rPr>
+              <w:t>Está pendiente lo que se hará después de la entrega del 23-10: las pruebas con usuarios del área, entre el 26-10 y el 13-11, con corrección de errores y mejoras, y la documentación final con las propuestas de mejora.</w:t>
             </w:r>
           </w:p>
         </w:tc>
@@ -806,6 +984,7 @@
                 <w:rFonts w:ascii="Calibri" w:hAnsi="Calibri"/>
                 <w:color w:val="1F3864" w:themeColor="accent1" w:themeShade="80"/>
               </w:rPr>
+              <w:lastRenderedPageBreak/>
               <w:t>Objetivos</w:t>
             </w:r>
           </w:p>
@@ -838,6 +1017,44 @@
                 <w:lang w:eastAsia="es-CL"/>
               </w:rPr>
               <w:t>Opcional en caso de ajuste</w:t>
+            </w:r>
+          </w:p>
+          <w:p>
+            <w:pPr>
+              <w:spacing w:before="60" w:after="60"/>
+              <w:jc w:val="both"/>
+            </w:pPr>
+            <w:r>
+              <w:rPr>
+                <w:rFonts w:ascii="Calibri" w:hAnsi="Calibri" w:cs="Calibri"/>
+              </w:rPr>
+              <w:t>Ajuste en el objetivo específico 5. El objetivo original era integrar a la aplicación el dashboard web de Servicios Conectados que desarrollaba otro practicante, que reunía tres dashboards en una página. Como esa integración dejaba obsoleto el trabajo de ambos y no cubría bien la necesidad, el objetivo quedó así:</w:t>
+            </w:r>
+          </w:p>
+          <w:p>
+            <w:pPr>
+              <w:spacing w:before="60" w:after="60"/>
+              <w:jc w:val="both"/>
+            </w:pPr>
+            <w:r>
+              <w:rPr>
+                <w:rFonts w:ascii="Calibri" w:hAnsi="Calibri" w:cs="Calibri"/>
+                <w:b/>
+                <w:bCs/>
+              </w:rPr>
+              <w:t>5. Construir dentro de la aplicación un dashboard de gestión que muestre de un vistazo cómo le está yendo al negocio, reuniendo los indicadores de Volvo Connect que otro practicante presentaba en tres dashboards unidos en una página web, y sumando indicadores propios.</w:t>
+            </w:r>
+          </w:p>
+          <w:p>
+            <w:pPr>
+              <w:spacing w:before="60" w:after="60"/>
+              <w:jc w:val="both"/>
+            </w:pPr>
+            <w:r>
+              <w:rPr>
+                <w:rFonts w:ascii="Calibri" w:hAnsi="Calibri" w:cs="Calibri"/>
+              </w:rPr>
+              <w:t>El objetivo general y los demás objetivos específicos se mantienen sin cambios.</w:t>
             </w:r>
           </w:p>
         </w:tc>
@@ -896,6 +1113,18 @@
               <w:t>Opcional en caso de ajuste</w:t>
             </w:r>
           </w:p>
+          <w:p>
+            <w:pPr>
+              <w:spacing w:before="60" w:after="60"/>
+              <w:jc w:val="both"/>
+            </w:pPr>
+            <w:r>
+              <w:rPr>
+                <w:rFonts w:ascii="Calibri" w:hAnsi="Calibri" w:cs="Calibri"/>
+              </w:rPr>
+              <w:t>Sin ajustes. Se mantiene la metodología híbrida: Scrum (sprints de dos semanas, backlog con la Product Owner y criterios de aceptación) para el desarrollo, y PMBOK (alcance, riesgos, control formal de cambios y plan de pruebas) para la gobernanza. La distribución de roles también se mantiene: Irma Beltrán en la gestión y la documentación, y yo en el desarrollo.</w:t>
+            </w:r>
+          </w:p>
         </w:tc>
       </w:tr>
       <w:tr>
@@ -1298,27 +1527,173 @@
               <w:t>En este apartado adjuntar la(s) evidencia(s) seleccionada(s) para ser evaluada por el docente.</w:t>
             </w:r>
           </w:p>
+          <w:p>
+            <w:pPr>
+              <w:spacing w:before="60" w:after="60"/>
+              <w:jc w:val="both"/>
+            </w:pPr>
+            <w:r>
+              <w:rPr>
+                <w:rFonts w:ascii="Calibri" w:hAnsi="Calibri" w:cs="Calibri"/>
+                <w:b/>
+                <w:bCs/>
+              </w:rPr>
+              <w:t>Evidencias presentadas.</w:t>
+            </w:r>
+            <w:r>
+              <w:rPr>
+                <w:rFonts w:ascii="Calibri" w:hAnsi="Calibri" w:cs="Calibri"/>
+              </w:rPr>
+              <w:t xml:space="preserve"> (1) Capturas de la aplicación con datos ficticios, que muestran el dashboard rehecho y la pantalla Comercial con una fila por contrato; (2) el cronograma de sprints actualizado, incluido en el informe final, con el estado de cada etapa; y (3) las mediciones de rendimiento antes y después de optimizar. Las capturas prueban que los objetivos 1, 2 y 5 se cumplieron; el cronograma muestra qué etapas están completadas, en curso y pendientes; y las mediciones respaldan la mejora de rendimiento.</w:t>
+            </w:r>
+          </w:p>
+          <w:p>
+            <w:pPr>
+              <w:spacing w:before="60" w:after="60"/>
+              <w:jc w:val="both"/>
+            </w:pPr>
+            <w:r>
+              <w:rPr>
+                <w:rFonts w:ascii="Calibri" w:hAnsi="Calibri" w:cs="Calibri"/>
+                <w:b/>
+                <w:bCs/>
+              </w:rPr>
+              <w:t>Cómo resguardé la calidad.</w:t>
+            </w:r>
+            <w:r>
+              <w:rPr>
+                <w:rFonts w:ascii="Calibri" w:hAnsi="Calibri" w:cs="Calibri"/>
+              </w:rPr>
+              <w:t xml:space="preserve"> Apliqué las prácticas propias de mi disciplina: más de 1.000 pruebas automáticas con datos de prueba y no con datos reales; respaldo obligatorio antes de cada guardado; revisión de cada regla de negocio con la Product Owner; registro formal de cada cambio solicitado (RFC); y plan de pruebas, casos de prueba y reporte de ejecución como parte de la gestión de calidad con PMBOK.</w:t>
+            </w:r>
+          </w:p>
+          <w:p>
+            <w:pPr>
+              <w:keepNext/>
+              <w:spacing w:before="120" w:after="40"/>
+              <w:jc w:val="center"/>
+            </w:pPr>
+            <w:r>
+              <w:rPr>
+                <w:noProof/>
+              </w:rPr>
+              <w:lastRenderedPageBreak/>
+              <w:drawing>
+                <wp:inline distT="0" distB="0" distL="0" distR="0" wp14:anchorId="6F926674" wp14:editId="5E715E95">
+                  <wp:extent cx="4680000" cy="2632500"/>
+                  <wp:effectExtent l="0" t="0" r="0" b="0"/>
+                  <wp:docPr id="901" name="evidencia1.png" descr="Figura 1. Dashboard de gestión rehecho dentro de la aplicación (datos ficticios)."/>
+                  <wp:cNvGraphicFramePr/>
+                  <a:graphic xmlns:a="http://schemas.openxmlformats.org/drawingml/2006/main">
+                    <a:graphicData uri="http://schemas.openxmlformats.org/drawingml/2006/picture">
+                      <pic:pic xmlns:pic="http://schemas.openxmlformats.org/drawingml/2006/picture">
+                        <pic:nvPicPr>
+                          <pic:cNvPr id="901" name="evidencia1.png"/>
+                          <pic:cNvPicPr/>
+                        </pic:nvPicPr>
+                        <pic:blipFill>
+                          <a:blip r:embed="rId10"/>
+                          <a:stretch>
+                            <a:fillRect/>
+                          </a:stretch>
+                        </pic:blipFill>
+                        <pic:spPr>
+                          <a:xfrm>
+                            <a:off x="0" y="0"/>
+                            <a:ext cx="4680000" cy="2632500"/>
+                          </a:xfrm>
+                          <a:prstGeom prst="rect">
+                            <a:avLst/>
+                          </a:prstGeom>
+                        </pic:spPr>
+                      </pic:pic>
+                    </a:graphicData>
+                  </a:graphic>
+                </wp:inline>
+              </w:drawing>
+            </w:r>
+          </w:p>
+          <w:p>
+            <w:pPr>
+              <w:spacing w:before="60" w:after="60"/>
+              <w:jc w:val="center"/>
+            </w:pPr>
+            <w:r>
+              <w:rPr>
+                <w:rFonts w:ascii="Calibri" w:hAnsi="Calibri" w:cs="Calibri"/>
+                <w:i/>
+                <w:iCs/>
+                <w:color w:val="4B5563"/>
+                <w:sz w:val="18"/>
+                <w:szCs w:val="18"/>
+              </w:rPr>
+              <w:t>Figura 1. Dashboard de gestión rehecho dentro de la aplicación (datos ficticios).</w:t>
+            </w:r>
+          </w:p>
+          <w:p>
+            <w:pPr>
+              <w:keepNext/>
+              <w:spacing w:before="120" w:after="40"/>
+              <w:jc w:val="center"/>
+            </w:pPr>
+            <w:r>
+              <w:rPr>
+                <w:noProof/>
+              </w:rPr>
+              <w:drawing>
+                <wp:inline distT="0" distB="0" distL="0" distR="0" wp14:anchorId="3E467071" wp14:editId="2F5471A0">
+                  <wp:extent cx="4680000" cy="2632500"/>
+                  <wp:effectExtent l="0" t="0" r="0" b="0"/>
+                  <wp:docPr id="902" name="evidencia2.png" descr="Figura 2. Pantalla Comercial, con una fila por contrato (datos ficticios)."/>
+                  <wp:cNvGraphicFramePr/>
+                  <a:graphic xmlns:a="http://schemas.openxmlformats.org/drawingml/2006/main">
+                    <a:graphicData uri="http://schemas.openxmlformats.org/drawingml/2006/picture">
+                      <pic:pic xmlns:pic="http://schemas.openxmlformats.org/drawingml/2006/picture">
+                        <pic:nvPicPr>
+                          <pic:cNvPr id="902" name="evidencia2.png"/>
+                          <pic:cNvPicPr/>
+                        </pic:nvPicPr>
+                        <pic:blipFill>
+                          <a:blip r:embed="rId11"/>
+                          <a:stretch>
+                            <a:fillRect/>
+                          </a:stretch>
+                        </pic:blipFill>
+                        <pic:spPr>
+                          <a:xfrm>
+                            <a:off x="0" y="0"/>
+                            <a:ext cx="4680000" cy="2632500"/>
+                          </a:xfrm>
+                          <a:prstGeom prst="rect">
+                            <a:avLst/>
+                          </a:prstGeom>
+                        </pic:spPr>
+                      </pic:pic>
+                    </a:graphicData>
+                  </a:graphic>
+                </wp:inline>
+              </w:drawing>
+            </w:r>
+          </w:p>
+          <w:p>
+            <w:pPr>
+              <w:spacing w:before="60" w:after="60"/>
+              <w:jc w:val="center"/>
+            </w:pPr>
+            <w:r>
+              <w:rPr>
+                <w:rFonts w:ascii="Calibri" w:hAnsi="Calibri" w:cs="Calibri"/>
+                <w:i/>
+                <w:iCs/>
+                <w:color w:val="4B5563"/>
+                <w:sz w:val="18"/>
+                <w:szCs w:val="18"/>
+              </w:rPr>
+              <w:t>Figura 2. Pantalla Comercial, con una fila por contrato (datos ficticios).</w:t>
+            </w:r>
+          </w:p>
         </w:tc>
       </w:tr>
-    </w:tbl>
-    <w:tbl>
-      <w:tblPr>
-        <w:tblStyle w:val="Tablaconcuadrcula"/>
-        <w:tblpPr w:leftFromText="141" w:rightFromText="141" w:vertAnchor="text" w:horzAnchor="margin" w:tblpX="-719" w:tblpY="-116"/>
-        <w:tblW w:w="9640" w:type="dxa"/>
-        <w:tblBorders>
-          <w:top w:val="single" w:sz="4" w:space="0" w:color="BFBFBF" w:themeColor="background1" w:themeShade="BF"/>
-          <w:left w:val="single" w:sz="4" w:space="0" w:color="BFBFBF" w:themeColor="background1" w:themeShade="BF"/>
-          <w:bottom w:val="single" w:sz="4" w:space="0" w:color="BFBFBF" w:themeColor="background1" w:themeShade="BF"/>
-          <w:right w:val="single" w:sz="4" w:space="0" w:color="BFBFBF" w:themeColor="background1" w:themeShade="BF"/>
-          <w:insideH w:val="single" w:sz="4" w:space="0" w:color="BFBFBF" w:themeColor="background1" w:themeShade="BF"/>
-          <w:insideV w:val="single" w:sz="4" w:space="0" w:color="BFBFBF" w:themeColor="background1" w:themeShade="BF"/>
-        </w:tblBorders>
-        <w:tblLook w:val="04A0" w:firstRow="1" w:lastRow="0" w:firstColumn="1" w:lastColumn="0" w:noHBand="0" w:noVBand="1"/>
-      </w:tblPr>
-      <w:tblGrid>
-        <w:gridCol w:w="9640"/>
-      </w:tblGrid>
       <w:tr>
         <w:trPr>
           <w:trHeight w:val="440"/>
@@ -1326,6 +1701,7 @@
         <w:tc>
           <w:tcPr>
             <w:tcW w:w="9640" w:type="dxa"/>
+            <w:gridSpan w:val="2"/>
             <w:vAlign w:val="center"/>
           </w:tcPr>
           <w:p>
@@ -1345,6 +1721,106 @@
                 <w:szCs w:val="28"/>
               </w:rPr>
               <w:lastRenderedPageBreak/>
+              <w:br/>
+            </w:r>
+            <w:r>
+              <w:rPr>
+                <w:b/>
+                <w:color w:val="1F3864" w:themeColor="accent1" w:themeShade="80"/>
+                <w:sz w:val="28"/>
+                <w:szCs w:val="28"/>
+              </w:rPr>
+              <w:br/>
+            </w:r>
+            <w:r>
+              <w:rPr>
+                <w:b/>
+                <w:color w:val="1F3864" w:themeColor="accent1" w:themeShade="80"/>
+                <w:sz w:val="28"/>
+                <w:szCs w:val="28"/>
+              </w:rPr>
+              <w:br/>
+            </w:r>
+            <w:r>
+              <w:rPr>
+                <w:b/>
+                <w:color w:val="1F3864" w:themeColor="accent1" w:themeShade="80"/>
+                <w:sz w:val="28"/>
+                <w:szCs w:val="28"/>
+              </w:rPr>
+              <w:br/>
+            </w:r>
+            <w:r>
+              <w:rPr>
+                <w:b/>
+                <w:color w:val="1F3864" w:themeColor="accent1" w:themeShade="80"/>
+                <w:sz w:val="28"/>
+                <w:szCs w:val="28"/>
+              </w:rPr>
+              <w:br/>
+            </w:r>
+            <w:r>
+              <w:rPr>
+                <w:b/>
+                <w:color w:val="1F3864" w:themeColor="accent1" w:themeShade="80"/>
+                <w:sz w:val="28"/>
+                <w:szCs w:val="28"/>
+              </w:rPr>
+              <w:br/>
+            </w:r>
+            <w:r>
+              <w:rPr>
+                <w:b/>
+                <w:color w:val="1F3864" w:themeColor="accent1" w:themeShade="80"/>
+                <w:sz w:val="28"/>
+                <w:szCs w:val="28"/>
+              </w:rPr>
+              <w:br/>
+            </w:r>
+            <w:r>
+              <w:rPr>
+                <w:b/>
+                <w:color w:val="1F3864" w:themeColor="accent1" w:themeShade="80"/>
+                <w:sz w:val="28"/>
+                <w:szCs w:val="28"/>
+              </w:rPr>
+              <w:br/>
+            </w:r>
+            <w:r>
+              <w:rPr>
+                <w:b/>
+                <w:color w:val="1F3864" w:themeColor="accent1" w:themeShade="80"/>
+                <w:sz w:val="28"/>
+                <w:szCs w:val="28"/>
+              </w:rPr>
+              <w:br/>
+            </w:r>
+            <w:r>
+              <w:rPr>
+                <w:b/>
+                <w:color w:val="1F3864" w:themeColor="accent1" w:themeShade="80"/>
+                <w:sz w:val="28"/>
+                <w:szCs w:val="28"/>
+              </w:rPr>
+              <w:br/>
+            </w:r>
+            <w:r>
+              <w:rPr>
+                <w:b/>
+                <w:color w:val="1F3864" w:themeColor="accent1" w:themeShade="80"/>
+                <w:sz w:val="28"/>
+                <w:szCs w:val="28"/>
+              </w:rPr>
+              <w:lastRenderedPageBreak/>
+              <w:br/>
+            </w:r>
+            <w:r>
+              <w:rPr>
+                <w:b/>
+                <w:color w:val="1F3864" w:themeColor="accent1" w:themeShade="80"/>
+                <w:sz w:val="28"/>
+                <w:szCs w:val="28"/>
+              </w:rPr>
               <w:t>2</w:t>
             </w:r>
             <w:r>
@@ -1375,6 +1851,7 @@
         <w:tc>
           <w:tcPr>
             <w:tcW w:w="9640" w:type="dxa"/>
+            <w:gridSpan w:val="2"/>
             <w:shd w:val="clear" w:color="auto" w:fill="D9E2F3" w:themeFill="accent1" w:themeFillTint="33"/>
             <w:vAlign w:val="center"/>
           </w:tcPr>
@@ -1391,6 +1868,7 @@
                 <w:rFonts w:ascii="Calibri" w:hAnsi="Calibri"/>
                 <w:color w:val="1F3864" w:themeColor="accent1" w:themeShade="80"/>
               </w:rPr>
+              <w:lastRenderedPageBreak/>
               <w:t xml:space="preserve">Examina cuidadosamente tu plan de trabajo, enfocándote especialmente en la columna de </w:t>
             </w:r>
             <w:r>
@@ -1425,9 +1903,9 @@
     </w:p>
     <w:tbl>
       <w:tblPr>
-        <w:tblStyle w:val="Tablaconcuadrcula"/>
-        <w:tblpPr w:leftFromText="180" w:rightFromText="180" w:vertAnchor="page" w:horzAnchor="margin" w:tblpXSpec="center" w:tblpY="3517"/>
+        <w:tblStyle w:val="TableGrid"/>
         <w:tblW w:w="9776" w:type="dxa"/>
+        <w:tblInd w:w="-636" w:type="dxa"/>
         <w:tblBorders>
           <w:top w:val="single" w:sz="4" w:space="0" w:color="BFBFBF" w:themeColor="background1" w:themeShade="BF"/>
           <w:left w:val="single" w:sz="4" w:space="0" w:color="BFBFBF" w:themeColor="background1" w:themeShade="BF"/>
@@ -1619,7 +2097,7 @@
             </w:r>
             <w:r>
               <w:rPr>
-                <w:rStyle w:val="Refdenotaalpie"/>
+                <w:rStyle w:val="FootnoteReference"/>
                 <w:rFonts w:ascii="Calibri" w:hAnsi="Calibri"/>
                 <w:color w:val="1F3864" w:themeColor="accent1" w:themeShade="80"/>
                 <w:sz w:val="18"/>
@@ -2306,9 +2784,1666 @@
           </w:p>
         </w:tc>
       </w:tr>
+      <w:tr>
+        <w:trPr>
+          <w:cantSplit/>
+        </w:trPr>
+        <w:tc>
+          <w:tcPr>
+            <w:tcW w:w="1328" w:type="dxa"/>
+          </w:tcPr>
+          <w:p>
+            <w:pPr>
+              <w:spacing w:before="60" w:after="60"/>
+            </w:pPr>
+            <w:r>
+              <w:rPr>
+                <w:rFonts w:ascii="Calibri" w:hAnsi="Calibri" w:cs="Calibri"/>
+                <w:sz w:val="14"/>
+                <w:szCs w:val="14"/>
+              </w:rPr>
+              <w:t>C4: gestionar proyectos tradicionales y ágiles</w:t>
+            </w:r>
+          </w:p>
+        </w:tc>
+        <w:tc>
+          <w:tcPr>
+            <w:tcW w:w="1077" w:type="dxa"/>
+          </w:tcPr>
+          <w:p>
+            <w:pPr>
+              <w:spacing w:before="60" w:after="60"/>
+            </w:pPr>
+            <w:r>
+              <w:rPr>
+                <w:rFonts w:ascii="Calibri" w:hAnsi="Calibri" w:cs="Calibri"/>
+                <w:sz w:val="14"/>
+                <w:szCs w:val="14"/>
+              </w:rPr>
+              <w:t>Gestión del proyecto: alcance, riesgos, control de cambios (RFC) y plan de pruebas</w:t>
+            </w:r>
+          </w:p>
+        </w:tc>
+        <w:tc>
+          <w:tcPr>
+            <w:tcW w:w="1276" w:type="dxa"/>
+          </w:tcPr>
+          <w:p>
+            <w:pPr>
+              <w:spacing w:before="60" w:after="60"/>
+            </w:pPr>
+            <w:r>
+              <w:rPr>
+                <w:rFonts w:ascii="Calibri" w:hAnsi="Calibri" w:cs="Calibri"/>
+                <w:sz w:val="14"/>
+                <w:szCs w:val="14"/>
+              </w:rPr>
+              <w:t>Scrum, PMBOK, plantillas de calidad</w:t>
+            </w:r>
+          </w:p>
+        </w:tc>
+        <w:tc>
+          <w:tcPr>
+            <w:tcW w:w="1276" w:type="dxa"/>
+          </w:tcPr>
+          <w:p>
+            <w:pPr>
+              <w:spacing w:before="60" w:after="60"/>
+            </w:pPr>
+            <w:r>
+              <w:rPr>
+                <w:rFonts w:ascii="Calibri" w:hAnsi="Calibri" w:cs="Calibri"/>
+                <w:sz w:val="14"/>
+                <w:szCs w:val="14"/>
+              </w:rPr>
+              <w:t>13/07 – 15/11</w:t>
+            </w:r>
+          </w:p>
+        </w:tc>
+        <w:tc>
+          <w:tcPr>
+            <w:tcW w:w="1275" w:type="dxa"/>
+          </w:tcPr>
+          <w:p>
+            <w:pPr>
+              <w:spacing w:before="60" w:after="60"/>
+            </w:pPr>
+            <w:r>
+              <w:rPr>
+                <w:rFonts w:ascii="Calibri" w:hAnsi="Calibri" w:cs="Calibri"/>
+                <w:sz w:val="14"/>
+                <w:szCs w:val="14"/>
+              </w:rPr>
+              <w:t>Irma Beltrán</w:t>
+            </w:r>
+          </w:p>
+        </w:tc>
+        <w:tc>
+          <w:tcPr>
+            <w:tcW w:w="1276" w:type="dxa"/>
+          </w:tcPr>
+          <w:p>
+            <w:pPr>
+              <w:spacing w:before="60" w:after="60"/>
+            </w:pPr>
+            <w:r>
+              <w:rPr>
+                <w:rFonts w:ascii="Calibri" w:hAnsi="Calibri" w:cs="Calibri"/>
+                <w:sz w:val="14"/>
+                <w:szCs w:val="14"/>
+              </w:rPr>
+              <w:t>Facilitador: validación continua con la Product Owner. Dificultad: reglas de negocio que cambian con el uso.</w:t>
+            </w:r>
+          </w:p>
+        </w:tc>
+        <w:tc>
+          <w:tcPr>
+            <w:tcW w:w="1418" w:type="dxa"/>
+            <w:shd w:val="clear" w:color="auto" w:fill="DBEAFE"/>
+          </w:tcPr>
+          <w:p>
+            <w:pPr>
+              <w:spacing w:before="60" w:after="60"/>
+            </w:pPr>
+            <w:r>
+              <w:rPr>
+                <w:rFonts w:ascii="Calibri" w:hAnsi="Calibri" w:cs="Calibri"/>
+                <w:sz w:val="14"/>
+                <w:szCs w:val="14"/>
+              </w:rPr>
+              <w:t>En curso</w:t>
+            </w:r>
+          </w:p>
+        </w:tc>
+        <w:tc>
+          <w:tcPr>
+            <w:tcW w:w="850" w:type="dxa"/>
+          </w:tcPr>
+          <w:p>
+            <w:pPr>
+              <w:spacing w:before="60" w:after="60"/>
+            </w:pPr>
+            <w:r>
+              <w:rPr>
+                <w:rFonts w:ascii="Calibri" w:hAnsi="Calibri" w:cs="Calibri"/>
+                <w:sz w:val="14"/>
+                <w:szCs w:val="14"/>
+              </w:rPr>
+              <w:t>Cambios registrados por RFC</w:t>
+            </w:r>
+          </w:p>
+        </w:tc>
+      </w:tr>
+      <w:tr>
+        <w:trPr>
+          <w:cantSplit/>
+        </w:trPr>
+        <w:tc>
+          <w:tcPr>
+            <w:tcW w:w="1328" w:type="dxa"/>
+          </w:tcPr>
+          <w:p>
+            <w:pPr>
+              <w:spacing w:before="60" w:after="60"/>
+            </w:pPr>
+            <w:r>
+              <w:rPr>
+                <w:rFonts w:ascii="Calibri" w:hAnsi="Calibri" w:cs="Calibri"/>
+                <w:sz w:val="14"/>
+                <w:szCs w:val="14"/>
+              </w:rPr>
+              <w:t>C3: ingeniería de requisitos</w:t>
+            </w:r>
+          </w:p>
+        </w:tc>
+        <w:tc>
+          <w:tcPr>
+            <w:tcW w:w="1077" w:type="dxa"/>
+          </w:tcPr>
+          <w:p>
+            <w:pPr>
+              <w:spacing w:before="60" w:after="60"/>
+            </w:pPr>
+            <w:r>
+              <w:rPr>
+                <w:rFonts w:ascii="Calibri" w:hAnsi="Calibri" w:cs="Calibri"/>
+                <w:sz w:val="14"/>
+                <w:szCs w:val="14"/>
+              </w:rPr>
+              <w:t>Sprint 0. Inducción, diagnóstico y levantamiento del problema</w:t>
+            </w:r>
+          </w:p>
+        </w:tc>
+        <w:tc>
+          <w:tcPr>
+            <w:tcW w:w="1276" w:type="dxa"/>
+          </w:tcPr>
+          <w:p>
+            <w:pPr>
+              <w:spacing w:before="60" w:after="60"/>
+            </w:pPr>
+            <w:r>
+              <w:rPr>
+                <w:rFonts w:ascii="Calibri" w:hAnsi="Calibri" w:cs="Calibri"/>
+                <w:sz w:val="14"/>
+                <w:szCs w:val="14"/>
+              </w:rPr>
+              <w:t>Reuniones con la Product Owner; planillas del área</w:t>
+            </w:r>
+          </w:p>
+        </w:tc>
+        <w:tc>
+          <w:tcPr>
+            <w:tcW w:w="1276" w:type="dxa"/>
+          </w:tcPr>
+          <w:p>
+            <w:pPr>
+              <w:spacing w:before="60" w:after="60"/>
+            </w:pPr>
+            <w:r>
+              <w:rPr>
+                <w:rFonts w:ascii="Calibri" w:hAnsi="Calibri" w:cs="Calibri"/>
+                <w:sz w:val="14"/>
+                <w:szCs w:val="14"/>
+              </w:rPr>
+              <w:t>13/07 – 24/07</w:t>
+            </w:r>
+          </w:p>
+        </w:tc>
+        <w:tc>
+          <w:tcPr>
+            <w:tcW w:w="1275" w:type="dxa"/>
+          </w:tcPr>
+          <w:p>
+            <w:pPr>
+              <w:spacing w:before="60" w:after="60"/>
+            </w:pPr>
+            <w:r>
+              <w:rPr>
+                <w:rFonts w:ascii="Calibri" w:hAnsi="Calibri" w:cs="Calibri"/>
+                <w:sz w:val="14"/>
+                <w:szCs w:val="14"/>
+              </w:rPr>
+              <w:t>Felipe Monsalve e Irma Beltrán</w:t>
+            </w:r>
+          </w:p>
+        </w:tc>
+        <w:tc>
+          <w:tcPr>
+            <w:tcW w:w="1276" w:type="dxa"/>
+          </w:tcPr>
+          <w:p>
+            <w:pPr>
+              <w:spacing w:before="60" w:after="60"/>
+            </w:pPr>
+            <w:r>
+              <w:rPr>
+                <w:rFonts w:ascii="Calibri" w:hAnsi="Calibri" w:cs="Calibri"/>
+                <w:sz w:val="14"/>
+                <w:szCs w:val="14"/>
+              </w:rPr>
+              <w:t>Dificultad: la política de ciberseguridad prohíbe SQL y servidores propios.</w:t>
+            </w:r>
+          </w:p>
+        </w:tc>
+        <w:tc>
+          <w:tcPr>
+            <w:tcW w:w="1418" w:type="dxa"/>
+            <w:shd w:val="clear" w:color="auto" w:fill="D1FAE5"/>
+          </w:tcPr>
+          <w:p>
+            <w:pPr>
+              <w:spacing w:before="60" w:after="60"/>
+            </w:pPr>
+            <w:r>
+              <w:rPr>
+                <w:rFonts w:ascii="Calibri" w:hAnsi="Calibri" w:cs="Calibri"/>
+                <w:sz w:val="14"/>
+                <w:szCs w:val="14"/>
+              </w:rPr>
+              <w:t>Completado</w:t>
+            </w:r>
+          </w:p>
+        </w:tc>
+        <w:tc>
+          <w:tcPr>
+            <w:tcW w:w="850" w:type="dxa"/>
+          </w:tcPr>
+          <w:p>
+            <w:pPr>
+              <w:spacing w:before="60" w:after="60"/>
+            </w:pPr>
+            <w:r>
+              <w:rPr>
+                <w:rFonts w:ascii="Calibri" w:hAnsi="Calibri" w:cs="Calibri"/>
+                <w:sz w:val="14"/>
+                <w:szCs w:val="14"/>
+              </w:rPr>
+              <w:t>Se descartó la propuesta web con SQL; se eligió una app de escritorio</w:t>
+            </w:r>
+          </w:p>
+        </w:tc>
+      </w:tr>
+      <w:tr>
+        <w:trPr>
+          <w:cantSplit/>
+        </w:trPr>
+        <w:tc>
+          <w:tcPr>
+            <w:tcW w:w="1328" w:type="dxa"/>
+          </w:tcPr>
+          <w:p>
+            <w:pPr>
+              <w:spacing w:before="60" w:after="60"/>
+            </w:pPr>
+            <w:r>
+              <w:rPr>
+                <w:rFonts w:ascii="Calibri" w:hAnsi="Calibri" w:cs="Calibri"/>
+                <w:sz w:val="14"/>
+                <w:szCs w:val="14"/>
+              </w:rPr>
+              <w:t>C1: diseñar soluciones de software de calidad</w:t>
+            </w:r>
+          </w:p>
+        </w:tc>
+        <w:tc>
+          <w:tcPr>
+            <w:tcW w:w="1077" w:type="dxa"/>
+          </w:tcPr>
+          <w:p>
+            <w:pPr>
+              <w:spacing w:before="60" w:after="60"/>
+            </w:pPr>
+            <w:r>
+              <w:rPr>
+                <w:rFonts w:ascii="Calibri" w:hAnsi="Calibri" w:cs="Calibri"/>
+                <w:sz w:val="14"/>
+                <w:szCs w:val="14"/>
+              </w:rPr>
+              <w:t>Sprint 1. Arquitectura y base: aplicación de escritorio, Comercial y Provisiones</w:t>
+            </w:r>
+          </w:p>
+        </w:tc>
+        <w:tc>
+          <w:tcPr>
+            <w:tcW w:w="1276" w:type="dxa"/>
+          </w:tcPr>
+          <w:p>
+            <w:pPr>
+              <w:spacing w:before="60" w:after="60"/>
+            </w:pPr>
+            <w:r>
+              <w:rPr>
+                <w:rFonts w:ascii="Calibri" w:hAnsi="Calibri" w:cs="Calibri"/>
+                <w:sz w:val="14"/>
+                <w:szCs w:val="14"/>
+              </w:rPr>
+              <w:t>Python, PyQt6, pandas, openpyxl; archivos compartidos</w:t>
+            </w:r>
+          </w:p>
+        </w:tc>
+        <w:tc>
+          <w:tcPr>
+            <w:tcW w:w="1276" w:type="dxa"/>
+          </w:tcPr>
+          <w:p>
+            <w:pPr>
+              <w:spacing w:before="60" w:after="60"/>
+            </w:pPr>
+            <w:r>
+              <w:rPr>
+                <w:rFonts w:ascii="Calibri" w:hAnsi="Calibri" w:cs="Calibri"/>
+                <w:sz w:val="14"/>
+                <w:szCs w:val="14"/>
+              </w:rPr>
+              <w:t>27/07 – 07/08</w:t>
+            </w:r>
+          </w:p>
+        </w:tc>
+        <w:tc>
+          <w:tcPr>
+            <w:tcW w:w="1275" w:type="dxa"/>
+          </w:tcPr>
+          <w:p>
+            <w:pPr>
+              <w:spacing w:before="60" w:after="60"/>
+            </w:pPr>
+            <w:r>
+              <w:rPr>
+                <w:rFonts w:ascii="Calibri" w:hAnsi="Calibri" w:cs="Calibri"/>
+                <w:sz w:val="14"/>
+                <w:szCs w:val="14"/>
+              </w:rPr>
+              <w:t>Felipe Monsalve</w:t>
+            </w:r>
+          </w:p>
+        </w:tc>
+        <w:tc>
+          <w:tcPr>
+            <w:tcW w:w="1276" w:type="dxa"/>
+          </w:tcPr>
+          <w:p>
+            <w:pPr>
+              <w:spacing w:before="60" w:after="60"/>
+            </w:pPr>
+            <w:r>
+              <w:rPr>
+                <w:rFonts w:ascii="Calibri" w:hAnsi="Calibri" w:cs="Calibri"/>
+                <w:sz w:val="14"/>
+                <w:szCs w:val="14"/>
+              </w:rPr>
+              <w:t>Facilitador: los archivos compartidos ya eran usados por el equipo.</w:t>
+            </w:r>
+          </w:p>
+        </w:tc>
+        <w:tc>
+          <w:tcPr>
+            <w:tcW w:w="1418" w:type="dxa"/>
+            <w:shd w:val="clear" w:color="auto" w:fill="D1FAE5"/>
+          </w:tcPr>
+          <w:p>
+            <w:pPr>
+              <w:spacing w:before="60" w:after="60"/>
+            </w:pPr>
+            <w:r>
+              <w:rPr>
+                <w:rFonts w:ascii="Calibri" w:hAnsi="Calibri" w:cs="Calibri"/>
+                <w:sz w:val="14"/>
+                <w:szCs w:val="14"/>
+              </w:rPr>
+              <w:t>Completado</w:t>
+            </w:r>
+          </w:p>
+        </w:tc>
+        <w:tc>
+          <w:tcPr>
+            <w:tcW w:w="850" w:type="dxa"/>
+          </w:tcPr>
+          <w:p>
+            <w:pPr>
+              <w:spacing w:before="60" w:after="60"/>
+            </w:pPr>
+            <w:r>
+              <w:rPr>
+                <w:rFonts w:ascii="Calibri" w:hAnsi="Calibri" w:cs="Calibri"/>
+                <w:sz w:val="14"/>
+                <w:szCs w:val="14"/>
+              </w:rPr>
+              <w:t>Sin ajustes</w:t>
+            </w:r>
+          </w:p>
+        </w:tc>
+      </w:tr>
+      <w:tr>
+        <w:trPr>
+          <w:cantSplit/>
+        </w:trPr>
+        <w:tc>
+          <w:tcPr>
+            <w:tcW w:w="1328" w:type="dxa"/>
+          </w:tcPr>
+          <w:p>
+            <w:pPr>
+              <w:spacing w:before="60" w:after="60"/>
+            </w:pPr>
+            <w:r>
+              <w:rPr>
+                <w:rFonts w:ascii="Calibri" w:hAnsi="Calibri" w:cs="Calibri"/>
+                <w:sz w:val="14"/>
+                <w:szCs w:val="14"/>
+              </w:rPr>
+              <w:lastRenderedPageBreak/>
+              <w:t>C1 y C2: soluciones de software y de información</w:t>
+            </w:r>
+          </w:p>
+        </w:tc>
+        <w:tc>
+          <w:tcPr>
+            <w:tcW w:w="1077" w:type="dxa"/>
+          </w:tcPr>
+          <w:p>
+            <w:pPr>
+              <w:spacing w:before="60" w:after="60"/>
+            </w:pPr>
+            <w:r>
+              <w:rPr>
+                <w:rFonts w:ascii="Calibri" w:hAnsi="Calibri" w:cs="Calibri"/>
+                <w:sz w:val="14"/>
+                <w:szCs w:val="14"/>
+              </w:rPr>
+              <w:t>Sprint 2. Módulos e integraciones: Instalaciones, Contactos, correos, sincronización con el registro comercial y primer ejecutable</w:t>
+            </w:r>
+          </w:p>
+        </w:tc>
+        <w:tc>
+          <w:tcPr>
+            <w:tcW w:w="1276" w:type="dxa"/>
+          </w:tcPr>
+          <w:p>
+            <w:pPr>
+              <w:spacing w:before="60" w:after="60"/>
+              <w:rPr>
+                <w:lang w:val="en-US"/>
+              </w:rPr>
+            </w:pPr>
+            <w:r>
+              <w:rPr>
+                <w:rFonts w:ascii="Calibri" w:hAnsi="Calibri" w:cs="Calibri"/>
+                <w:sz w:val="14"/>
+                <w:szCs w:val="14"/>
+                <w:lang w:val="en-US"/>
+              </w:rPr>
+              <w:t>Outlook, SharePoint, Power BI, PyInstaller</w:t>
+            </w:r>
+          </w:p>
+        </w:tc>
+        <w:tc>
+          <w:tcPr>
+            <w:tcW w:w="1276" w:type="dxa"/>
+          </w:tcPr>
+          <w:p>
+            <w:pPr>
+              <w:spacing w:before="60" w:after="60"/>
+            </w:pPr>
+            <w:r>
+              <w:rPr>
+                <w:rFonts w:ascii="Calibri" w:hAnsi="Calibri" w:cs="Calibri"/>
+                <w:sz w:val="14"/>
+                <w:szCs w:val="14"/>
+              </w:rPr>
+              <w:t>10/08 – 21/08</w:t>
+            </w:r>
+          </w:p>
+        </w:tc>
+        <w:tc>
+          <w:tcPr>
+            <w:tcW w:w="1275" w:type="dxa"/>
+          </w:tcPr>
+          <w:p>
+            <w:pPr>
+              <w:spacing w:before="60" w:after="60"/>
+            </w:pPr>
+            <w:r>
+              <w:rPr>
+                <w:rFonts w:ascii="Calibri" w:hAnsi="Calibri" w:cs="Calibri"/>
+                <w:sz w:val="14"/>
+                <w:szCs w:val="14"/>
+              </w:rPr>
+              <w:t>Felipe Monsalve</w:t>
+            </w:r>
+          </w:p>
+        </w:tc>
+        <w:tc>
+          <w:tcPr>
+            <w:tcW w:w="1276" w:type="dxa"/>
+          </w:tcPr>
+          <w:p>
+            <w:pPr>
+              <w:spacing w:before="60" w:after="60"/>
+            </w:pPr>
+            <w:r>
+              <w:rPr>
+                <w:rFonts w:ascii="Calibri" w:hAnsi="Calibri" w:cs="Calibri"/>
+                <w:sz w:val="14"/>
+                <w:szCs w:val="14"/>
+              </w:rPr>
+              <w:t>Dificultad: el mismo dato llegaba con distinto nombre o formato en cada archivo.</w:t>
+            </w:r>
+          </w:p>
+        </w:tc>
+        <w:tc>
+          <w:tcPr>
+            <w:tcW w:w="1418" w:type="dxa"/>
+            <w:shd w:val="clear" w:color="auto" w:fill="D1FAE5"/>
+          </w:tcPr>
+          <w:p>
+            <w:pPr>
+              <w:spacing w:before="60" w:after="60"/>
+            </w:pPr>
+            <w:r>
+              <w:rPr>
+                <w:rFonts w:ascii="Calibri" w:hAnsi="Calibri" w:cs="Calibri"/>
+                <w:sz w:val="14"/>
+                <w:szCs w:val="14"/>
+              </w:rPr>
+              <w:t>Completado</w:t>
+            </w:r>
+          </w:p>
+        </w:tc>
+        <w:tc>
+          <w:tcPr>
+            <w:tcW w:w="850" w:type="dxa"/>
+          </w:tcPr>
+          <w:p>
+            <w:pPr>
+              <w:spacing w:before="60" w:after="60"/>
+            </w:pPr>
+            <w:r>
+              <w:rPr>
+                <w:rFonts w:ascii="Calibri" w:hAnsi="Calibri" w:cs="Calibri"/>
+                <w:sz w:val="14"/>
+                <w:szCs w:val="14"/>
+              </w:rPr>
+              <w:t>Limpieza automática al cargar y llaves comunes (VIN y CDB)</w:t>
+            </w:r>
+          </w:p>
+        </w:tc>
+      </w:tr>
+      <w:tr>
+        <w:trPr>
+          <w:cantSplit/>
+        </w:trPr>
+        <w:tc>
+          <w:tcPr>
+            <w:tcW w:w="1328" w:type="dxa"/>
+          </w:tcPr>
+          <w:p>
+            <w:pPr>
+              <w:spacing w:before="60" w:after="60"/>
+            </w:pPr>
+            <w:r>
+              <w:rPr>
+                <w:rFonts w:ascii="Calibri" w:hAnsi="Calibri" w:cs="Calibri"/>
+                <w:sz w:val="14"/>
+                <w:szCs w:val="14"/>
+              </w:rPr>
+              <w:t>C5: calidad y seguridad</w:t>
+            </w:r>
+          </w:p>
+        </w:tc>
+        <w:tc>
+          <w:tcPr>
+            <w:tcW w:w="1077" w:type="dxa"/>
+          </w:tcPr>
+          <w:p>
+            <w:pPr>
+              <w:spacing w:before="60" w:after="60"/>
+            </w:pPr>
+            <w:r>
+              <w:rPr>
+                <w:rFonts w:ascii="Calibri" w:hAnsi="Calibri" w:cs="Calibri"/>
+                <w:sz w:val="14"/>
+                <w:szCs w:val="14"/>
+              </w:rPr>
+              <w:t>Sprint 3. Seguridad y pruebas: guardado seguro, respaldo obligatorio y pruebas automáticas</w:t>
+            </w:r>
+          </w:p>
+        </w:tc>
+        <w:tc>
+          <w:tcPr>
+            <w:tcW w:w="1276" w:type="dxa"/>
+          </w:tcPr>
+          <w:p>
+            <w:pPr>
+              <w:spacing w:before="60" w:after="60"/>
+            </w:pPr>
+            <w:r>
+              <w:rPr>
+                <w:rFonts w:ascii="Calibri" w:hAnsi="Calibri" w:cs="Calibri"/>
+                <w:sz w:val="14"/>
+                <w:szCs w:val="14"/>
+              </w:rPr>
+              <w:t>unittest; datos de prueba</w:t>
+            </w:r>
+          </w:p>
+        </w:tc>
+        <w:tc>
+          <w:tcPr>
+            <w:tcW w:w="1276" w:type="dxa"/>
+          </w:tcPr>
+          <w:p>
+            <w:pPr>
+              <w:spacing w:before="60" w:after="60"/>
+            </w:pPr>
+            <w:r>
+              <w:rPr>
+                <w:rFonts w:ascii="Calibri" w:hAnsi="Calibri" w:cs="Calibri"/>
+                <w:sz w:val="14"/>
+                <w:szCs w:val="14"/>
+              </w:rPr>
+              <w:t>24/08 – 04/09</w:t>
+            </w:r>
+          </w:p>
+        </w:tc>
+        <w:tc>
+          <w:tcPr>
+            <w:tcW w:w="1275" w:type="dxa"/>
+          </w:tcPr>
+          <w:p>
+            <w:pPr>
+              <w:spacing w:before="60" w:after="60"/>
+            </w:pPr>
+            <w:r>
+              <w:rPr>
+                <w:rFonts w:ascii="Calibri" w:hAnsi="Calibri" w:cs="Calibri"/>
+                <w:sz w:val="14"/>
+                <w:szCs w:val="14"/>
+              </w:rPr>
+              <w:t>Felipe Monsalve</w:t>
+            </w:r>
+          </w:p>
+        </w:tc>
+        <w:tc>
+          <w:tcPr>
+            <w:tcW w:w="1276" w:type="dxa"/>
+          </w:tcPr>
+          <w:p>
+            <w:pPr>
+              <w:spacing w:before="60" w:after="60"/>
+            </w:pPr>
+            <w:r>
+              <w:rPr>
+                <w:rFonts w:ascii="Calibri" w:hAnsi="Calibri" w:cs="Calibri"/>
+                <w:sz w:val="14"/>
+                <w:szCs w:val="14"/>
+              </w:rPr>
+              <w:t>Dificultad: archivos bloqueados por OneDrive o SharePoint.</w:t>
+            </w:r>
+          </w:p>
+        </w:tc>
+        <w:tc>
+          <w:tcPr>
+            <w:tcW w:w="1418" w:type="dxa"/>
+            <w:shd w:val="clear" w:color="auto" w:fill="D1FAE5"/>
+          </w:tcPr>
+          <w:p>
+            <w:pPr>
+              <w:spacing w:before="60" w:after="60"/>
+            </w:pPr>
+            <w:r>
+              <w:rPr>
+                <w:rFonts w:ascii="Calibri" w:hAnsi="Calibri" w:cs="Calibri"/>
+                <w:sz w:val="14"/>
+                <w:szCs w:val="14"/>
+              </w:rPr>
+              <w:t>Completado</w:t>
+            </w:r>
+          </w:p>
+        </w:tc>
+        <w:tc>
+          <w:tcPr>
+            <w:tcW w:w="850" w:type="dxa"/>
+          </w:tcPr>
+          <w:p>
+            <w:pPr>
+              <w:spacing w:before="60" w:after="60"/>
+            </w:pPr>
+            <w:r>
+              <w:rPr>
+                <w:rFonts w:ascii="Calibri" w:hAnsi="Calibri" w:cs="Calibri"/>
+                <w:sz w:val="14"/>
+                <w:szCs w:val="14"/>
+              </w:rPr>
+              <w:t>Guardado sobre copia temporal, reintentos y aviso al usuario</w:t>
+            </w:r>
+          </w:p>
+        </w:tc>
+      </w:tr>
+      <w:tr>
+        <w:trPr>
+          <w:cantSplit/>
+        </w:trPr>
+        <w:tc>
+          <w:tcPr>
+            <w:tcW w:w="1328" w:type="dxa"/>
+          </w:tcPr>
+          <w:p>
+            <w:pPr>
+              <w:spacing w:before="60" w:after="60"/>
+            </w:pPr>
+            <w:r>
+              <w:rPr>
+                <w:rFonts w:ascii="Calibri" w:hAnsi="Calibri" w:cs="Calibri"/>
+                <w:sz w:val="14"/>
+                <w:szCs w:val="14"/>
+              </w:rPr>
+              <w:t>C5 y C4: calidad y gestión</w:t>
+            </w:r>
+          </w:p>
+        </w:tc>
+        <w:tc>
+          <w:tcPr>
+            <w:tcW w:w="1077" w:type="dxa"/>
+          </w:tcPr>
+          <w:p>
+            <w:pPr>
+              <w:spacing w:before="60" w:after="60"/>
+            </w:pPr>
+            <w:r>
+              <w:rPr>
+                <w:rFonts w:ascii="Calibri" w:hAnsi="Calibri" w:cs="Calibri"/>
+                <w:sz w:val="14"/>
+                <w:szCs w:val="14"/>
+              </w:rPr>
+              <w:t>Sprint 4. Calidad y Contratos CM: auditoría de pruebas, revisión CM y reglas de negocio</w:t>
+            </w:r>
+          </w:p>
+        </w:tc>
+        <w:tc>
+          <w:tcPr>
+            <w:tcW w:w="1276" w:type="dxa"/>
+          </w:tcPr>
+          <w:p>
+            <w:pPr>
+              <w:spacing w:before="60" w:after="60"/>
+            </w:pPr>
+            <w:r>
+              <w:rPr>
+                <w:rFonts w:ascii="Calibri" w:hAnsi="Calibri" w:cs="Calibri"/>
+                <w:sz w:val="14"/>
+                <w:szCs w:val="14"/>
+              </w:rPr>
+              <w:t>Plan de pruebas, casos y reporte de ejecución</w:t>
+            </w:r>
+          </w:p>
+        </w:tc>
+        <w:tc>
+          <w:tcPr>
+            <w:tcW w:w="1276" w:type="dxa"/>
+          </w:tcPr>
+          <w:p>
+            <w:pPr>
+              <w:spacing w:before="60" w:after="60"/>
+            </w:pPr>
+            <w:r>
+              <w:rPr>
+                <w:rFonts w:ascii="Calibri" w:hAnsi="Calibri" w:cs="Calibri"/>
+                <w:sz w:val="14"/>
+                <w:szCs w:val="14"/>
+              </w:rPr>
+              <w:t>07/09 – 18/09</w:t>
+            </w:r>
+          </w:p>
+        </w:tc>
+        <w:tc>
+          <w:tcPr>
+            <w:tcW w:w="1275" w:type="dxa"/>
+          </w:tcPr>
+          <w:p>
+            <w:pPr>
+              <w:spacing w:before="60" w:after="60"/>
+            </w:pPr>
+            <w:r>
+              <w:rPr>
+                <w:rFonts w:ascii="Calibri" w:hAnsi="Calibri" w:cs="Calibri"/>
+                <w:sz w:val="14"/>
+                <w:szCs w:val="14"/>
+              </w:rPr>
+              <w:t>Felipe Monsalve e Irma Beltrán</w:t>
+            </w:r>
+          </w:p>
+        </w:tc>
+        <w:tc>
+          <w:tcPr>
+            <w:tcW w:w="1276" w:type="dxa"/>
+          </w:tcPr>
+          <w:p>
+            <w:pPr>
+              <w:spacing w:before="60" w:after="60"/>
+            </w:pPr>
+            <w:r>
+              <w:rPr>
+                <w:rFonts w:ascii="Calibri" w:hAnsi="Calibri" w:cs="Calibri"/>
+                <w:sz w:val="14"/>
+                <w:szCs w:val="14"/>
+              </w:rPr>
+              <w:t>Facilitador: auditor automático de la suite de pruebas.</w:t>
+            </w:r>
+          </w:p>
+        </w:tc>
+        <w:tc>
+          <w:tcPr>
+            <w:tcW w:w="1418" w:type="dxa"/>
+            <w:shd w:val="clear" w:color="auto" w:fill="D1FAE5"/>
+          </w:tcPr>
+          <w:p>
+            <w:pPr>
+              <w:spacing w:before="60" w:after="60"/>
+            </w:pPr>
+            <w:r>
+              <w:rPr>
+                <w:rFonts w:ascii="Calibri" w:hAnsi="Calibri" w:cs="Calibri"/>
+                <w:sz w:val="14"/>
+                <w:szCs w:val="14"/>
+              </w:rPr>
+              <w:t>Completado</w:t>
+            </w:r>
+          </w:p>
+        </w:tc>
+        <w:tc>
+          <w:tcPr>
+            <w:tcW w:w="850" w:type="dxa"/>
+          </w:tcPr>
+          <w:p>
+            <w:pPr>
+              <w:spacing w:before="60" w:after="60"/>
+            </w:pPr>
+            <w:r>
+              <w:rPr>
+                <w:rFonts w:ascii="Calibri" w:hAnsi="Calibri" w:cs="Calibri"/>
+                <w:sz w:val="14"/>
+                <w:szCs w:val="14"/>
+              </w:rPr>
+              <w:t>Sin ajustes</w:t>
+            </w:r>
+          </w:p>
+        </w:tc>
+      </w:tr>
+      <w:tr>
+        <w:trPr>
+          <w:cantSplit/>
+        </w:trPr>
+        <w:tc>
+          <w:tcPr>
+            <w:tcW w:w="1328" w:type="dxa"/>
+          </w:tcPr>
+          <w:p>
+            <w:pPr>
+              <w:spacing w:before="60" w:after="60"/>
+            </w:pPr>
+            <w:r>
+              <w:rPr>
+                <w:rFonts w:ascii="Calibri" w:hAnsi="Calibri" w:cs="Calibri"/>
+                <w:sz w:val="14"/>
+                <w:szCs w:val="14"/>
+              </w:rPr>
+              <w:t>C1: diseñar soluciones de software de calidad</w:t>
+            </w:r>
+          </w:p>
+        </w:tc>
+        <w:tc>
+          <w:tcPr>
+            <w:tcW w:w="1077" w:type="dxa"/>
+          </w:tcPr>
+          <w:p>
+            <w:pPr>
+              <w:spacing w:before="60" w:after="60"/>
+            </w:pPr>
+            <w:r>
+              <w:rPr>
+                <w:rFonts w:ascii="Calibri" w:hAnsi="Calibri" w:cs="Calibri"/>
+                <w:sz w:val="14"/>
+                <w:szCs w:val="14"/>
+              </w:rPr>
+              <w:t>Sprint 5. Rendimiento y rediseño: optimización, Operaciones, JustTime e Ingresos y Conciliación</w:t>
+            </w:r>
+          </w:p>
+        </w:tc>
+        <w:tc>
+          <w:tcPr>
+            <w:tcW w:w="1276" w:type="dxa"/>
+          </w:tcPr>
+          <w:p>
+            <w:pPr>
+              <w:spacing w:before="60" w:after="60"/>
+            </w:pPr>
+            <w:r>
+              <w:rPr>
+                <w:rFonts w:ascii="Calibri" w:hAnsi="Calibri" w:cs="Calibri"/>
+                <w:sz w:val="14"/>
+                <w:szCs w:val="14"/>
+              </w:rPr>
+              <w:t>Registros de rendimiento con datos reales en solo lectura</w:t>
+            </w:r>
+          </w:p>
+        </w:tc>
+        <w:tc>
+          <w:tcPr>
+            <w:tcW w:w="1276" w:type="dxa"/>
+          </w:tcPr>
+          <w:p>
+            <w:pPr>
+              <w:spacing w:before="60" w:after="60"/>
+            </w:pPr>
+            <w:r>
+              <w:rPr>
+                <w:rFonts w:ascii="Calibri" w:hAnsi="Calibri" w:cs="Calibri"/>
+                <w:sz w:val="14"/>
+                <w:szCs w:val="14"/>
+              </w:rPr>
+              <w:t>21/09 – 02/10</w:t>
+            </w:r>
+          </w:p>
+        </w:tc>
+        <w:tc>
+          <w:tcPr>
+            <w:tcW w:w="1275" w:type="dxa"/>
+          </w:tcPr>
+          <w:p>
+            <w:pPr>
+              <w:spacing w:before="60" w:after="60"/>
+            </w:pPr>
+            <w:r>
+              <w:rPr>
+                <w:rFonts w:ascii="Calibri" w:hAnsi="Calibri" w:cs="Calibri"/>
+                <w:sz w:val="14"/>
+                <w:szCs w:val="14"/>
+              </w:rPr>
+              <w:t>Felipe Monsalve</w:t>
+            </w:r>
+          </w:p>
+        </w:tc>
+        <w:tc>
+          <w:tcPr>
+            <w:tcW w:w="1276" w:type="dxa"/>
+          </w:tcPr>
+          <w:p>
+            <w:pPr>
+              <w:spacing w:before="60" w:after="60"/>
+            </w:pPr>
+            <w:r>
+              <w:rPr>
+                <w:rFonts w:ascii="Calibri" w:hAnsi="Calibri" w:cs="Calibri"/>
+                <w:sz w:val="14"/>
+                <w:szCs w:val="14"/>
+              </w:rPr>
+              <w:t>Dificultad: lentitud con más de 12.000 camiones.</w:t>
+            </w:r>
+          </w:p>
+        </w:tc>
+        <w:tc>
+          <w:tcPr>
+            <w:tcW w:w="1418" w:type="dxa"/>
+            <w:shd w:val="clear" w:color="auto" w:fill="D1FAE5"/>
+          </w:tcPr>
+          <w:p>
+            <w:pPr>
+              <w:spacing w:before="60" w:after="60"/>
+            </w:pPr>
+            <w:r>
+              <w:rPr>
+                <w:rFonts w:ascii="Calibri" w:hAnsi="Calibri" w:cs="Calibri"/>
+                <w:sz w:val="14"/>
+                <w:szCs w:val="14"/>
+              </w:rPr>
+              <w:t>Completado</w:t>
+            </w:r>
+          </w:p>
+        </w:tc>
+        <w:tc>
+          <w:tcPr>
+            <w:tcW w:w="850" w:type="dxa"/>
+          </w:tcPr>
+          <w:p>
+            <w:pPr>
+              <w:spacing w:before="60" w:after="60"/>
+            </w:pPr>
+            <w:r>
+              <w:rPr>
+                <w:rFonts w:ascii="Calibri" w:hAnsi="Calibri" w:cs="Calibri"/>
+                <w:sz w:val="14"/>
+                <w:szCs w:val="14"/>
+              </w:rPr>
+              <w:t>Carga en segundo plano; la carga bajó de 6,2 s a 0,9 s</w:t>
+            </w:r>
+          </w:p>
+        </w:tc>
+      </w:tr>
+      <w:tr>
+        <w:trPr>
+          <w:cantSplit/>
+        </w:trPr>
+        <w:tc>
+          <w:tcPr>
+            <w:tcW w:w="1328" w:type="dxa"/>
+          </w:tcPr>
+          <w:p>
+            <w:pPr>
+              <w:spacing w:before="60" w:after="60"/>
+            </w:pPr>
+            <w:r>
+              <w:rPr>
+                <w:rFonts w:ascii="Calibri" w:hAnsi="Calibri" w:cs="Calibri"/>
+                <w:sz w:val="14"/>
+                <w:szCs w:val="14"/>
+              </w:rPr>
+              <w:t>C1 y C2: soluciones de software y de información</w:t>
+            </w:r>
+          </w:p>
+        </w:tc>
+        <w:tc>
+          <w:tcPr>
+            <w:tcW w:w="1077" w:type="dxa"/>
+          </w:tcPr>
+          <w:p>
+            <w:pPr>
+              <w:spacing w:before="60" w:after="60"/>
+            </w:pPr>
+            <w:r>
+              <w:rPr>
+                <w:rFonts w:ascii="Calibri" w:hAnsi="Calibri" w:cs="Calibri"/>
+                <w:sz w:val="14"/>
+                <w:szCs w:val="14"/>
+              </w:rPr>
+              <w:t>Sprint 6. Cierre de la app y contratos por ID; plantillas de correo; dashboard</w:t>
+            </w:r>
+          </w:p>
+        </w:tc>
+        <w:tc>
+          <w:tcPr>
+            <w:tcW w:w="1276" w:type="dxa"/>
+          </w:tcPr>
+          <w:p>
+            <w:pPr>
+              <w:spacing w:before="60" w:after="60"/>
+            </w:pPr>
+            <w:r>
+              <w:rPr>
+                <w:rFonts w:ascii="Calibri" w:hAnsi="Calibri" w:cs="Calibri"/>
+                <w:sz w:val="14"/>
+                <w:szCs w:val="14"/>
+              </w:rPr>
+              <w:t>Python, PyQt6; datos de prueba</w:t>
+            </w:r>
+          </w:p>
+        </w:tc>
+        <w:tc>
+          <w:tcPr>
+            <w:tcW w:w="1276" w:type="dxa"/>
+          </w:tcPr>
+          <w:p>
+            <w:pPr>
+              <w:spacing w:before="60" w:after="60"/>
+            </w:pPr>
+            <w:r>
+              <w:rPr>
+                <w:rFonts w:ascii="Calibri" w:hAnsi="Calibri" w:cs="Calibri"/>
+                <w:sz w:val="14"/>
+                <w:szCs w:val="14"/>
+              </w:rPr>
+              <w:t>05/10 – 23/10</w:t>
+            </w:r>
+          </w:p>
+        </w:tc>
+        <w:tc>
+          <w:tcPr>
+            <w:tcW w:w="1275" w:type="dxa"/>
+          </w:tcPr>
+          <w:p>
+            <w:pPr>
+              <w:spacing w:before="60" w:after="60"/>
+            </w:pPr>
+            <w:r>
+              <w:rPr>
+                <w:rFonts w:ascii="Calibri" w:hAnsi="Calibri" w:cs="Calibri"/>
+                <w:sz w:val="14"/>
+                <w:szCs w:val="14"/>
+              </w:rPr>
+              <w:t>Felipe Monsalve</w:t>
+            </w:r>
+          </w:p>
+        </w:tc>
+        <w:tc>
+          <w:tcPr>
+            <w:tcW w:w="1276" w:type="dxa"/>
+          </w:tcPr>
+          <w:p>
+            <w:pPr>
+              <w:spacing w:before="60" w:after="60"/>
+            </w:pPr>
+            <w:r>
+              <w:rPr>
+                <w:rFonts w:ascii="Calibri" w:hAnsi="Calibri" w:cs="Calibri"/>
+                <w:sz w:val="14"/>
+                <w:szCs w:val="14"/>
+              </w:rPr>
+              <w:t>Dificultad: con el VIN como llave, reactivar un camión pisaba el contrato anterior.</w:t>
+            </w:r>
+          </w:p>
+        </w:tc>
+        <w:tc>
+          <w:tcPr>
+            <w:tcW w:w="1418" w:type="dxa"/>
+            <w:shd w:val="clear" w:color="auto" w:fill="DBEAFE"/>
+          </w:tcPr>
+          <w:p>
+            <w:pPr>
+              <w:spacing w:before="60" w:after="60"/>
+            </w:pPr>
+            <w:r>
+              <w:rPr>
+                <w:rFonts w:ascii="Calibri" w:hAnsi="Calibri" w:cs="Calibri"/>
+                <w:sz w:val="14"/>
+                <w:szCs w:val="14"/>
+              </w:rPr>
+              <w:t>En curso</w:t>
+            </w:r>
+          </w:p>
+        </w:tc>
+        <w:tc>
+          <w:tcPr>
+            <w:tcW w:w="850" w:type="dxa"/>
+          </w:tcPr>
+          <w:p>
+            <w:pPr>
+              <w:spacing w:before="60" w:after="60"/>
+            </w:pPr>
+            <w:r>
+              <w:rPr>
+                <w:rFonts w:ascii="Calibri" w:hAnsi="Calibri" w:cs="Calibri"/>
+                <w:sz w:val="14"/>
+                <w:szCs w:val="14"/>
+              </w:rPr>
+              <w:t>Se cambió la llave a ID de contrato en todas las pantallas; dashboard rehecho el 21-10</w:t>
+            </w:r>
+          </w:p>
+        </w:tc>
+      </w:tr>
+      <w:tr>
+        <w:trPr>
+          <w:cantSplit/>
+        </w:trPr>
+        <w:tc>
+          <w:tcPr>
+            <w:tcW w:w="1328" w:type="dxa"/>
+          </w:tcPr>
+          <w:p>
+            <w:pPr>
+              <w:spacing w:before="60" w:after="60"/>
+            </w:pPr>
+            <w:r>
+              <w:rPr>
+                <w:rFonts w:ascii="Calibri" w:hAnsi="Calibri" w:cs="Calibri"/>
+                <w:sz w:val="14"/>
+                <w:szCs w:val="14"/>
+              </w:rPr>
+              <w:t>C1: diseñar soluciones de software de calidad</w:t>
+            </w:r>
+          </w:p>
+        </w:tc>
+        <w:tc>
+          <w:tcPr>
+            <w:tcW w:w="1077" w:type="dxa"/>
+          </w:tcPr>
+          <w:p>
+            <w:pPr>
+              <w:spacing w:before="60" w:after="60"/>
+            </w:pPr>
+            <w:r>
+              <w:rPr>
+                <w:rFonts w:ascii="Calibri" w:hAnsi="Calibri" w:cs="Calibri"/>
+                <w:sz w:val="14"/>
+                <w:szCs w:val="14"/>
+              </w:rPr>
+              <w:t>Sprint 7. Ajustes del dashboard e integración final</w:t>
+            </w:r>
+          </w:p>
+        </w:tc>
+        <w:tc>
+          <w:tcPr>
+            <w:tcW w:w="1276" w:type="dxa"/>
+          </w:tcPr>
+          <w:p>
+            <w:pPr>
+              <w:spacing w:before="60" w:after="60"/>
+            </w:pPr>
+            <w:r>
+              <w:rPr>
+                <w:rFonts w:ascii="Calibri" w:hAnsi="Calibri" w:cs="Calibri"/>
+                <w:sz w:val="14"/>
+                <w:szCs w:val="14"/>
+              </w:rPr>
+              <w:t>Python, PyQt6</w:t>
+            </w:r>
+          </w:p>
+        </w:tc>
+        <w:tc>
+          <w:tcPr>
+            <w:tcW w:w="1276" w:type="dxa"/>
+          </w:tcPr>
+          <w:p>
+            <w:pPr>
+              <w:spacing w:before="60" w:after="60"/>
+            </w:pPr>
+            <w:r>
+              <w:rPr>
+                <w:rFonts w:ascii="Calibri" w:hAnsi="Calibri" w:cs="Calibri"/>
+                <w:sz w:val="14"/>
+                <w:szCs w:val="14"/>
+              </w:rPr>
+              <w:t>26/10 – 06/11</w:t>
+            </w:r>
+          </w:p>
+        </w:tc>
+        <w:tc>
+          <w:tcPr>
+            <w:tcW w:w="1275" w:type="dxa"/>
+          </w:tcPr>
+          <w:p>
+            <w:pPr>
+              <w:spacing w:before="60" w:after="60"/>
+            </w:pPr>
+            <w:r>
+              <w:rPr>
+                <w:rFonts w:ascii="Calibri" w:hAnsi="Calibri" w:cs="Calibri"/>
+                <w:sz w:val="14"/>
+                <w:szCs w:val="14"/>
+              </w:rPr>
+              <w:t>Felipe Monsalve</w:t>
+            </w:r>
+          </w:p>
+        </w:tc>
+        <w:tc>
+          <w:tcPr>
+            <w:tcW w:w="1276" w:type="dxa"/>
+          </w:tcPr>
+          <w:p>
+            <w:pPr>
+              <w:spacing w:before="60" w:after="60"/>
+            </w:pPr>
+            <w:r>
+              <w:rPr>
+                <w:rFonts w:ascii="Calibri" w:hAnsi="Calibri" w:cs="Calibri"/>
+                <w:sz w:val="14"/>
+                <w:szCs w:val="14"/>
+              </w:rPr>
+              <w:t>Facilitador: el dashboard ya está dentro de la aplicación.</w:t>
+            </w:r>
+          </w:p>
+        </w:tc>
+        <w:tc>
+          <w:tcPr>
+            <w:tcW w:w="1418" w:type="dxa"/>
+            <w:shd w:val="clear" w:color="auto" w:fill="FEF3C7"/>
+          </w:tcPr>
+          <w:p>
+            <w:pPr>
+              <w:spacing w:before="60" w:after="60"/>
+            </w:pPr>
+            <w:r>
+              <w:rPr>
+                <w:rFonts w:ascii="Calibri" w:hAnsi="Calibri" w:cs="Calibri"/>
+                <w:sz w:val="14"/>
+                <w:szCs w:val="14"/>
+              </w:rPr>
+              <w:t>Ajustada</w:t>
+            </w:r>
+          </w:p>
+        </w:tc>
+        <w:tc>
+          <w:tcPr>
+            <w:tcW w:w="850" w:type="dxa"/>
+          </w:tcPr>
+          <w:p>
+            <w:pPr>
+              <w:spacing w:before="60" w:after="60"/>
+            </w:pPr>
+            <w:r>
+              <w:rPr>
+                <w:rFonts w:ascii="Calibri" w:hAnsi="Calibri" w:cs="Calibri"/>
+                <w:sz w:val="14"/>
+                <w:szCs w:val="14"/>
+              </w:rPr>
+              <w:t>Ya no se integra la página web del otro practicante; el dashboard se rehízo dentro de la app</w:t>
+            </w:r>
+          </w:p>
+        </w:tc>
+      </w:tr>
+      <w:tr>
+        <w:trPr>
+          <w:cantSplit/>
+        </w:trPr>
+        <w:tc>
+          <w:tcPr>
+            <w:tcW w:w="1328" w:type="dxa"/>
+          </w:tcPr>
+          <w:p>
+            <w:pPr>
+              <w:spacing w:before="60" w:after="60"/>
+            </w:pPr>
+            <w:r>
+              <w:rPr>
+                <w:rFonts w:ascii="Calibri" w:hAnsi="Calibri" w:cs="Calibri"/>
+                <w:sz w:val="14"/>
+                <w:szCs w:val="14"/>
+              </w:rPr>
+              <w:t>C5: calidad, seguridad y sostenibilidad</w:t>
+            </w:r>
+          </w:p>
+        </w:tc>
+        <w:tc>
+          <w:tcPr>
+            <w:tcW w:w="1077" w:type="dxa"/>
+          </w:tcPr>
+          <w:p>
+            <w:pPr>
+              <w:spacing w:before="60" w:after="60"/>
+            </w:pPr>
+            <w:r>
+              <w:rPr>
+                <w:rFonts w:ascii="Calibri" w:hAnsi="Calibri" w:cs="Calibri"/>
+                <w:sz w:val="14"/>
+                <w:szCs w:val="14"/>
+              </w:rPr>
+              <w:t>Sprint 8. Pruebas con usuarios del área, corrección de errores y mejoras</w:t>
+            </w:r>
+          </w:p>
+        </w:tc>
+        <w:tc>
+          <w:tcPr>
+            <w:tcW w:w="1276" w:type="dxa"/>
+          </w:tcPr>
+          <w:p>
+            <w:pPr>
+              <w:spacing w:before="60" w:after="60"/>
+            </w:pPr>
+            <w:r>
+              <w:rPr>
+                <w:rFonts w:ascii="Calibri" w:hAnsi="Calibri" w:cs="Calibri"/>
+                <w:sz w:val="14"/>
+                <w:szCs w:val="14"/>
+              </w:rPr>
+              <w:t>Equipo de Servicios Conectados; Product Owner</w:t>
+            </w:r>
+          </w:p>
+        </w:tc>
+        <w:tc>
+          <w:tcPr>
+            <w:tcW w:w="1276" w:type="dxa"/>
+          </w:tcPr>
+          <w:p>
+            <w:pPr>
+              <w:spacing w:before="60" w:after="60"/>
+            </w:pPr>
+            <w:r>
+              <w:rPr>
+                <w:rFonts w:ascii="Calibri" w:hAnsi="Calibri" w:cs="Calibri"/>
+                <w:sz w:val="14"/>
+                <w:szCs w:val="14"/>
+              </w:rPr>
+              <w:t>26/10 – 13/11</w:t>
+            </w:r>
+          </w:p>
+        </w:tc>
+        <w:tc>
+          <w:tcPr>
+            <w:tcW w:w="1275" w:type="dxa"/>
+          </w:tcPr>
+          <w:p>
+            <w:pPr>
+              <w:spacing w:before="60" w:after="60"/>
+            </w:pPr>
+            <w:r>
+              <w:rPr>
+                <w:rFonts w:ascii="Calibri" w:hAnsi="Calibri" w:cs="Calibri"/>
+                <w:sz w:val="14"/>
+                <w:szCs w:val="14"/>
+              </w:rPr>
+              <w:t>Felipe Monsalve</w:t>
+            </w:r>
+          </w:p>
+        </w:tc>
+        <w:tc>
+          <w:tcPr>
+            <w:tcW w:w="1276" w:type="dxa"/>
+          </w:tcPr>
+          <w:p>
+            <w:pPr>
+              <w:spacing w:before="60" w:after="60"/>
+            </w:pPr>
+            <w:r>
+              <w:rPr>
+                <w:rFonts w:ascii="Calibri" w:hAnsi="Calibri" w:cs="Calibri"/>
+                <w:sz w:val="14"/>
+                <w:szCs w:val="14"/>
+              </w:rPr>
+              <w:t>Depende de la entrega del 23-10.</w:t>
+            </w:r>
+          </w:p>
+        </w:tc>
+        <w:tc>
+          <w:tcPr>
+            <w:tcW w:w="1418" w:type="dxa"/>
+            <w:shd w:val="clear" w:color="auto" w:fill="F3F4F6"/>
+          </w:tcPr>
+          <w:p>
+            <w:pPr>
+              <w:spacing w:before="60" w:after="60"/>
+            </w:pPr>
+            <w:r>
+              <w:rPr>
+                <w:rFonts w:ascii="Calibri" w:hAnsi="Calibri" w:cs="Calibri"/>
+                <w:sz w:val="14"/>
+                <w:szCs w:val="14"/>
+              </w:rPr>
+              <w:t>No iniciado</w:t>
+            </w:r>
+          </w:p>
+        </w:tc>
+        <w:tc>
+          <w:tcPr>
+            <w:tcW w:w="850" w:type="dxa"/>
+          </w:tcPr>
+          <w:p>
+            <w:pPr>
+              <w:spacing w:before="60" w:after="60"/>
+            </w:pPr>
+            <w:r>
+              <w:rPr>
+                <w:rFonts w:ascii="Calibri" w:hAnsi="Calibri" w:cs="Calibri"/>
+                <w:sz w:val="14"/>
+                <w:szCs w:val="14"/>
+              </w:rPr>
+              <w:t>Sin ajustes</w:t>
+            </w:r>
+          </w:p>
+        </w:tc>
+      </w:tr>
+      <w:tr>
+        <w:trPr>
+          <w:cantSplit/>
+        </w:trPr>
+        <w:tc>
+          <w:tcPr>
+            <w:tcW w:w="1328" w:type="dxa"/>
+          </w:tcPr>
+          <w:p>
+            <w:pPr>
+              <w:spacing w:before="60" w:after="60"/>
+            </w:pPr>
+            <w:r>
+              <w:rPr>
+                <w:rFonts w:ascii="Calibri" w:hAnsi="Calibri" w:cs="Calibri"/>
+                <w:sz w:val="14"/>
+                <w:szCs w:val="14"/>
+              </w:rPr>
+              <w:lastRenderedPageBreak/>
+              <w:t>C4: gestionar proyectos tradicionales y ágiles</w:t>
+            </w:r>
+          </w:p>
+        </w:tc>
+        <w:tc>
+          <w:tcPr>
+            <w:tcW w:w="1077" w:type="dxa"/>
+          </w:tcPr>
+          <w:p>
+            <w:pPr>
+              <w:spacing w:before="60" w:after="60"/>
+            </w:pPr>
+            <w:r>
+              <w:rPr>
+                <w:rFonts w:ascii="Calibri" w:hAnsi="Calibri" w:cs="Calibri"/>
+                <w:sz w:val="14"/>
+                <w:szCs w:val="14"/>
+              </w:rPr>
+              <w:t>Cierre Capstone. Documentación y propuestas de mejora</w:t>
+            </w:r>
+          </w:p>
+        </w:tc>
+        <w:tc>
+          <w:tcPr>
+            <w:tcW w:w="1276" w:type="dxa"/>
+          </w:tcPr>
+          <w:p>
+            <w:pPr>
+              <w:spacing w:before="60" w:after="60"/>
+            </w:pPr>
+            <w:r>
+              <w:rPr>
+                <w:rFonts w:ascii="Calibri" w:hAnsi="Calibri" w:cs="Calibri"/>
+                <w:sz w:val="14"/>
+                <w:szCs w:val="14"/>
+              </w:rPr>
+              <w:t>Documentación técnica; plantillas Duoc</w:t>
+            </w:r>
+          </w:p>
+        </w:tc>
+        <w:tc>
+          <w:tcPr>
+            <w:tcW w:w="1276" w:type="dxa"/>
+          </w:tcPr>
+          <w:p>
+            <w:pPr>
+              <w:spacing w:before="60" w:after="60"/>
+            </w:pPr>
+            <w:r>
+              <w:rPr>
+                <w:rFonts w:ascii="Calibri" w:hAnsi="Calibri" w:cs="Calibri"/>
+                <w:sz w:val="14"/>
+                <w:szCs w:val="14"/>
+              </w:rPr>
+              <w:t>16/11 – diciembre</w:t>
+            </w:r>
+          </w:p>
+        </w:tc>
+        <w:tc>
+          <w:tcPr>
+            <w:tcW w:w="1275" w:type="dxa"/>
+          </w:tcPr>
+          <w:p>
+            <w:pPr>
+              <w:spacing w:before="60" w:after="60"/>
+            </w:pPr>
+            <w:r>
+              <w:rPr>
+                <w:rFonts w:ascii="Calibri" w:hAnsi="Calibri" w:cs="Calibri"/>
+                <w:sz w:val="14"/>
+                <w:szCs w:val="14"/>
+              </w:rPr>
+              <w:t>Irma Beltrán y Felipe Monsalve</w:t>
+            </w:r>
+          </w:p>
+        </w:tc>
+        <w:tc>
+          <w:tcPr>
+            <w:tcW w:w="1276" w:type="dxa"/>
+          </w:tcPr>
+          <w:p>
+            <w:pPr>
+              <w:spacing w:before="60" w:after="60"/>
+            </w:pPr>
+            <w:r>
+              <w:rPr>
+                <w:rFonts w:ascii="Calibri" w:hAnsi="Calibri" w:cs="Calibri"/>
+                <w:sz w:val="14"/>
+                <w:szCs w:val="14"/>
+              </w:rPr>
+              <w:t>Se inicia al terminar las pruebas con usuarios.</w:t>
+            </w:r>
+          </w:p>
+        </w:tc>
+        <w:tc>
+          <w:tcPr>
+            <w:tcW w:w="1418" w:type="dxa"/>
+            <w:shd w:val="clear" w:color="auto" w:fill="F3F4F6"/>
+          </w:tcPr>
+          <w:p>
+            <w:pPr>
+              <w:spacing w:before="60" w:after="60"/>
+            </w:pPr>
+            <w:r>
+              <w:rPr>
+                <w:rFonts w:ascii="Calibri" w:hAnsi="Calibri" w:cs="Calibri"/>
+                <w:sz w:val="14"/>
+                <w:szCs w:val="14"/>
+              </w:rPr>
+              <w:t>No iniciado</w:t>
+            </w:r>
+          </w:p>
+        </w:tc>
+        <w:tc>
+          <w:tcPr>
+            <w:tcW w:w="850" w:type="dxa"/>
+          </w:tcPr>
+          <w:p>
+            <w:pPr>
+              <w:spacing w:before="60" w:after="60"/>
+            </w:pPr>
+            <w:r>
+              <w:rPr>
+                <w:rFonts w:ascii="Calibri" w:hAnsi="Calibri" w:cs="Calibri"/>
+                <w:sz w:val="14"/>
+                <w:szCs w:val="14"/>
+              </w:rPr>
+              <w:t>Sin ajustes</w:t>
+            </w:r>
+          </w:p>
+        </w:tc>
+      </w:tr>
     </w:tbl>
     <w:p>
       <w:pPr>
+        <w:spacing w:after="0" w:line="240" w:lineRule="auto"/>
         <w:rPr>
           <w:rFonts w:cs="Calibri Light"/>
           <w:color w:val="595959" w:themeColor="text1" w:themeTint="A6"/>
@@ -2320,7 +4455,7 @@
     </w:p>
     <w:tbl>
       <w:tblPr>
-        <w:tblStyle w:val="Tablaconcuadrcula"/>
+        <w:tblStyle w:val="TableGrid"/>
         <w:tblW w:w="9498" w:type="dxa"/>
         <w:tblInd w:w="-572" w:type="dxa"/>
         <w:tblBorders>
@@ -2396,7 +4531,7 @@
           </w:tcPr>
           <w:p>
             <w:pPr>
-              <w:pStyle w:val="Piedepgina"/>
+              <w:pStyle w:val="Footer"/>
               <w:jc w:val="both"/>
               <w:rPr>
                 <w:rFonts w:ascii="Calibri" w:hAnsi="Calibri"/>
@@ -2476,9 +4611,353 @@
     </w:p>
     <w:tbl>
       <w:tblPr>
-        <w:tblStyle w:val="Tablaconcuadrcula"/>
-        <w:tblpPr w:leftFromText="180" w:rightFromText="180" w:vertAnchor="text" w:horzAnchor="margin" w:tblpX="-572" w:tblpY="1"/>
+        <w:tblStyle w:val="TableGrid"/>
+        <w:tblW w:w="5591" w:type="pct"/>
+        <w:tblInd w:w="-572" w:type="dxa"/>
+        <w:tblBorders>
+          <w:top w:val="single" w:sz="4" w:space="0" w:color="BFBFBF" w:themeColor="background1" w:themeShade="BF"/>
+          <w:left w:val="single" w:sz="4" w:space="0" w:color="BFBFBF" w:themeColor="background1" w:themeShade="BF"/>
+          <w:bottom w:val="single" w:sz="4" w:space="0" w:color="BFBFBF" w:themeColor="background1" w:themeShade="BF"/>
+          <w:right w:val="single" w:sz="4" w:space="0" w:color="BFBFBF" w:themeColor="background1" w:themeShade="BF"/>
+          <w:insideH w:val="single" w:sz="4" w:space="0" w:color="BFBFBF" w:themeColor="background1" w:themeShade="BF"/>
+          <w:insideV w:val="single" w:sz="4" w:space="0" w:color="BFBFBF" w:themeColor="background1" w:themeShade="BF"/>
+        </w:tblBorders>
+        <w:tblLook w:val="04A0" w:firstRow="1" w:lastRow="0" w:firstColumn="1" w:lastColumn="0" w:noHBand="0" w:noVBand="1"/>
+      </w:tblPr>
+      <w:tblGrid>
+        <w:gridCol w:w="9498"/>
+      </w:tblGrid>
+      <w:tr>
+        <w:trPr>
+          <w:trHeight w:val="1936"/>
+        </w:trPr>
+        <w:tc>
+          <w:tcPr>
+            <w:tcW w:w="5000" w:type="pct"/>
+            <w:vAlign w:val="center"/>
+          </w:tcPr>
+          <w:p>
+            <w:pPr>
+              <w:jc w:val="both"/>
+              <w:rPr>
+                <w:rFonts w:ascii="Calibri" w:hAnsi="Calibri" w:cs="Arial"/>
+                <w:i/>
+                <w:iCs/>
+                <w:color w:val="548DD4"/>
+                <w:sz w:val="20"/>
+                <w:szCs w:val="20"/>
+                <w:lang w:eastAsia="es-CL"/>
+              </w:rPr>
+            </w:pPr>
+            <w:r>
+              <w:rPr>
+                <w:rFonts w:ascii="Calibri" w:hAnsi="Calibri"/>
+                <w:color w:val="1F3864" w:themeColor="accent1" w:themeShade="80"/>
+              </w:rPr>
+              <w:t>Factores que han f</w:t>
+            </w:r>
+            <w:r>
+              <w:rPr>
+                <w:rFonts w:ascii="Calibri" w:hAnsi="Calibri"/>
+                <w:color w:val="1F3864" w:themeColor="accent1" w:themeShade="80"/>
+              </w:rPr>
+              <w:t>acilita</w:t>
+            </w:r>
+            <w:r>
+              <w:rPr>
+                <w:rFonts w:ascii="Calibri" w:hAnsi="Calibri"/>
+                <w:color w:val="1F3864" w:themeColor="accent1" w:themeShade="80"/>
+              </w:rPr>
+              <w:t>do y/o</w:t>
+            </w:r>
+            <w:r>
+              <w:rPr>
+                <w:rFonts w:ascii="Calibri" w:hAnsi="Calibri"/>
+                <w:color w:val="1F3864" w:themeColor="accent1" w:themeShade="80"/>
+              </w:rPr>
+              <w:t xml:space="preserve"> </w:t>
+            </w:r>
+            <w:r>
+              <w:rPr>
+                <w:rFonts w:ascii="Calibri" w:hAnsi="Calibri"/>
+                <w:color w:val="1F3864" w:themeColor="accent1" w:themeShade="80"/>
+              </w:rPr>
+              <w:t>dificultado el desarrollo de mi plan de trabajo</w:t>
+            </w:r>
+            <w:r>
+              <w:rPr>
+                <w:rFonts w:ascii="Calibri" w:hAnsi="Calibri" w:cs="Arial"/>
+                <w:color w:val="548DD4"/>
+                <w:sz w:val="20"/>
+                <w:szCs w:val="20"/>
+                <w:lang w:eastAsia="es-CL"/>
+              </w:rPr>
+              <w:t xml:space="preserve">: </w:t>
+            </w:r>
+            <w:r>
+              <w:rPr>
+                <w:rFonts w:ascii="Calibri" w:hAnsi="Calibri" w:cs="Arial"/>
+                <w:i/>
+                <w:iCs/>
+                <w:color w:val="548DD4"/>
+                <w:sz w:val="20"/>
+                <w:szCs w:val="20"/>
+                <w:lang w:eastAsia="es-CL"/>
+              </w:rPr>
+              <w:t>Describe los factores que han facilitado y</w:t>
+            </w:r>
+            <w:r>
+              <w:rPr>
+                <w:rFonts w:ascii="Calibri" w:hAnsi="Calibri" w:cs="Arial"/>
+                <w:i/>
+                <w:iCs/>
+                <w:color w:val="548DD4"/>
+                <w:sz w:val="20"/>
+                <w:szCs w:val="20"/>
+                <w:lang w:eastAsia="es-CL"/>
+              </w:rPr>
+              <w:t>/o</w:t>
+            </w:r>
+            <w:r>
+              <w:rPr>
+                <w:rFonts w:ascii="Calibri" w:hAnsi="Calibri" w:cs="Arial"/>
+                <w:i/>
+                <w:iCs/>
+                <w:color w:val="548DD4"/>
+                <w:sz w:val="20"/>
+                <w:szCs w:val="20"/>
+                <w:lang w:eastAsia="es-CL"/>
+              </w:rPr>
+              <w:t xml:space="preserve"> dificultado el desarrollo de tu Proyecto APT hasta ahora. En el caso de las dificultades</w:t>
+            </w:r>
+            <w:r>
+              <w:rPr>
+                <w:rFonts w:ascii="Calibri" w:hAnsi="Calibri" w:cs="Arial"/>
+                <w:i/>
+                <w:iCs/>
+                <w:color w:val="548DD4"/>
+                <w:sz w:val="20"/>
+                <w:szCs w:val="20"/>
+                <w:lang w:eastAsia="es-CL"/>
+              </w:rPr>
+              <w:t xml:space="preserve"> debes describir</w:t>
+            </w:r>
+            <w:r>
+              <w:rPr>
+                <w:rFonts w:ascii="Calibri" w:hAnsi="Calibri" w:cs="Arial"/>
+                <w:i/>
+                <w:iCs/>
+                <w:color w:val="548DD4"/>
+                <w:sz w:val="20"/>
+                <w:szCs w:val="20"/>
+                <w:lang w:eastAsia="es-CL"/>
+              </w:rPr>
+              <w:t xml:space="preserve"> qué acciones tomaste y/o tomarás para </w:t>
+            </w:r>
+            <w:r>
+              <w:rPr>
+                <w:rFonts w:ascii="Calibri" w:hAnsi="Calibri" w:cs="Arial"/>
+                <w:i/>
+                <w:iCs/>
+                <w:color w:val="548DD4"/>
+                <w:sz w:val="20"/>
+                <w:szCs w:val="20"/>
+                <w:lang w:eastAsia="es-CL"/>
+              </w:rPr>
+              <w:t xml:space="preserve">solucionarlas. </w:t>
+            </w:r>
+            <w:r>
+              <w:rPr>
+                <w:rFonts w:ascii="Calibri" w:hAnsi="Calibri"/>
+                <w:b/>
+                <w:color w:val="1F3864" w:themeColor="accent1" w:themeShade="80"/>
+              </w:rPr>
+              <w:t xml:space="preserve"> </w:t>
+            </w:r>
+          </w:p>
+          <w:p>
+            <w:pPr>
+              <w:spacing w:before="60" w:after="60"/>
+              <w:jc w:val="both"/>
+            </w:pPr>
+            <w:r>
+              <w:rPr>
+                <w:rFonts w:ascii="Calibri" w:hAnsi="Calibri" w:cs="Calibri"/>
+                <w:b/>
+                <w:bCs/>
+              </w:rPr>
+              <w:t>Facilitadores.</w:t>
+            </w:r>
+            <w:r>
+              <w:rPr>
+                <w:rFonts w:ascii="Calibri" w:hAnsi="Calibri" w:cs="Calibri"/>
+              </w:rPr>
+              <w:t xml:space="preserve"> Contar con la Product Owner de Volvo para validar cada regla de negocio; trabajar sobre los mismos archivos compartidos que el equipo ya usaba; disponer de datos reales del área, en modo solo lectura, para medir el rendimiento; y la división de roles, con Irma Beltrán en la gestión y la documentación y yo en el desarrollo.</w:t>
+            </w:r>
+          </w:p>
+          <w:p>
+            <w:pPr>
+              <w:spacing w:before="60" w:after="60"/>
+              <w:jc w:val="both"/>
+            </w:pPr>
+            <w:r>
+              <w:rPr>
+                <w:rFonts w:ascii="Calibri" w:hAnsi="Calibri" w:cs="Calibri"/>
+                <w:b/>
+                <w:bCs/>
+              </w:rPr>
+              <w:t>Dificultades y acciones.</w:t>
+            </w:r>
+          </w:p>
+          <w:p>
+            <w:pPr>
+              <w:spacing w:before="60" w:after="60"/>
+              <w:jc w:val="both"/>
+            </w:pPr>
+            <w:r>
+              <w:rPr>
+                <w:rFonts w:ascii="Calibri" w:hAnsi="Calibri" w:cs="Calibri"/>
+              </w:rPr>
+              <w:t xml:space="preserve">• </w:t>
+            </w:r>
+            <w:r>
+              <w:rPr>
+                <w:rFonts w:ascii="Calibri" w:hAnsi="Calibri" w:cs="Calibri"/>
+                <w:b/>
+                <w:bCs/>
+              </w:rPr>
+              <w:t>Restricción de ciberseguridad (sin SQL):</w:t>
+            </w:r>
+            <w:r>
+              <w:rPr>
+                <w:rFonts w:ascii="Calibri" w:hAnsi="Calibri" w:cs="Calibri"/>
+              </w:rPr>
+              <w:t xml:space="preserve"> construí una aplicación que trabaja en memoria sobre archivos Excel/CSV compartidos.</w:t>
+            </w:r>
+          </w:p>
+          <w:p>
+            <w:pPr>
+              <w:spacing w:before="60" w:after="60"/>
+              <w:jc w:val="both"/>
+            </w:pPr>
+            <w:r>
+              <w:rPr>
+                <w:rFonts w:ascii="Calibri" w:hAnsi="Calibri" w:cs="Calibri"/>
+              </w:rPr>
+              <w:t xml:space="preserve">• </w:t>
+            </w:r>
+            <w:r>
+              <w:rPr>
+                <w:rFonts w:ascii="Calibri" w:hAnsi="Calibri" w:cs="Calibri"/>
+                <w:b/>
+                <w:bCs/>
+              </w:rPr>
+              <w:t>Archivos bloqueados por OneDrive o SharePoint:</w:t>
+            </w:r>
+            <w:r>
+              <w:rPr>
+                <w:rFonts w:ascii="Calibri" w:hAnsi="Calibri" w:cs="Calibri"/>
+              </w:rPr>
+              <w:t xml:space="preserve"> el guardado se hace sobre una copia temporal que reemplaza al original, con reintentos y aviso al usuario.</w:t>
+            </w:r>
+          </w:p>
+          <w:p>
+            <w:pPr>
+              <w:spacing w:before="60" w:after="60"/>
+              <w:jc w:val="both"/>
+            </w:pPr>
+            <w:r>
+              <w:rPr>
+                <w:rFonts w:ascii="Calibri" w:hAnsi="Calibri" w:cs="Calibri"/>
+              </w:rPr>
+              <w:t xml:space="preserve">• </w:t>
+            </w:r>
+            <w:r>
+              <w:rPr>
+                <w:rFonts w:ascii="Calibri" w:hAnsi="Calibri" w:cs="Calibri"/>
+                <w:b/>
+                <w:bCs/>
+              </w:rPr>
+              <w:t>Lentitud con más de 12.000 camiones:</w:t>
+            </w:r>
+            <w:r>
+              <w:rPr>
+                <w:rFonts w:ascii="Calibri" w:hAnsi="Calibri" w:cs="Calibri"/>
+              </w:rPr>
+              <w:t xml:space="preserve"> carga en segundo plano y optimizaciones medidas antes y después.</w:t>
+            </w:r>
+          </w:p>
+          <w:p>
+            <w:pPr>
+              <w:spacing w:before="60" w:after="60"/>
+              <w:jc w:val="both"/>
+            </w:pPr>
+            <w:r>
+              <w:rPr>
+                <w:rFonts w:ascii="Calibri" w:hAnsi="Calibri" w:cs="Calibri"/>
+              </w:rPr>
+              <w:t xml:space="preserve">• </w:t>
+            </w:r>
+            <w:r>
+              <w:rPr>
+                <w:rFonts w:ascii="Calibri" w:hAnsi="Calibri" w:cs="Calibri"/>
+                <w:b/>
+                <w:bCs/>
+              </w:rPr>
+              <w:t>Datos inconsistentes entre archivos:</w:t>
+            </w:r>
+            <w:r>
+              <w:rPr>
+                <w:rFonts w:ascii="Calibri" w:hAnsi="Calibri" w:cs="Calibri"/>
+              </w:rPr>
+              <w:t xml:space="preserve"> limpieza automática al cargar y llaves comunes (VIN y CDB); la depuración del Registro Maestro la hice junto con la Product Owner, indicándole los errores que iba encontrando.</w:t>
+            </w:r>
+          </w:p>
+          <w:p>
+            <w:pPr>
+              <w:spacing w:before="60" w:after="60"/>
+              <w:jc w:val="both"/>
+            </w:pPr>
+            <w:r>
+              <w:rPr>
+                <w:rFonts w:ascii="Calibri" w:hAnsi="Calibri" w:cs="Calibri"/>
+              </w:rPr>
+              <w:t xml:space="preserve">• </w:t>
+            </w:r>
+            <w:r>
+              <w:rPr>
+                <w:rFonts w:ascii="Calibri" w:hAnsi="Calibri" w:cs="Calibri"/>
+                <w:b/>
+                <w:bCs/>
+              </w:rPr>
+              <w:t>Reglas de negocio que cambiaban con el uso:</w:t>
+            </w:r>
+            <w:r>
+              <w:rPr>
+                <w:rFonts w:ascii="Calibri" w:hAnsi="Calibri" w:cs="Calibri"/>
+              </w:rPr>
+              <w:t xml:space="preserve"> refiné el backlog con la Product Owner y registré cada cambio con un RFC.</w:t>
+            </w:r>
+          </w:p>
+        </w:tc>
+      </w:tr>
+    </w:tbl>
+    <w:p>
+      <w:pPr>
+        <w:rPr>
+          <w:rFonts w:cs="Calibri Light"/>
+          <w:color w:val="595959" w:themeColor="text1" w:themeTint="A6"/>
+          <w:sz w:val="24"/>
+          <w:szCs w:val="24"/>
+          <w:lang w:val="es-ES"/>
+        </w:rPr>
+      </w:pPr>
+    </w:p>
+    <w:tbl>
+      <w:tblPr>
+        <w:tblStyle w:val="TableGrid"/>
         <w:tblW w:w="5590" w:type="pct"/>
+        <w:tblInd w:w="-572" w:type="dxa"/>
         <w:tblBorders>
           <w:top w:val="single" w:sz="4" w:space="0" w:color="BFBFBF" w:themeColor="background1" w:themeShade="BF"/>
           <w:left w:val="single" w:sz="4" w:space="0" w:color="BFBFBF" w:themeColor="background1" w:themeShade="BF"/>
@@ -2507,7 +4986,6 @@
               <w:rPr>
                 <w:rFonts w:ascii="Calibri" w:hAnsi="Calibri" w:cs="Arial"/>
                 <w:i/>
-                <w:iCs/>
                 <w:color w:val="548DD4"/>
                 <w:sz w:val="20"/>
                 <w:szCs w:val="20"/>
@@ -2519,447 +4997,218 @@
                 <w:rFonts w:ascii="Calibri" w:hAnsi="Calibri"/>
                 <w:color w:val="1F3864" w:themeColor="accent1" w:themeShade="80"/>
               </w:rPr>
-              <w:t>Factores que han f</w:t>
-            </w:r>
-            <w:r>
-              <w:rPr>
-                <w:rFonts w:ascii="Calibri" w:hAnsi="Calibri"/>
-                <w:color w:val="1F3864" w:themeColor="accent1" w:themeShade="80"/>
-              </w:rPr>
-              <w:t>acilita</w:t>
-            </w:r>
-            <w:r>
-              <w:rPr>
-                <w:rFonts w:ascii="Calibri" w:hAnsi="Calibri"/>
-                <w:color w:val="1F3864" w:themeColor="accent1" w:themeShade="80"/>
-              </w:rPr>
-              <w:t>do y/o</w:t>
-            </w:r>
-            <w:r>
-              <w:rPr>
-                <w:rFonts w:ascii="Calibri" w:hAnsi="Calibri"/>
-                <w:color w:val="1F3864" w:themeColor="accent1" w:themeShade="80"/>
+              <w:t xml:space="preserve">Actividades ajustadas o eliminadas: </w:t>
+            </w:r>
+            <w:r>
+              <w:rPr>
+                <w:rFonts w:ascii="Calibri" w:hAnsi="Calibri" w:cs="Arial"/>
+                <w:i/>
+                <w:color w:val="548DD4"/>
+                <w:sz w:val="20"/>
+                <w:szCs w:val="20"/>
+                <w:lang w:eastAsia="es-CL"/>
+              </w:rPr>
+              <w:t>Señalar los ajustes</w:t>
+            </w:r>
+            <w:r>
+              <w:rPr>
+                <w:rFonts w:ascii="Calibri" w:hAnsi="Calibri" w:cs="Arial"/>
+                <w:i/>
+                <w:color w:val="548DD4"/>
+                <w:sz w:val="20"/>
+                <w:szCs w:val="20"/>
+                <w:lang w:eastAsia="es-CL"/>
+              </w:rPr>
+              <w:t xml:space="preserve"> que realizaste a tu plan de trabajo o </w:t>
+            </w:r>
+            <w:r>
+              <w:rPr>
+                <w:rFonts w:ascii="Calibri" w:hAnsi="Calibri" w:cs="Arial"/>
+                <w:i/>
+                <w:color w:val="548DD4"/>
+                <w:sz w:val="20"/>
+                <w:szCs w:val="20"/>
+                <w:lang w:eastAsia="es-CL"/>
+              </w:rPr>
+              <w:t>actividades que</w:t>
+            </w:r>
+            <w:r>
+              <w:rPr>
+                <w:rFonts w:ascii="Calibri" w:hAnsi="Calibri" w:cs="Arial"/>
+                <w:i/>
+                <w:color w:val="548DD4"/>
+                <w:sz w:val="20"/>
+                <w:szCs w:val="20"/>
+                <w:lang w:eastAsia="es-CL"/>
+              </w:rPr>
+              <w:t xml:space="preserve"> eliminaste</w:t>
+            </w:r>
+            <w:r>
+              <w:rPr>
+                <w:rFonts w:ascii="Calibri" w:hAnsi="Calibri" w:cs="Arial"/>
+                <w:i/>
+                <w:color w:val="548DD4"/>
+                <w:sz w:val="20"/>
+                <w:szCs w:val="20"/>
+                <w:lang w:eastAsia="es-CL"/>
+              </w:rPr>
+              <w:t xml:space="preserve"> y</w:t>
+            </w:r>
+            <w:r>
+              <w:rPr>
+                <w:rFonts w:ascii="Calibri" w:hAnsi="Calibri" w:cs="Arial"/>
+                <w:i/>
+                <w:color w:val="548DD4"/>
+                <w:sz w:val="20"/>
+                <w:szCs w:val="20"/>
+                <w:lang w:eastAsia="es-CL"/>
+              </w:rPr>
+              <w:t>,</w:t>
+            </w:r>
+            <w:r>
+              <w:rPr>
+                <w:rFonts w:ascii="Calibri" w:hAnsi="Calibri" w:cs="Arial"/>
+                <w:i/>
+                <w:color w:val="548DD4"/>
+                <w:sz w:val="20"/>
+                <w:szCs w:val="20"/>
+                <w:lang w:eastAsia="es-CL"/>
+              </w:rPr>
+              <w:t xml:space="preserve"> justifica por</w:t>
+            </w:r>
+            <w:r>
+              <w:rPr>
+                <w:rFonts w:ascii="Calibri" w:hAnsi="Calibri" w:cs="Arial"/>
+                <w:i/>
+                <w:color w:val="548DD4"/>
+                <w:sz w:val="20"/>
+                <w:szCs w:val="20"/>
+                <w:lang w:eastAsia="es-CL"/>
               </w:rPr>
               <w:t xml:space="preserve"> </w:t>
             </w:r>
             <w:r>
               <w:rPr>
-                <w:rFonts w:ascii="Calibri" w:hAnsi="Calibri"/>
-                <w:color w:val="1F3864" w:themeColor="accent1" w:themeShade="80"/>
-              </w:rPr>
-              <w:t>dificultado el desarrollo de mi plan de trabajo</w:t>
-            </w:r>
-            <w:r>
-              <w:rPr>
-                <w:rFonts w:ascii="Calibri" w:hAnsi="Calibri" w:cs="Arial"/>
-                <w:color w:val="548DD4"/>
-                <w:sz w:val="20"/>
-                <w:szCs w:val="20"/>
-                <w:lang w:eastAsia="es-CL"/>
-              </w:rPr>
-              <w:t xml:space="preserve">: </w:t>
-            </w:r>
-            <w:r>
-              <w:rPr>
-                <w:rFonts w:ascii="Calibri" w:hAnsi="Calibri" w:cs="Arial"/>
-                <w:i/>
-                <w:iCs/>
-                <w:color w:val="548DD4"/>
-                <w:sz w:val="20"/>
-                <w:szCs w:val="20"/>
-                <w:lang w:eastAsia="es-CL"/>
-              </w:rPr>
-              <w:t>Describe los factores que han facilitado y</w:t>
-            </w:r>
-            <w:r>
-              <w:rPr>
-                <w:rFonts w:ascii="Calibri" w:hAnsi="Calibri" w:cs="Arial"/>
-                <w:i/>
-                <w:iCs/>
-                <w:color w:val="548DD4"/>
-                <w:sz w:val="20"/>
-                <w:szCs w:val="20"/>
-                <w:lang w:eastAsia="es-CL"/>
-              </w:rPr>
-              <w:t>/o</w:t>
-            </w:r>
-            <w:r>
-              <w:rPr>
-                <w:rFonts w:ascii="Calibri" w:hAnsi="Calibri" w:cs="Arial"/>
-                <w:i/>
-                <w:iCs/>
-                <w:color w:val="548DD4"/>
-                <w:sz w:val="20"/>
-                <w:szCs w:val="20"/>
-                <w:lang w:eastAsia="es-CL"/>
-              </w:rPr>
-              <w:t xml:space="preserve"> dificultado el desarrollo de tu Proyecto APT hasta ahora. En el caso de las dificultades</w:t>
-            </w:r>
-            <w:r>
-              <w:rPr>
-                <w:rFonts w:ascii="Calibri" w:hAnsi="Calibri" w:cs="Arial"/>
-                <w:i/>
-                <w:iCs/>
-                <w:color w:val="548DD4"/>
-                <w:sz w:val="20"/>
-                <w:szCs w:val="20"/>
-                <w:lang w:eastAsia="es-CL"/>
-              </w:rPr>
-              <w:t xml:space="preserve"> debes describir</w:t>
-            </w:r>
-            <w:r>
-              <w:rPr>
-                <w:rFonts w:ascii="Calibri" w:hAnsi="Calibri" w:cs="Arial"/>
-                <w:i/>
-                <w:iCs/>
-                <w:color w:val="548DD4"/>
-                <w:sz w:val="20"/>
-                <w:szCs w:val="20"/>
-                <w:lang w:eastAsia="es-CL"/>
-              </w:rPr>
-              <w:t xml:space="preserve"> qué acciones tomaste y/o tomarás para </w:t>
-            </w:r>
-            <w:r>
-              <w:rPr>
-                <w:rFonts w:ascii="Calibri" w:hAnsi="Calibri" w:cs="Arial"/>
-                <w:i/>
-                <w:iCs/>
-                <w:color w:val="548DD4"/>
-                <w:sz w:val="20"/>
-                <w:szCs w:val="20"/>
-                <w:lang w:eastAsia="es-CL"/>
-              </w:rPr>
-              <w:t xml:space="preserve">solucionarlas. </w:t>
-            </w:r>
-            <w:r>
-              <w:rPr>
-                <w:rFonts w:ascii="Calibri" w:hAnsi="Calibri"/>
+                <w:rFonts w:ascii="Calibri" w:hAnsi="Calibri" w:cs="Arial"/>
+                <w:i/>
+                <w:color w:val="548DD4"/>
+                <w:sz w:val="20"/>
+                <w:szCs w:val="20"/>
+                <w:lang w:eastAsia="es-CL"/>
+              </w:rPr>
+              <w:t xml:space="preserve">qué lo hiciste. </w:t>
+            </w:r>
+            <w:r>
+              <w:t xml:space="preserve"> </w:t>
+            </w:r>
+            <w:r>
+              <w:rPr>
+                <w:rFonts w:ascii="Calibri" w:hAnsi="Calibri" w:cs="Arial"/>
+                <w:i/>
+                <w:color w:val="548DD4"/>
+                <w:sz w:val="20"/>
+                <w:szCs w:val="20"/>
+                <w:lang w:eastAsia="es-CL"/>
+              </w:rPr>
+              <w:t>En el caso de que tu plan de trabajo no haya requerido ni requiera ajustes, justifica esta decisión a partir de los facilitadores que te han permitido desarrollarlo como fue planeado.</w:t>
+            </w:r>
+          </w:p>
+          <w:p>
+            <w:pPr>
+              <w:spacing w:before="60" w:after="60"/>
+              <w:jc w:val="both"/>
+            </w:pPr>
+            <w:r>
+              <w:rPr>
+                <w:rFonts w:ascii="Calibri" w:hAnsi="Calibri" w:cs="Calibri"/>
+              </w:rPr>
+              <w:t>No eliminé actividades. Los ajustes fueron tres:</w:t>
+            </w:r>
+          </w:p>
+          <w:p>
+            <w:pPr>
+              <w:spacing w:before="60" w:after="60"/>
+              <w:jc w:val="both"/>
+            </w:pPr>
+            <w:r>
+              <w:rPr>
+                <w:rFonts w:ascii="Calibri" w:hAnsi="Calibri" w:cs="Calibri"/>
+              </w:rPr>
+              <w:t xml:space="preserve">• </w:t>
+            </w:r>
+            <w:r>
+              <w:rPr>
+                <w:rFonts w:ascii="Calibri" w:hAnsi="Calibri" w:cs="Calibri"/>
                 <w:b/>
-                <w:color w:val="1F3864" w:themeColor="accent1" w:themeShade="80"/>
-              </w:rPr>
-              <w:t xml:space="preserve"> </w:t>
-            </w:r>
-          </w:p>
-          <w:p>
-            <w:pPr>
-              <w:rPr>
-                <w:rFonts w:ascii="Calibri" w:hAnsi="Calibri"/>
-                <w:color w:val="1F3864" w:themeColor="accent1" w:themeShade="80"/>
-              </w:rPr>
-            </w:pPr>
-          </w:p>
-          <w:p>
-            <w:pPr>
-              <w:rPr>
-                <w:rFonts w:ascii="Calibri" w:hAnsi="Calibri"/>
-                <w:color w:val="1F3864" w:themeColor="accent1" w:themeShade="80"/>
-              </w:rPr>
-            </w:pPr>
-          </w:p>
-          <w:p>
-            <w:pPr>
+                <w:bCs/>
+              </w:rPr>
+              <w:t>Sprint 0:</w:t>
+            </w:r>
+            <w:r>
+              <w:rPr>
+                <w:rFonts w:ascii="Calibri" w:hAnsi="Calibri" w:cs="Calibri"/>
+              </w:rPr>
+              <w:t xml:space="preserve"> descarté la propuesta web con SQL, porque la política de ciberseguridad de la empresa no permite bases de datos SQL ni servidores propios, y la reemplacé por una aplicación de escritorio.</w:t>
+            </w:r>
+          </w:p>
+          <w:p>
+            <w:pPr>
+              <w:spacing w:before="60" w:after="60"/>
               <w:jc w:val="both"/>
-              <w:rPr>
-                <w:rFonts w:ascii="Calibri" w:hAnsi="Calibri" w:cs="Arial"/>
-                <w:i/>
-                <w:color w:val="548DD4"/>
-                <w:sz w:val="20"/>
-                <w:szCs w:val="20"/>
-                <w:lang w:eastAsia="es-CL"/>
-              </w:rPr>
-            </w:pPr>
-          </w:p>
-          <w:p>
-            <w:pPr>
+            </w:pPr>
+            <w:r>
+              <w:rPr>
+                <w:rFonts w:ascii="Calibri" w:hAnsi="Calibri" w:cs="Calibri"/>
+              </w:rPr>
+              <w:t xml:space="preserve">• </w:t>
+            </w:r>
+            <w:r>
+              <w:rPr>
+                <w:rFonts w:ascii="Calibri" w:hAnsi="Calibri" w:cs="Calibri"/>
+                <w:b/>
+                <w:bCs/>
+              </w:rPr>
+              <w:t>Contratos por ID (Sprint 6):</w:t>
+            </w:r>
+            <w:r>
+              <w:rPr>
+                <w:rFonts w:ascii="Calibri" w:hAnsi="Calibri" w:cs="Calibri"/>
+              </w:rPr>
+              <w:t xml:space="preserve"> con el VIN como llave, al reactivar un camión se pisaba el contrato anterior y se perdía el historial. Cambié el modelo para que cada fila sea un contrato con su ID. En la presentación intermedia solo la pantalla Comercial trabajaba así; hoy lo hacen todas.</w:t>
+            </w:r>
+          </w:p>
+          <w:p>
+            <w:pPr>
+              <w:spacing w:before="60" w:after="60"/>
               <w:jc w:val="both"/>
-              <w:rPr>
-                <w:rFonts w:ascii="Calibri" w:hAnsi="Calibri" w:cs="Arial"/>
-                <w:i/>
-                <w:color w:val="548DD4"/>
-                <w:sz w:val="20"/>
-                <w:szCs w:val="20"/>
-                <w:lang w:eastAsia="es-CL"/>
-              </w:rPr>
-            </w:pPr>
-          </w:p>
-          <w:p>
-            <w:pPr>
-              <w:jc w:val="both"/>
-              <w:rPr>
-                <w:rFonts w:ascii="Calibri" w:hAnsi="Calibri" w:cs="Arial"/>
-                <w:i/>
-                <w:color w:val="548DD4"/>
-                <w:sz w:val="20"/>
-                <w:szCs w:val="20"/>
-                <w:lang w:eastAsia="es-CL"/>
-              </w:rPr>
-            </w:pPr>
-          </w:p>
-        </w:tc>
-      </w:tr>
-    </w:tbl>
-    <w:p>
-      <w:pPr>
-        <w:rPr>
-          <w:rFonts w:cs="Calibri Light"/>
-          <w:color w:val="595959" w:themeColor="text1" w:themeTint="A6"/>
-          <w:sz w:val="24"/>
-          <w:szCs w:val="24"/>
-          <w:lang w:val="es-ES"/>
-        </w:rPr>
-      </w:pPr>
-    </w:p>
-    <w:tbl>
-      <w:tblPr>
-        <w:tblStyle w:val="Tablaconcuadrcula"/>
-        <w:tblpPr w:leftFromText="180" w:rightFromText="180" w:vertAnchor="text" w:horzAnchor="margin" w:tblpX="-572" w:tblpY="107"/>
-        <w:tblW w:w="5588" w:type="pct"/>
-        <w:tblBorders>
-          <w:top w:val="single" w:sz="4" w:space="0" w:color="BFBFBF" w:themeColor="background1" w:themeShade="BF"/>
-          <w:left w:val="single" w:sz="4" w:space="0" w:color="BFBFBF" w:themeColor="background1" w:themeShade="BF"/>
-          <w:bottom w:val="single" w:sz="4" w:space="0" w:color="BFBFBF" w:themeColor="background1" w:themeShade="BF"/>
-          <w:right w:val="single" w:sz="4" w:space="0" w:color="BFBFBF" w:themeColor="background1" w:themeShade="BF"/>
-          <w:insideH w:val="single" w:sz="4" w:space="0" w:color="BFBFBF" w:themeColor="background1" w:themeShade="BF"/>
-          <w:insideV w:val="single" w:sz="4" w:space="0" w:color="BFBFBF" w:themeColor="background1" w:themeShade="BF"/>
-        </w:tblBorders>
-        <w:tblLook w:val="04A0" w:firstRow="1" w:lastRow="0" w:firstColumn="1" w:lastColumn="0" w:noHBand="0" w:noVBand="1"/>
-      </w:tblPr>
-      <w:tblGrid>
-        <w:gridCol w:w="9493"/>
-      </w:tblGrid>
-      <w:tr>
-        <w:trPr>
-          <w:trHeight w:val="1936"/>
-        </w:trPr>
-        <w:tc>
-          <w:tcPr>
-            <w:tcW w:w="5000" w:type="pct"/>
-            <w:vAlign w:val="center"/>
-          </w:tcPr>
-          <w:p>
-            <w:pPr>
-              <w:jc w:val="both"/>
-              <w:rPr>
-                <w:rFonts w:ascii="Calibri" w:hAnsi="Calibri" w:cs="Arial"/>
-                <w:i/>
-                <w:color w:val="548DD4"/>
-                <w:sz w:val="20"/>
-                <w:szCs w:val="20"/>
-                <w:lang w:eastAsia="es-CL"/>
-              </w:rPr>
-            </w:pPr>
-            <w:r>
-              <w:rPr>
-                <w:rFonts w:ascii="Calibri" w:hAnsi="Calibri"/>
-                <w:color w:val="1F3864" w:themeColor="accent1" w:themeShade="80"/>
+            </w:pPr>
+            <w:r>
+              <w:rPr>
+                <w:rFonts w:ascii="Calibri" w:hAnsi="Calibri" w:cs="Calibri"/>
+              </w:rPr>
+              <w:t xml:space="preserve">• </w:t>
+            </w:r>
+            <w:r>
+              <w:rPr>
+                <w:rFonts w:ascii="Calibri" w:hAnsi="Calibri" w:cs="Calibri"/>
+                <w:b/>
+                <w:bCs/>
+              </w:rPr>
+              <w:t>Dashboard (Sprint 7):</w:t>
+            </w:r>
+            <w:r>
+              <w:rPr>
+                <w:rFonts w:ascii="Calibri" w:hAnsi="Calibri" w:cs="Calibri"/>
+              </w:rPr>
+              <w:t xml:space="preserve"> el otro practicante del área me propuso integrar su página con tres dashboards. La descarté porque dejaba obsoleto el trabajo de ambos y no cubría bien la necesidad. Reconstruí dentro </w:t>
+            </w:r>
+            <w:r>
+              <w:rPr>
+                <w:rFonts w:ascii="Calibri" w:hAnsi="Calibri" w:cs="Calibri"/>
               </w:rPr>
               <w:lastRenderedPageBreak/>
-              <w:t xml:space="preserve">Actividades ajustadas o eliminadas: </w:t>
-            </w:r>
-            <w:r>
-              <w:rPr>
-                <w:rFonts w:ascii="Calibri" w:hAnsi="Calibri" w:cs="Arial"/>
-                <w:i/>
-                <w:color w:val="548DD4"/>
-                <w:sz w:val="20"/>
-                <w:szCs w:val="20"/>
-                <w:lang w:eastAsia="es-CL"/>
-              </w:rPr>
-              <w:t>Señalar los ajustes</w:t>
-            </w:r>
-            <w:r>
-              <w:rPr>
-                <w:rFonts w:ascii="Calibri" w:hAnsi="Calibri" w:cs="Arial"/>
-                <w:i/>
-                <w:color w:val="548DD4"/>
-                <w:sz w:val="20"/>
-                <w:szCs w:val="20"/>
-                <w:lang w:eastAsia="es-CL"/>
-              </w:rPr>
-              <w:t xml:space="preserve"> que realizaste a tu plan de trabajo o </w:t>
-            </w:r>
-            <w:r>
-              <w:rPr>
-                <w:rFonts w:ascii="Calibri" w:hAnsi="Calibri" w:cs="Arial"/>
-                <w:i/>
-                <w:color w:val="548DD4"/>
-                <w:sz w:val="20"/>
-                <w:szCs w:val="20"/>
-                <w:lang w:eastAsia="es-CL"/>
-              </w:rPr>
-              <w:t>actividades que</w:t>
-            </w:r>
-            <w:r>
-              <w:rPr>
-                <w:rFonts w:ascii="Calibri" w:hAnsi="Calibri" w:cs="Arial"/>
-                <w:i/>
-                <w:color w:val="548DD4"/>
-                <w:sz w:val="20"/>
-                <w:szCs w:val="20"/>
-                <w:lang w:eastAsia="es-CL"/>
-              </w:rPr>
-              <w:t xml:space="preserve"> eliminaste</w:t>
-            </w:r>
-            <w:r>
-              <w:rPr>
-                <w:rFonts w:ascii="Calibri" w:hAnsi="Calibri" w:cs="Arial"/>
-                <w:i/>
-                <w:color w:val="548DD4"/>
-                <w:sz w:val="20"/>
-                <w:szCs w:val="20"/>
-                <w:lang w:eastAsia="es-CL"/>
-              </w:rPr>
-              <w:t xml:space="preserve"> y</w:t>
-            </w:r>
-            <w:r>
-              <w:rPr>
-                <w:rFonts w:ascii="Calibri" w:hAnsi="Calibri" w:cs="Arial"/>
-                <w:i/>
-                <w:color w:val="548DD4"/>
-                <w:sz w:val="20"/>
-                <w:szCs w:val="20"/>
-                <w:lang w:eastAsia="es-CL"/>
-              </w:rPr>
-              <w:t>,</w:t>
-            </w:r>
-            <w:r>
-              <w:rPr>
-                <w:rFonts w:ascii="Calibri" w:hAnsi="Calibri" w:cs="Arial"/>
-                <w:i/>
-                <w:color w:val="548DD4"/>
-                <w:sz w:val="20"/>
-                <w:szCs w:val="20"/>
-                <w:lang w:eastAsia="es-CL"/>
-              </w:rPr>
-              <w:t xml:space="preserve"> justifica por</w:t>
-            </w:r>
-            <w:r>
-              <w:rPr>
-                <w:rFonts w:ascii="Calibri" w:hAnsi="Calibri" w:cs="Arial"/>
-                <w:i/>
-                <w:color w:val="548DD4"/>
-                <w:sz w:val="20"/>
-                <w:szCs w:val="20"/>
-                <w:lang w:eastAsia="es-CL"/>
-              </w:rPr>
-              <w:t xml:space="preserve"> </w:t>
-            </w:r>
-            <w:r>
-              <w:rPr>
-                <w:rFonts w:ascii="Calibri" w:hAnsi="Calibri" w:cs="Arial"/>
-                <w:i/>
-                <w:color w:val="548DD4"/>
-                <w:sz w:val="20"/>
-                <w:szCs w:val="20"/>
-                <w:lang w:eastAsia="es-CL"/>
-              </w:rPr>
-              <w:t xml:space="preserve">qué lo hiciste. </w:t>
-            </w:r>
-            <w:r>
-              <w:t xml:space="preserve"> </w:t>
-            </w:r>
-            <w:r>
-              <w:rPr>
-                <w:rFonts w:ascii="Calibri" w:hAnsi="Calibri" w:cs="Arial"/>
-                <w:i/>
-                <w:color w:val="548DD4"/>
-                <w:sz w:val="20"/>
-                <w:szCs w:val="20"/>
-                <w:lang w:eastAsia="es-CL"/>
-              </w:rPr>
-              <w:t>En el caso de que tu plan de trabajo no haya requerido ni requiera ajustes, justifica esta decisión a partir de los facilitadores que te han permitido desarrollarlo como fue planeado.</w:t>
-            </w:r>
-          </w:p>
-          <w:p>
-            <w:pPr>
-              <w:jc w:val="both"/>
-              <w:rPr>
-                <w:rFonts w:ascii="Calibri" w:hAnsi="Calibri" w:cs="Arial"/>
-                <w:i/>
-                <w:color w:val="548DD4"/>
-                <w:sz w:val="20"/>
-                <w:szCs w:val="20"/>
-                <w:lang w:eastAsia="es-CL"/>
-              </w:rPr>
-            </w:pPr>
-          </w:p>
-          <w:p>
-            <w:pPr>
-              <w:jc w:val="both"/>
-              <w:rPr>
-                <w:rFonts w:ascii="Calibri" w:hAnsi="Calibri" w:cs="Arial"/>
-                <w:i/>
-                <w:color w:val="C00000"/>
-                <w:sz w:val="20"/>
-                <w:szCs w:val="20"/>
-                <w:lang w:eastAsia="es-CL"/>
-              </w:rPr>
-            </w:pPr>
-          </w:p>
-          <w:p>
-            <w:pPr>
-              <w:jc w:val="both"/>
-              <w:rPr>
-                <w:rFonts w:ascii="Calibri" w:hAnsi="Calibri" w:cs="Arial"/>
-                <w:i/>
-                <w:color w:val="548DD4"/>
-                <w:sz w:val="20"/>
-                <w:szCs w:val="20"/>
-                <w:lang w:eastAsia="es-CL"/>
-              </w:rPr>
-            </w:pPr>
-          </w:p>
-          <w:p>
-            <w:pPr>
-              <w:jc w:val="both"/>
-              <w:rPr>
-                <w:rFonts w:ascii="Calibri" w:hAnsi="Calibri" w:cs="Arial"/>
-                <w:i/>
-                <w:color w:val="548DD4"/>
-                <w:sz w:val="20"/>
-                <w:szCs w:val="20"/>
-                <w:lang w:eastAsia="es-CL"/>
-              </w:rPr>
-            </w:pPr>
-          </w:p>
-          <w:p>
-            <w:pPr>
-              <w:jc w:val="both"/>
-              <w:rPr>
-                <w:rFonts w:ascii="Calibri" w:hAnsi="Calibri" w:cs="Arial"/>
-                <w:i/>
-                <w:color w:val="548DD4"/>
-                <w:sz w:val="20"/>
-                <w:szCs w:val="20"/>
-                <w:lang w:eastAsia="es-CL"/>
-              </w:rPr>
-            </w:pPr>
-          </w:p>
-          <w:p>
-            <w:pPr>
-              <w:jc w:val="both"/>
-              <w:rPr>
-                <w:rFonts w:ascii="Calibri" w:hAnsi="Calibri" w:cs="Arial"/>
-                <w:i/>
-                <w:color w:val="548DD4"/>
-                <w:sz w:val="20"/>
-                <w:szCs w:val="20"/>
-                <w:lang w:eastAsia="es-CL"/>
-              </w:rPr>
-            </w:pPr>
-          </w:p>
-          <w:p>
-            <w:pPr>
-              <w:jc w:val="both"/>
-              <w:rPr>
-                <w:rFonts w:ascii="Calibri" w:hAnsi="Calibri" w:cs="Arial"/>
-                <w:i/>
-                <w:color w:val="548DD4"/>
-                <w:sz w:val="20"/>
-                <w:szCs w:val="20"/>
-                <w:lang w:eastAsia="es-CL"/>
-              </w:rPr>
-            </w:pPr>
+              <w:t>de la aplicación los gráficos que recordaba de esa página y sumé indicadores propios. Con esto, el dashboard se adelantó respecto del cronograma original (estaba previsto desde el 26-10).</w:t>
+            </w:r>
           </w:p>
         </w:tc>
       </w:tr>
@@ -2978,23 +5227,9 @@
         </w:rPr>
       </w:pPr>
     </w:p>
-    <w:p>
-      <w:pPr>
-        <w:spacing w:after="0" w:line="240" w:lineRule="auto"/>
-        <w:jc w:val="both"/>
-        <w:rPr>
-          <w:rFonts w:ascii="Calibri" w:hAnsi="Calibri" w:cs="Arial"/>
-          <w:i/>
-          <w:color w:val="548DD4"/>
-          <w:sz w:val="20"/>
-          <w:szCs w:val="20"/>
-          <w:lang w:eastAsia="es-CL"/>
-        </w:rPr>
-      </w:pPr>
-    </w:p>
     <w:tbl>
       <w:tblPr>
-        <w:tblStyle w:val="Tablaconcuadrcula"/>
+        <w:tblStyle w:val="TableGrid"/>
         <w:tblW w:w="5591" w:type="pct"/>
         <w:tblInd w:w="-572" w:type="dxa"/>
         <w:tblBorders>
@@ -3036,7 +5271,14 @@
                 <w:rFonts w:ascii="Calibri" w:hAnsi="Calibri"/>
                 <w:color w:val="1F3864" w:themeColor="accent1" w:themeShade="80"/>
               </w:rPr>
-              <w:t>Actividades que no has iniciado o están retrasadas:</w:t>
+              <w:t>A</w:t>
+            </w:r>
+            <w:r>
+              <w:rPr>
+                <w:rFonts w:ascii="Calibri" w:hAnsi="Calibri"/>
+                <w:color w:val="1F3864" w:themeColor="accent1" w:themeShade="80"/>
+              </w:rPr>
+              <w:t>ctividades que no has iniciado o están retrasadas:</w:t>
             </w:r>
             <w:r>
               <w:rPr>
@@ -3200,94 +5442,67 @@
           </w:p>
           <w:p>
             <w:pPr>
+              <w:spacing w:before="60" w:after="60"/>
               <w:jc w:val="both"/>
-              <w:rPr>
-                <w:rFonts w:ascii="Calibri" w:hAnsi="Calibri" w:cs="Arial"/>
-                <w:i/>
-                <w:color w:val="548DD4"/>
-                <w:sz w:val="20"/>
-                <w:szCs w:val="20"/>
-                <w:lang w:eastAsia="es-CL"/>
-              </w:rPr>
-            </w:pPr>
-          </w:p>
-          <w:p>
-            <w:pPr>
+            </w:pPr>
+            <w:r>
+              <w:rPr>
+                <w:rFonts w:ascii="Calibri" w:hAnsi="Calibri" w:cs="Calibri"/>
+              </w:rPr>
+              <w:t>No hay actividades retrasadas respecto del cronograma ajustado. Hay dos actividades no iniciadas, porque dependen de la entrega del producto del 23-10:</w:t>
+            </w:r>
+          </w:p>
+          <w:p>
+            <w:pPr>
+              <w:spacing w:before="60" w:after="60"/>
               <w:jc w:val="both"/>
-              <w:rPr>
-                <w:rFonts w:ascii="Calibri" w:hAnsi="Calibri" w:cs="Arial"/>
-                <w:i/>
-                <w:color w:val="548DD4"/>
-                <w:sz w:val="20"/>
-                <w:szCs w:val="20"/>
-                <w:lang w:eastAsia="es-CL"/>
-              </w:rPr>
-            </w:pPr>
-          </w:p>
-          <w:p>
-            <w:pPr>
+            </w:pPr>
+            <w:r>
+              <w:rPr>
+                <w:rFonts w:ascii="Calibri" w:hAnsi="Calibri" w:cs="Calibri"/>
+              </w:rPr>
+              <w:t xml:space="preserve">• </w:t>
+            </w:r>
+            <w:r>
+              <w:rPr>
+                <w:rFonts w:ascii="Calibri" w:hAnsi="Calibri" w:cs="Calibri"/>
+                <w:b/>
+                <w:bCs/>
+              </w:rPr>
+              <w:t>Pruebas con usuarios (26-10 al 13-11):</w:t>
+            </w:r>
+            <w:r>
+              <w:rPr>
+                <w:rFonts w:ascii="Calibri" w:hAnsi="Calibri" w:cs="Calibri"/>
+              </w:rPr>
+              <w:t xml:space="preserve"> comenzarán al entregar el producto. Durante ese periodo corregiré los errores que se encuentren y atenderé las mejoras solicitadas, para no afectar el proyecto.</w:t>
+            </w:r>
+          </w:p>
+          <w:p>
+            <w:pPr>
+              <w:spacing w:before="60" w:after="60"/>
               <w:jc w:val="both"/>
-              <w:rPr>
-                <w:rFonts w:ascii="Calibri" w:hAnsi="Calibri" w:cs="Arial"/>
-                <w:i/>
-                <w:color w:val="548DD4"/>
-                <w:sz w:val="20"/>
-                <w:szCs w:val="20"/>
-                <w:lang w:eastAsia="es-CL"/>
-              </w:rPr>
-            </w:pPr>
-          </w:p>
-          <w:p>
-            <w:pPr>
-              <w:jc w:val="both"/>
-              <w:rPr>
-                <w:rFonts w:ascii="Calibri" w:hAnsi="Calibri" w:cs="Arial"/>
-                <w:i/>
-                <w:color w:val="548DD4"/>
-                <w:sz w:val="20"/>
-                <w:szCs w:val="20"/>
-                <w:lang w:eastAsia="es-CL"/>
-              </w:rPr>
-            </w:pPr>
-          </w:p>
-          <w:p>
-            <w:pPr>
-              <w:jc w:val="both"/>
-              <w:rPr>
-                <w:rFonts w:ascii="Calibri" w:hAnsi="Calibri" w:cs="Arial"/>
-                <w:i/>
-                <w:color w:val="548DD4"/>
-                <w:sz w:val="20"/>
-                <w:szCs w:val="20"/>
-                <w:lang w:eastAsia="es-CL"/>
-              </w:rPr>
-            </w:pPr>
-          </w:p>
-          <w:p>
-            <w:pPr>
-              <w:jc w:val="both"/>
-              <w:rPr>
-                <w:rFonts w:ascii="Calibri" w:hAnsi="Calibri" w:cs="Arial"/>
-                <w:i/>
-                <w:color w:val="548DD4"/>
-                <w:sz w:val="20"/>
-                <w:szCs w:val="20"/>
-                <w:lang w:eastAsia="es-CL"/>
-              </w:rPr>
-            </w:pPr>
-          </w:p>
-          <w:p>
-            <w:pPr>
-              <w:jc w:val="both"/>
-              <w:rPr>
-                <w:rFonts w:ascii="Calibri" w:hAnsi="Calibri" w:cs="Arial"/>
-                <w:i/>
-                <w:color w:val="548DD4"/>
-                <w:sz w:val="20"/>
-                <w:szCs w:val="20"/>
-                <w:lang w:eastAsia="es-CL"/>
-              </w:rPr>
-            </w:pPr>
+            </w:pPr>
+            <w:r>
+              <w:rPr>
+                <w:rFonts w:ascii="Calibri" w:hAnsi="Calibri" w:cs="Calibri"/>
+              </w:rPr>
+              <w:t xml:space="preserve">• </w:t>
+            </w:r>
+            <w:r>
+              <w:rPr>
+                <w:rFonts w:ascii="Calibri" w:hAnsi="Calibri" w:cs="Calibri"/>
+                <w:b/>
+                <w:bCs/>
+              </w:rPr>
+              <w:t>Documentación final y propuestas de mejora (desde el 16-11):</w:t>
+            </w:r>
+            <w:r>
+              <w:rPr>
+                <w:rFonts w:ascii="Calibri" w:hAnsi="Calibri" w:cs="Calibri"/>
+              </w:rPr>
+              <w:t xml:space="preserve"> comenzará al cerrar las pruebas. Irma Beltrán y yo ya contamos con la documentación técnica y de calidad desarrollada durante el proyecto, por lo que esta etapa consiste en consolidarla.</w:t>
+            </w:r>
           </w:p>
         </w:tc>
       </w:tr>
@@ -3300,7 +5515,7 @@
       </w:pPr>
     </w:p>
     <w:sectPr>
-      <w:headerReference w:type="default" r:id="rId10"/>
+      <w:headerReference w:type="default" r:id="rId12"/>
       <w:pgSz w:w="11906" w:h="16838"/>
       <w:pgMar w:top="1417" w:right="1701" w:bottom="1417" w:left="1701" w:header="708" w:footer="708" w:gutter="0"/>
       <w:cols w:space="708"/>
@@ -3311,7 +5526,7 @@
 </file>
 
 <file path=word/endnotes.xml><?xml version="1.0" encoding="utf-8"?>
-<w:endnotes xmlns:wpc="http://schemas.microsoft.com/office/word/2010/wordprocessingCanvas" xmlns:cx="http://schemas.microsoft.com/office/drawing/2014/chartex" xmlns:mc="http://schemas.openxmlformats.org/markup-compatibility/2006" xmlns:o="urn:schemas-microsoft-com:office:office" xmlns:r="http://schemas.openxmlformats.org/officeDocument/2006/relationships" xmlns:m="http://schemas.openxmlformats.org/officeDocument/2006/math" xmlns:v="urn:schemas-microsoft-com:vml" xmlns:wp14="http://schemas.microsoft.com/office/word/2010/wordprocessingDrawing" xmlns:wp="http://schemas.openxmlformats.org/drawingml/2006/wordprocessingDrawing" xmlns:w10="urn:schemas-microsoft-com:office:word" xmlns:w="http://schemas.openxmlformats.org/wordprocessingml/2006/main" xmlns:w14="http://schemas.microsoft.com/office/word/2010/wordml" xmlns:w15="http://schemas.microsoft.com/office/word/2012/wordml" xmlns:w16se="http://schemas.microsoft.com/office/word/2015/wordml/symex" xmlns:wpg="http://schemas.microsoft.com/office/word/2010/wordprocessingGroup" xmlns:wpi="http://schemas.microsoft.com/office/word/2010/wordprocessingInk" xmlns:wne="http://schemas.microsoft.com/office/word/2006/wordml" xmlns:wps="http://schemas.microsoft.com/office/word/2010/wordprocessingShape" mc:Ignorable="w14 w15 w16se wp14">
+<w:endnotes xmlns:wpc="http://schemas.microsoft.com/office/word/2010/wordprocessingCanvas" xmlns:cx="http://schemas.microsoft.com/office/drawing/2014/chartex" xmlns:cx1="http://schemas.microsoft.com/office/drawing/2015/9/8/chartex" xmlns:cx2="http://schemas.microsoft.com/office/drawing/2015/10/21/chartex" xmlns:cx3="http://schemas.microsoft.com/office/drawing/2016/5/9/chartex" xmlns:cx4="http://schemas.microsoft.com/office/drawing/2016/5/10/chartex" xmlns:cx5="http://schemas.microsoft.com/office/drawing/2016/5/11/chartex" xmlns:cx6="http://schemas.microsoft.com/office/drawing/2016/5/12/chartex" xmlns:cx7="http://schemas.microsoft.com/office/drawing/2016/5/13/chartex" xmlns:cx8="http://schemas.microsoft.com/office/drawing/2016/5/14/chartex" xmlns:mc="http://schemas.openxmlformats.org/markup-compatibility/2006" xmlns:aink="http://schemas.microsoft.com/office/drawing/2016/ink" xmlns:am3d="http://schemas.microsoft.com/office/drawing/2017/model3d" xmlns:o="urn:schemas-microsoft-com:office:office" xmlns:oel="http://schemas.microsoft.com/office/2019/extlst" xmlns:r="http://schemas.openxmlformats.org/officeDocument/2006/relationships" xmlns:m="http://schemas.openxmlformats.org/officeDocument/2006/math" xmlns:v="urn:schemas-microsoft-com:vml" xmlns:wp14="http://schemas.microsoft.com/office/word/2010/wordprocessingDrawing" xmlns:wp="http://schemas.openxmlformats.org/drawingml/2006/wordprocessingDrawing" xmlns:w10="urn:schemas-microsoft-com:office:word" xmlns:w="http://schemas.openxmlformats.org/wordprocessingml/2006/main" xmlns:w14="http://schemas.microsoft.com/office/word/2010/wordml" xmlns:w15="http://schemas.microsoft.com/office/word/2012/wordml" xmlns:w16cex="http://schemas.microsoft.com/office/word/2018/wordml/cex" xmlns:w16cid="http://schemas.microsoft.com/office/word/2016/wordml/cid" xmlns:w16="http://schemas.microsoft.com/office/word/2018/wordml" xmlns:w16du="http://schemas.microsoft.com/office/word/2023/wordml/word16du" xmlns:w16sdtdh="http://schemas.microsoft.com/office/word/2020/wordml/sdtdatahash" xmlns:w16sdtfl="http://schemas.microsoft.com/office/word/2024/wordml/sdtformatlock" xmlns:w16se="http://schemas.microsoft.com/office/word/2015/wordml/symex" xmlns:wpg="http://schemas.microsoft.com/office/word/2010/wordprocessingGroup" xmlns:wpi="http://schemas.microsoft.com/office/word/2010/wordprocessingInk" xmlns:wne="http://schemas.microsoft.com/office/word/2006/wordml" xmlns:wps="http://schemas.microsoft.com/office/word/2010/wordprocessingShape" mc:Ignorable="w14 w15 w16se w16cid w16 w16cex w16sdtdh w16sdtfl w16du wp14">
   <w:endnote w:type="separator" w:id="-1">
     <w:p>
       <w:pPr>
@@ -3336,7 +5551,7 @@
 </file>
 
 <file path=word/footnotes.xml><?xml version="1.0" encoding="utf-8"?>
-<w:footnotes xmlns:wpc="http://schemas.microsoft.com/office/word/2010/wordprocessingCanvas" xmlns:cx="http://schemas.microsoft.com/office/drawing/2014/chartex" xmlns:mc="http://schemas.openxmlformats.org/markup-compatibility/2006" xmlns:o="urn:schemas-microsoft-com:office:office" xmlns:r="http://schemas.openxmlformats.org/officeDocument/2006/relationships" xmlns:m="http://schemas.openxmlformats.org/officeDocument/2006/math" xmlns:v="urn:schemas-microsoft-com:vml" xmlns:wp14="http://schemas.microsoft.com/office/word/2010/wordprocessingDrawing" xmlns:wp="http://schemas.openxmlformats.org/drawingml/2006/wordprocessingDrawing" xmlns:w10="urn:schemas-microsoft-com:office:word" xmlns:w="http://schemas.openxmlformats.org/wordprocessingml/2006/main" xmlns:w14="http://schemas.microsoft.com/office/word/2010/wordml" xmlns:w15="http://schemas.microsoft.com/office/word/2012/wordml" xmlns:w16se="http://schemas.microsoft.com/office/word/2015/wordml/symex" xmlns:wpg="http://schemas.microsoft.com/office/word/2010/wordprocessingGroup" xmlns:wpi="http://schemas.microsoft.com/office/word/2010/wordprocessingInk" xmlns:wne="http://schemas.microsoft.com/office/word/2006/wordml" xmlns:wps="http://schemas.microsoft.com/office/word/2010/wordprocessingShape" mc:Ignorable="w14 w15 w16se wp14">
+<w:footnotes xmlns:wpc="http://schemas.microsoft.com/office/word/2010/wordprocessingCanvas" xmlns:cx="http://schemas.microsoft.com/office/drawing/2014/chartex" xmlns:cx1="http://schemas.microsoft.com/office/drawing/2015/9/8/chartex" xmlns:cx2="http://schemas.microsoft.com/office/drawing/2015/10/21/chartex" xmlns:cx3="http://schemas.microsoft.com/office/drawing/2016/5/9/chartex" xmlns:cx4="http://schemas.microsoft.com/office/drawing/2016/5/10/chartex" xmlns:cx5="http://schemas.microsoft.com/office/drawing/2016/5/11/chartex" xmlns:cx6="http://schemas.microsoft.com/office/drawing/2016/5/12/chartex" xmlns:cx7="http://schemas.microsoft.com/office/drawing/2016/5/13/chartex" xmlns:cx8="http://schemas.microsoft.com/office/drawing/2016/5/14/chartex" xmlns:mc="http://schemas.openxmlformats.org/markup-compatibility/2006" xmlns:aink="http://schemas.microsoft.com/office/drawing/2016/ink" xmlns:am3d="http://schemas.microsoft.com/office/drawing/2017/model3d" xmlns:o="urn:schemas-microsoft-com:office:office" xmlns:oel="http://schemas.microsoft.com/office/2019/extlst" xmlns:r="http://schemas.openxmlformats.org/officeDocument/2006/relationships" xmlns:m="http://schemas.openxmlformats.org/officeDocument/2006/math" xmlns:v="urn:schemas-microsoft-com:vml" xmlns:wp14="http://schemas.microsoft.com/office/word/2010/wordprocessingDrawing" xmlns:wp="http://schemas.openxmlformats.org/drawingml/2006/wordprocessingDrawing" xmlns:w10="urn:schemas-microsoft-com:office:word" xmlns:w="http://schemas.openxmlformats.org/wordprocessingml/2006/main" xmlns:w14="http://schemas.microsoft.com/office/word/2010/wordml" xmlns:w15="http://schemas.microsoft.com/office/word/2012/wordml" xmlns:w16cex="http://schemas.microsoft.com/office/word/2018/wordml/cex" xmlns:w16cid="http://schemas.microsoft.com/office/word/2016/wordml/cid" xmlns:w16="http://schemas.microsoft.com/office/word/2018/wordml" xmlns:w16du="http://schemas.microsoft.com/office/word/2023/wordml/word16du" xmlns:w16sdtdh="http://schemas.microsoft.com/office/word/2020/wordml/sdtdatahash" xmlns:w16sdtfl="http://schemas.microsoft.com/office/word/2024/wordml/sdtformatlock" xmlns:w16se="http://schemas.microsoft.com/office/word/2015/wordml/symex" xmlns:wpg="http://schemas.microsoft.com/office/word/2010/wordprocessingGroup" xmlns:wpi="http://schemas.microsoft.com/office/word/2010/wordprocessingInk" xmlns:wne="http://schemas.microsoft.com/office/word/2006/wordml" xmlns:wps="http://schemas.microsoft.com/office/word/2010/wordprocessingShape" mc:Ignorable="w14 w15 w16se w16cid w16 w16cex w16sdtdh w16sdtfl w16du wp14">
   <w:footnote w:type="separator" w:id="-1">
     <w:p>
       <w:pPr>
@@ -3360,14 +5575,14 @@
   <w:footnote w:id="1">
     <w:p>
       <w:pPr>
-        <w:pStyle w:val="Textonotapie"/>
+        <w:pStyle w:val="FootnoteText"/>
         <w:rPr>
           <w:color w:val="595959" w:themeColor="text1" w:themeTint="A6"/>
         </w:rPr>
       </w:pPr>
       <w:r>
         <w:rPr>
-          <w:rStyle w:val="Refdenotaalpie"/>
+          <w:rStyle w:val="FootnoteReference"/>
           <w:color w:val="595959" w:themeColor="text1" w:themeTint="A6"/>
         </w:rPr>
         <w:footnoteRef/>
@@ -3419,7 +5634,7 @@
 </file>
 
 <file path=word/header1.xml><?xml version="1.0" encoding="utf-8"?>
-<w:hdr xmlns:wpc="http://schemas.microsoft.com/office/word/2010/wordprocessingCanvas" xmlns:cx="http://schemas.microsoft.com/office/drawing/2014/chartex" xmlns:mc="http://schemas.openxmlformats.org/markup-compatibility/2006" xmlns:o="urn:schemas-microsoft-com:office:office" xmlns:r="http://schemas.openxmlformats.org/officeDocument/2006/relationships" xmlns:m="http://schemas.openxmlformats.org/officeDocument/2006/math" xmlns:v="urn:schemas-microsoft-com:vml" xmlns:wp14="http://schemas.microsoft.com/office/word/2010/wordprocessingDrawing" xmlns:wp="http://schemas.openxmlformats.org/drawingml/2006/wordprocessingDrawing" xmlns:w10="urn:schemas-microsoft-com:office:word" xmlns:w="http://schemas.openxmlformats.org/wordprocessingml/2006/main" xmlns:w14="http://schemas.microsoft.com/office/word/2010/wordml" xmlns:w15="http://schemas.microsoft.com/office/word/2012/wordml" xmlns:w16se="http://schemas.microsoft.com/office/word/2015/wordml/symex" xmlns:wpg="http://schemas.microsoft.com/office/word/2010/wordprocessingGroup" xmlns:wpi="http://schemas.microsoft.com/office/word/2010/wordprocessingInk" xmlns:wne="http://schemas.microsoft.com/office/word/2006/wordml" xmlns:wps="http://schemas.microsoft.com/office/word/2010/wordprocessingShape" mc:Ignorable="w14 w15 w16se wp14">
+<w:hdr xmlns:wpc="http://schemas.microsoft.com/office/word/2010/wordprocessingCanvas" xmlns:cx="http://schemas.microsoft.com/office/drawing/2014/chartex" xmlns:cx1="http://schemas.microsoft.com/office/drawing/2015/9/8/chartex" xmlns:cx2="http://schemas.microsoft.com/office/drawing/2015/10/21/chartex" xmlns:cx3="http://schemas.microsoft.com/office/drawing/2016/5/9/chartex" xmlns:cx4="http://schemas.microsoft.com/office/drawing/2016/5/10/chartex" xmlns:cx5="http://schemas.microsoft.com/office/drawing/2016/5/11/chartex" xmlns:cx6="http://schemas.microsoft.com/office/drawing/2016/5/12/chartex" xmlns:cx7="http://schemas.microsoft.com/office/drawing/2016/5/13/chartex" xmlns:cx8="http://schemas.microsoft.com/office/drawing/2016/5/14/chartex" xmlns:mc="http://schemas.openxmlformats.org/markup-compatibility/2006" xmlns:aink="http://schemas.microsoft.com/office/drawing/2016/ink" xmlns:am3d="http://schemas.microsoft.com/office/drawing/2017/model3d" xmlns:o="urn:schemas-microsoft-com:office:office" xmlns:oel="http://schemas.microsoft.com/office/2019/extlst" xmlns:r="http://schemas.openxmlformats.org/officeDocument/2006/relationships" xmlns:m="http://schemas.openxmlformats.org/officeDocument/2006/math" xmlns:v="urn:schemas-microsoft-com:vml" xmlns:wp14="http://schemas.microsoft.com/office/word/2010/wordprocessingDrawing" xmlns:wp="http://schemas.openxmlformats.org/drawingml/2006/wordprocessingDrawing" xmlns:w10="urn:schemas-microsoft-com:office:word" xmlns:w="http://schemas.openxmlformats.org/wordprocessingml/2006/main" xmlns:w14="http://schemas.microsoft.com/office/word/2010/wordml" xmlns:w15="http://schemas.microsoft.com/office/word/2012/wordml" xmlns:w16cex="http://schemas.microsoft.com/office/word/2018/wordml/cex" xmlns:w16cid="http://schemas.microsoft.com/office/word/2016/wordml/cid" xmlns:w16="http://schemas.microsoft.com/office/word/2018/wordml" xmlns:w16du="http://schemas.microsoft.com/office/word/2023/wordml/word16du" xmlns:w16sdtdh="http://schemas.microsoft.com/office/word/2020/wordml/sdtdatahash" xmlns:w16sdtfl="http://schemas.microsoft.com/office/word/2024/wordml/sdtformatlock" xmlns:w16se="http://schemas.microsoft.com/office/word/2015/wordml/symex" xmlns:wpg="http://schemas.microsoft.com/office/word/2010/wordprocessingGroup" xmlns:wpi="http://schemas.microsoft.com/office/word/2010/wordprocessingInk" xmlns:wne="http://schemas.microsoft.com/office/word/2006/wordml" xmlns:wps="http://schemas.microsoft.com/office/word/2010/wordprocessingShape" mc:Ignorable="w14 w15 w16se w16cid w16 w16cex w16sdtdh w16sdtfl w16du wp14">
   <w:tbl>
     <w:tblPr>
       <w:tblStyle w:val="Tablaconcuadrcula1"/>
@@ -3637,14 +5852,14 @@
   </w:tbl>
   <w:p>
     <w:pPr>
-      <w:pStyle w:val="Encabezado"/>
+      <w:pStyle w:val="Header"/>
     </w:pPr>
   </w:p>
 </w:hdr>
 </file>
 
 <file path=word/numbering.xml><?xml version="1.0" encoding="utf-8"?>
-<w:numbering xmlns:wpc="http://schemas.microsoft.com/office/word/2010/wordprocessingCanvas" xmlns:cx="http://schemas.microsoft.com/office/drawing/2014/chartex" xmlns:mc="http://schemas.openxmlformats.org/markup-compatibility/2006" xmlns:o="urn:schemas-microsoft-com:office:office" xmlns:r="http://schemas.openxmlformats.org/officeDocument/2006/relationships" xmlns:m="http://schemas.openxmlformats.org/officeDocument/2006/math" xmlns:v="urn:schemas-microsoft-com:vml" xmlns:wp14="http://schemas.microsoft.com/office/word/2010/wordprocessingDrawing" xmlns:wp="http://schemas.openxmlformats.org/drawingml/2006/wordprocessingDrawing" xmlns:w10="urn:schemas-microsoft-com:office:word" xmlns:w="http://schemas.openxmlformats.org/wordprocessingml/2006/main" xmlns:w14="http://schemas.microsoft.com/office/word/2010/wordml" xmlns:w15="http://schemas.microsoft.com/office/word/2012/wordml" xmlns:w16se="http://schemas.microsoft.com/office/word/2015/wordml/symex" xmlns:wpg="http://schemas.microsoft.com/office/word/2010/wordprocessingGroup" xmlns:wpi="http://schemas.microsoft.com/office/word/2010/wordprocessingInk" xmlns:wne="http://schemas.microsoft.com/office/word/2006/wordml" xmlns:wps="http://schemas.microsoft.com/office/word/2010/wordprocessingShape" mc:Ignorable="w14 w15 w16se wp14">
+<w:numbering xmlns:wpc="http://schemas.microsoft.com/office/word/2010/wordprocessingCanvas" xmlns:cx="http://schemas.microsoft.com/office/drawing/2014/chartex" xmlns:cx1="http://schemas.microsoft.com/office/drawing/2015/9/8/chartex" xmlns:cx2="http://schemas.microsoft.com/office/drawing/2015/10/21/chartex" xmlns:cx3="http://schemas.microsoft.com/office/drawing/2016/5/9/chartex" xmlns:cx4="http://schemas.microsoft.com/office/drawing/2016/5/10/chartex" xmlns:cx5="http://schemas.microsoft.com/office/drawing/2016/5/11/chartex" xmlns:cx6="http://schemas.microsoft.com/office/drawing/2016/5/12/chartex" xmlns:cx7="http://schemas.microsoft.com/office/drawing/2016/5/13/chartex" xmlns:cx8="http://schemas.microsoft.com/office/drawing/2016/5/14/chartex" xmlns:mc="http://schemas.openxmlformats.org/markup-compatibility/2006" xmlns:aink="http://schemas.microsoft.com/office/drawing/2016/ink" xmlns:am3d="http://schemas.microsoft.com/office/drawing/2017/model3d" xmlns:o="urn:schemas-microsoft-com:office:office" xmlns:oel="http://schemas.microsoft.com/office/2019/extlst" xmlns:r="http://schemas.openxmlformats.org/officeDocument/2006/relationships" xmlns:m="http://schemas.openxmlformats.org/officeDocument/2006/math" xmlns:v="urn:schemas-microsoft-com:vml" xmlns:wp14="http://schemas.microsoft.com/office/word/2010/wordprocessingDrawing" xmlns:wp="http://schemas.openxmlformats.org/drawingml/2006/wordprocessingDrawing" xmlns:w10="urn:schemas-microsoft-com:office:word" xmlns:w="http://schemas.openxmlformats.org/wordprocessingml/2006/main" xmlns:w14="http://schemas.microsoft.com/office/word/2010/wordml" xmlns:w15="http://schemas.microsoft.com/office/word/2012/wordml" xmlns:w16cex="http://schemas.microsoft.com/office/word/2018/wordml/cex" xmlns:w16cid="http://schemas.microsoft.com/office/word/2016/wordml/cid" xmlns:w16="http://schemas.microsoft.com/office/word/2018/wordml" xmlns:w16du="http://schemas.microsoft.com/office/word/2023/wordml/word16du" xmlns:w16sdtdh="http://schemas.microsoft.com/office/word/2020/wordml/sdtdatahash" xmlns:w16sdtfl="http://schemas.microsoft.com/office/word/2024/wordml/sdtformatlock" xmlns:w16se="http://schemas.microsoft.com/office/word/2015/wordml/symex" xmlns:wpg="http://schemas.microsoft.com/office/word/2010/wordprocessingGroup" xmlns:wpi="http://schemas.microsoft.com/office/word/2010/wordprocessingInk" xmlns:wne="http://schemas.microsoft.com/office/word/2006/wordml" xmlns:wps="http://schemas.microsoft.com/office/word/2010/wordprocessingShape" mc:Ignorable="w14 w15 w16se w16cid w16 w16cex w16sdtdh w16sdtfl w16du wp14">
   <w:abstractNum w:abstractNumId="0" w15:restartNumberingAfterBreak="0">
     <w:nsid w:val="2FFD4C7F"/>
     <w:multiLevelType w:val="multilevel"/>
@@ -3766,14 +5981,14 @@
       </w:rPr>
     </w:lvl>
   </w:abstractNum>
-  <w:num w:numId="1">
+  <w:num w:numId="1" w16cid:durableId="1848475332">
     <w:abstractNumId w:val="0"/>
   </w:num>
 </w:numbering>
 </file>
 
 <file path=word/styles.xml><?xml version="1.0" encoding="utf-8"?>
-<w:styles xmlns:mc="http://schemas.openxmlformats.org/markup-compatibility/2006" xmlns:r="http://schemas.openxmlformats.org/officeDocument/2006/relationships" xmlns:w="http://schemas.openxmlformats.org/wordprocessingml/2006/main" xmlns:w14="http://schemas.microsoft.com/office/word/2010/wordml" xmlns:w15="http://schemas.microsoft.com/office/word/2012/wordml" xmlns:w16se="http://schemas.microsoft.com/office/word/2015/wordml/symex" mc:Ignorable="w14 w15 w16se">
+<w:styles xmlns:mc="http://schemas.openxmlformats.org/markup-compatibility/2006" xmlns:r="http://schemas.openxmlformats.org/officeDocument/2006/relationships" xmlns:w="http://schemas.openxmlformats.org/wordprocessingml/2006/main" xmlns:w14="http://schemas.microsoft.com/office/word/2010/wordml" xmlns:w15="http://schemas.microsoft.com/office/word/2012/wordml" xmlns:w16cex="http://schemas.microsoft.com/office/word/2018/wordml/cex" xmlns:w16cid="http://schemas.microsoft.com/office/word/2016/wordml/cid" xmlns:w16="http://schemas.microsoft.com/office/word/2018/wordml" xmlns:w16du="http://schemas.microsoft.com/office/word/2023/wordml/word16du" xmlns:w16sdtdh="http://schemas.microsoft.com/office/word/2020/wordml/sdtdatahash" xmlns:w16sdtfl="http://schemas.microsoft.com/office/word/2024/wordml/sdtformatlock" xmlns:w16se="http://schemas.microsoft.com/office/word/2015/wordml/symex" mc:Ignorable="w14 w15 w16se w16cid w16 w16cex w16sdtdh w16sdtfl w16du">
   <w:docDefaults>
     <w:rPrDefault>
       <w:rPr>
@@ -3785,7 +6000,7 @@
     </w:rPrDefault>
     <w:pPrDefault/>
   </w:docDefaults>
-  <w:latentStyles w:defLockedState="0" w:defUIPriority="99" w:defSemiHidden="0" w:defUnhideWhenUsed="0" w:defQFormat="0" w:count="371">
+  <w:latentStyles w:defLockedState="0" w:defUIPriority="99" w:defSemiHidden="0" w:defUnhideWhenUsed="0" w:defQFormat="0" w:count="376">
     <w:lsdException w:name="Normal" w:uiPriority="0" w:qFormat="1"/>
     <w:lsdException w:name="heading 1" w:uiPriority="9" w:qFormat="1"/>
     <w:lsdException w:name="heading 2" w:semiHidden="1" w:uiPriority="9" w:unhideWhenUsed="1" w:qFormat="1"/>
@@ -4157,6 +6372,11 @@
     <w:lsdException w:name="List Table 5 Dark Accent 6" w:uiPriority="50"/>
     <w:lsdException w:name="List Table 6 Colorful Accent 6" w:uiPriority="51"/>
     <w:lsdException w:name="List Table 7 Colorful Accent 6" w:uiPriority="52"/>
+    <w:lsdException w:name="Mention" w:semiHidden="1" w:unhideWhenUsed="1"/>
+    <w:lsdException w:name="Smart Hyperlink" w:semiHidden="1" w:unhideWhenUsed="1"/>
+    <w:lsdException w:name="Hashtag" w:semiHidden="1" w:unhideWhenUsed="1"/>
+    <w:lsdException w:name="Unresolved Mention" w:semiHidden="1" w:unhideWhenUsed="1"/>
+    <w:lsdException w:name="Smart Link" w:semiHidden="1" w:unhideWhenUsed="1"/>
   </w:latentStyles>
   <w:style w:type="paragraph" w:default="1" w:styleId="Normal">
     <w:name w:val="Normal"/>
@@ -4170,11 +6390,11 @@
       <w:szCs w:val="22"/>
     </w:rPr>
   </w:style>
-  <w:style w:type="paragraph" w:styleId="Ttulo3">
+  <w:style w:type="paragraph" w:styleId="Heading3">
     <w:name w:val="heading 3"/>
     <w:basedOn w:val="Normal"/>
     <w:next w:val="Normal"/>
-    <w:link w:val="Ttulo3Car"/>
+    <w:link w:val="Heading3Char"/>
     <w:uiPriority w:val="9"/>
     <w:unhideWhenUsed/>
     <w:qFormat/>
@@ -4192,13 +6412,13 @@
       <w:szCs w:val="24"/>
     </w:rPr>
   </w:style>
-  <w:style w:type="character" w:default="1" w:styleId="Fuentedeprrafopredeter">
+  <w:style w:type="character" w:default="1" w:styleId="DefaultParagraphFont">
     <w:name w:val="Default Paragraph Font"/>
     <w:uiPriority w:val="1"/>
     <w:semiHidden/>
     <w:unhideWhenUsed/>
   </w:style>
-  <w:style w:type="table" w:default="1" w:styleId="Tablanormal">
+  <w:style w:type="table" w:default="1" w:styleId="TableNormal">
     <w:name w:val="Normal Table"/>
     <w:uiPriority w:val="99"/>
     <w:semiHidden/>
@@ -4213,16 +6433,16 @@
       </w:tblCellMar>
     </w:tblPr>
   </w:style>
-  <w:style w:type="numbering" w:default="1" w:styleId="Sinlista">
+  <w:style w:type="numbering" w:default="1" w:styleId="NoList">
     <w:name w:val="No List"/>
     <w:uiPriority w:val="99"/>
     <w:semiHidden/>
     <w:unhideWhenUsed/>
   </w:style>
-  <w:style w:type="character" w:customStyle="1" w:styleId="Ttulo3Car">
-    <w:name w:val="Título 3 Car"/>
-    <w:basedOn w:val="Fuentedeprrafopredeter"/>
-    <w:link w:val="Ttulo3"/>
+  <w:style w:type="character" w:customStyle="1" w:styleId="Heading3Char">
+    <w:name w:val="Heading 3 Char"/>
+    <w:basedOn w:val="DefaultParagraphFont"/>
+    <w:link w:val="Heading3"/>
     <w:uiPriority w:val="9"/>
     <w:rsid w:val="0003309E"/>
     <w:rPr>
@@ -4230,9 +6450,9 @@
       <w:color w:val="1F3763" w:themeColor="accent1" w:themeShade="7F"/>
     </w:rPr>
   </w:style>
-  <w:style w:type="table" w:styleId="Tablaconcuadrcula">
+  <w:style w:type="table" w:styleId="TableGrid">
     <w:name w:val="Table Grid"/>
-    <w:basedOn w:val="Tablanormal"/>
+    <w:basedOn w:val="TableNormal"/>
     <w:uiPriority w:val="39"/>
     <w:rsid w:val="0003309E"/>
     <w:rPr>
@@ -4250,10 +6470,10 @@
       </w:tblBorders>
     </w:tblPr>
   </w:style>
-  <w:style w:type="paragraph" w:styleId="Piedepgina">
+  <w:style w:type="paragraph" w:styleId="Footer">
     <w:name w:val="footer"/>
     <w:basedOn w:val="Normal"/>
-    <w:link w:val="PiedepginaCar"/>
+    <w:link w:val="FooterChar"/>
     <w:uiPriority w:val="99"/>
     <w:unhideWhenUsed/>
     <w:rsid w:val="0003309E"/>
@@ -4265,10 +6485,10 @@
       <w:spacing w:after="0" w:line="240" w:lineRule="auto"/>
     </w:pPr>
   </w:style>
-  <w:style w:type="character" w:customStyle="1" w:styleId="PiedepginaCar">
-    <w:name w:val="Pie de página Car"/>
-    <w:basedOn w:val="Fuentedeprrafopredeter"/>
-    <w:link w:val="Piedepgina"/>
+  <w:style w:type="character" w:customStyle="1" w:styleId="FooterChar">
+    <w:name w:val="Footer Char"/>
+    <w:basedOn w:val="DefaultParagraphFont"/>
+    <w:link w:val="Footer"/>
     <w:uiPriority w:val="99"/>
     <w:rsid w:val="0003309E"/>
     <w:rPr>
@@ -4276,10 +6496,10 @@
       <w:szCs w:val="22"/>
     </w:rPr>
   </w:style>
-  <w:style w:type="paragraph" w:styleId="Textonotapie">
+  <w:style w:type="paragraph" w:styleId="FootnoteText">
     <w:name w:val="footnote text"/>
     <w:basedOn w:val="Normal"/>
-    <w:link w:val="TextonotapieCar"/>
+    <w:link w:val="FootnoteTextChar"/>
     <w:uiPriority w:val="99"/>
     <w:semiHidden/>
     <w:unhideWhenUsed/>
@@ -4293,10 +6513,10 @@
       <w:lang w:val="es-ES"/>
     </w:rPr>
   </w:style>
-  <w:style w:type="character" w:customStyle="1" w:styleId="TextonotapieCar">
-    <w:name w:val="Texto nota pie Car"/>
-    <w:basedOn w:val="Fuentedeprrafopredeter"/>
-    <w:link w:val="Textonotapie"/>
+  <w:style w:type="character" w:customStyle="1" w:styleId="FootnoteTextChar">
+    <w:name w:val="Footnote Text Char"/>
+    <w:basedOn w:val="DefaultParagraphFont"/>
+    <w:link w:val="FootnoteText"/>
     <w:uiPriority w:val="99"/>
     <w:semiHidden/>
     <w:rsid w:val="0003309E"/>
@@ -4306,19 +6526,19 @@
       <w:lang w:val="es-ES"/>
     </w:rPr>
   </w:style>
-  <w:style w:type="character" w:styleId="Refdenotaalpie">
+  <w:style w:type="character" w:styleId="FootnoteReference">
     <w:name w:val="footnote reference"/>
-    <w:basedOn w:val="Fuentedeprrafopredeter"/>
+    <w:basedOn w:val="DefaultParagraphFont"/>
     <w:unhideWhenUsed/>
     <w:rsid w:val="0003309E"/>
     <w:rPr>
       <w:vertAlign w:val="superscript"/>
     </w:rPr>
   </w:style>
-  <w:style w:type="paragraph" w:styleId="Encabezado">
+  <w:style w:type="paragraph" w:styleId="Header">
     <w:name w:val="header"/>
     <w:basedOn w:val="Normal"/>
-    <w:link w:val="EncabezadoCar"/>
+    <w:link w:val="HeaderChar"/>
     <w:uiPriority w:val="99"/>
     <w:unhideWhenUsed/>
     <w:rsid w:val="00586C9C"/>
@@ -4330,10 +6550,10 @@
       <w:spacing w:after="0" w:line="240" w:lineRule="auto"/>
     </w:pPr>
   </w:style>
-  <w:style w:type="character" w:customStyle="1" w:styleId="EncabezadoCar">
-    <w:name w:val="Encabezado Car"/>
-    <w:basedOn w:val="Fuentedeprrafopredeter"/>
-    <w:link w:val="Encabezado"/>
+  <w:style w:type="character" w:customStyle="1" w:styleId="HeaderChar">
+    <w:name w:val="Header Char"/>
+    <w:basedOn w:val="DefaultParagraphFont"/>
+    <w:link w:val="Header"/>
     <w:uiPriority w:val="99"/>
     <w:rsid w:val="00586C9C"/>
     <w:rPr>
@@ -4343,8 +6563,8 @@
   </w:style>
   <w:style w:type="table" w:customStyle="1" w:styleId="Tablaconcuadrcula1">
     <w:name w:val="Tabla con cuadrícula1"/>
-    <w:basedOn w:val="Tablanormal"/>
-    <w:next w:val="Tablaconcuadrcula"/>
+    <w:basedOn w:val="TableNormal"/>
+    <w:next w:val="TableGrid"/>
     <w:uiPriority w:val="39"/>
     <w:rsid w:val="00C44557"/>
     <w:rPr>
@@ -4362,10 +6582,10 @@
       </w:tblBorders>
     </w:tblPr>
   </w:style>
-  <w:style w:type="paragraph" w:styleId="Textodeglobo">
+  <w:style w:type="paragraph" w:styleId="BalloonText">
     <w:name w:val="Balloon Text"/>
     <w:basedOn w:val="Normal"/>
-    <w:link w:val="TextodegloboCar"/>
+    <w:link w:val="BalloonTextChar"/>
     <w:uiPriority w:val="99"/>
     <w:semiHidden/>
     <w:unhideWhenUsed/>
@@ -4379,10 +6599,10 @@
       <w:szCs w:val="18"/>
     </w:rPr>
   </w:style>
-  <w:style w:type="character" w:customStyle="1" w:styleId="TextodegloboCar">
-    <w:name w:val="Texto de globo Car"/>
-    <w:basedOn w:val="Fuentedeprrafopredeter"/>
-    <w:link w:val="Textodeglobo"/>
+  <w:style w:type="character" w:customStyle="1" w:styleId="BalloonTextChar">
+    <w:name w:val="Balloon Text Char"/>
+    <w:basedOn w:val="DefaultParagraphFont"/>
+    <w:link w:val="BalloonText"/>
     <w:uiPriority w:val="99"/>
     <w:semiHidden/>
     <w:rsid w:val="00C5122E"/>
@@ -4392,9 +6612,9 @@
       <w:szCs w:val="18"/>
     </w:rPr>
   </w:style>
-  <w:style w:type="character" w:styleId="Refdecomentario">
+  <w:style w:type="character" w:styleId="CommentReference">
     <w:name w:val="annotation reference"/>
-    <w:basedOn w:val="Fuentedeprrafopredeter"/>
+    <w:basedOn w:val="DefaultParagraphFont"/>
     <w:uiPriority w:val="99"/>
     <w:semiHidden/>
     <w:unhideWhenUsed/>
@@ -4404,10 +6624,10 @@
       <w:szCs w:val="16"/>
     </w:rPr>
   </w:style>
-  <w:style w:type="paragraph" w:styleId="Textocomentario">
+  <w:style w:type="paragraph" w:styleId="CommentText">
     <w:name w:val="annotation text"/>
     <w:basedOn w:val="Normal"/>
-    <w:link w:val="TextocomentarioCar"/>
+    <w:link w:val="CommentTextChar"/>
     <w:uiPriority w:val="99"/>
     <w:semiHidden/>
     <w:unhideWhenUsed/>
@@ -4420,10 +6640,10 @@
       <w:szCs w:val="20"/>
     </w:rPr>
   </w:style>
-  <w:style w:type="character" w:customStyle="1" w:styleId="TextocomentarioCar">
-    <w:name w:val="Texto comentario Car"/>
-    <w:basedOn w:val="Fuentedeprrafopredeter"/>
-    <w:link w:val="Textocomentario"/>
+  <w:style w:type="character" w:customStyle="1" w:styleId="CommentTextChar">
+    <w:name w:val="Comment Text Char"/>
+    <w:basedOn w:val="DefaultParagraphFont"/>
+    <w:link w:val="CommentText"/>
     <w:uiPriority w:val="99"/>
     <w:semiHidden/>
     <w:rsid w:val="009E52DF"/>
@@ -4432,11 +6652,11 @@
       <w:szCs w:val="20"/>
     </w:rPr>
   </w:style>
-  <w:style w:type="paragraph" w:styleId="Asuntodelcomentario">
+  <w:style w:type="paragraph" w:styleId="CommentSubject">
     <w:name w:val="annotation subject"/>
-    <w:basedOn w:val="Textocomentario"/>
-    <w:next w:val="Textocomentario"/>
-    <w:link w:val="AsuntodelcomentarioCar"/>
+    <w:basedOn w:val="CommentText"/>
+    <w:next w:val="CommentText"/>
+    <w:link w:val="CommentSubjectChar"/>
     <w:uiPriority w:val="99"/>
     <w:semiHidden/>
     <w:unhideWhenUsed/>
@@ -4446,10 +6666,10 @@
       <w:bCs/>
     </w:rPr>
   </w:style>
-  <w:style w:type="character" w:customStyle="1" w:styleId="AsuntodelcomentarioCar">
-    <w:name w:val="Asunto del comentario Car"/>
-    <w:basedOn w:val="TextocomentarioCar"/>
-    <w:link w:val="Asuntodelcomentario"/>
+  <w:style w:type="character" w:customStyle="1" w:styleId="CommentSubjectChar">
+    <w:name w:val="Comment Subject Char"/>
+    <w:basedOn w:val="CommentTextChar"/>
+    <w:link w:val="CommentSubject"/>
     <w:uiPriority w:val="99"/>
     <w:semiHidden/>
     <w:rsid w:val="009E52DF"/>
@@ -4908,15 +7128,8 @@
 <file path=customXml/itemProps1.xml><?xml version="1.0" encoding="utf-8"?>
 <ds:datastoreItem xmlns:ds="http://schemas.openxmlformats.org/officeDocument/2006/customXml" ds:itemID="{46CA5683-AF87-4E40-B841-2E23A3B52406}">
   <ds:schemaRefs>
-    <ds:schemaRef ds:uri="http://purl.org/dc/terms/"/>
-    <ds:schemaRef ds:uri="http://purl.org/dc/elements/1.1/"/>
-    <ds:schemaRef ds:uri="http://schemas.openxmlformats.org/package/2006/metadata/core-properties"/>
-    <ds:schemaRef ds:uri="http://www.w3.org/XML/1998/namespace"/>
     <ds:schemaRef ds:uri="http://schemas.microsoft.com/office/2006/metadata/properties"/>
-    <ds:schemaRef ds:uri="http://schemas.microsoft.com/office/2006/documentManagement/types"/>
-    <ds:schemaRef ds:uri="http://purl.org/dc/dcmitype/"/>
     <ds:schemaRef ds:uri="http://schemas.microsoft.com/office/infopath/2007/PartnerControls"/>
-    <ds:schemaRef ds:uri="126e8a1c-9ea9-435a-ac89-d06c80d62e30"/>
   </ds:schemaRefs>
 </ds:datastoreItem>
 </file>
@@ -4945,4 +7158,10 @@
     <ds:schemaRef ds:uri="http://schemas.microsoft.com/sharepoint/v3/contenttype/forms"/>
   </ds:schemaRefs>
 </ds:datastoreItem>
+</file>
+
+<file path=docMetadata/LabelInfo.xml><?xml version="1.0" encoding="utf-8"?>
+<clbl:labelList xmlns:clbl="http://schemas.microsoft.com/office/2020/mipLabelMetadata">
+  <clbl:label id="{bd2ff15f-6ce8-47f3-93ce-f81f88196d24}" enabled="1" method="Privileged" siteId="{f25493ae-1c98-41d7-8a33-0be75f5fe603}" contentBits="0" removed="0"/>
+</clbl:labelList>
 </file>
</xml_diff>

<commit_message>
Fase 2: informe de avance (2.4) con formato 2.5 y planillas actualizadas
</commit_message>
<xml_diff>
--- a/Fase 2/Evidencias Grupales/2.4_GuiaEstudiante_Fase 2_DesarrolloProyecto APT (Español).docx
+++ b/Fase 2/Evidencias Grupales/2.4_GuiaEstudiante_Fase 2_DesarrolloProyecto APT (Español).docx
@@ -2,6 +2,424 @@
 <file path=word/document.xml><?xml version="1.0" encoding="utf-8"?>
 <w:document xmlns:wpc="http://schemas.microsoft.com/office/word/2010/wordprocessingCanvas" xmlns:cx="http://schemas.microsoft.com/office/drawing/2014/chartex" xmlns:cx1="http://schemas.microsoft.com/office/drawing/2015/9/8/chartex" xmlns:cx2="http://schemas.microsoft.com/office/drawing/2015/10/21/chartex" xmlns:cx3="http://schemas.microsoft.com/office/drawing/2016/5/9/chartex" xmlns:cx4="http://schemas.microsoft.com/office/drawing/2016/5/10/chartex" xmlns:cx5="http://schemas.microsoft.com/office/drawing/2016/5/11/chartex" xmlns:cx6="http://schemas.microsoft.com/office/drawing/2016/5/12/chartex" xmlns:cx7="http://schemas.microsoft.com/office/drawing/2016/5/13/chartex" xmlns:cx8="http://schemas.microsoft.com/office/drawing/2016/5/14/chartex" xmlns:mc="http://schemas.openxmlformats.org/markup-compatibility/2006" xmlns:aink="http://schemas.microsoft.com/office/drawing/2016/ink" xmlns:am3d="http://schemas.microsoft.com/office/drawing/2017/model3d" xmlns:o="urn:schemas-microsoft-com:office:office" xmlns:oel="http://schemas.microsoft.com/office/2019/extlst" xmlns:r="http://schemas.openxmlformats.org/officeDocument/2006/relationships" xmlns:m="http://schemas.openxmlformats.org/officeDocument/2006/math" xmlns:v="urn:schemas-microsoft-com:vml" xmlns:wp14="http://schemas.microsoft.com/office/word/2010/wordprocessingDrawing" xmlns:wp="http://schemas.openxmlformats.org/drawingml/2006/wordprocessingDrawing" xmlns:w10="urn:schemas-microsoft-com:office:word" xmlns:w="http://schemas.openxmlformats.org/wordprocessingml/2006/main" xmlns:w14="http://schemas.microsoft.com/office/word/2010/wordml" xmlns:w15="http://schemas.microsoft.com/office/word/2012/wordml" xmlns:w16cex="http://schemas.microsoft.com/office/word/2018/wordml/cex" xmlns:w16cid="http://schemas.microsoft.com/office/word/2016/wordml/cid" xmlns:w16="http://schemas.microsoft.com/office/word/2018/wordml" xmlns:w16du="http://schemas.microsoft.com/office/word/2023/wordml/word16du" xmlns:w16sdtdh="http://schemas.microsoft.com/office/word/2020/wordml/sdtdatahash" xmlns:w16sdtfl="http://schemas.microsoft.com/office/word/2024/wordml/sdtformatlock" xmlns:w16se="http://schemas.microsoft.com/office/word/2015/wordml/symex" xmlns:wpg="http://schemas.microsoft.com/office/word/2010/wordprocessingGroup" xmlns:wpi="http://schemas.microsoft.com/office/word/2010/wordprocessingInk" xmlns:wne="http://schemas.microsoft.com/office/word/2006/wordml" xmlns:wps="http://schemas.microsoft.com/office/word/2010/wordprocessingShape" mc:Ignorable="w14 w15 w16se w16cid w16 w16cex w16sdtdh w16sdtfl w16du wp14">
   <w:body>
+    <w:p>
+      <w:pPr>
+        <w:spacing w:line="240" w:lineRule="auto" w:before="1200" w:after="120"/>
+        <w:jc w:val="center"/>
+      </w:pPr>
+      <w:r>
+        <w:rPr>
+          <w:rFonts w:ascii="Calibri" w:hAnsi="Calibri" w:eastAsia="Calibri"/>
+          <w:b/>
+          <w:i w:val="0"/>
+          <w:sz w:val="26"/>
+        </w:rPr>
+        <w:t>Duoc UC · Escuela de Informática y Telecomunicaciones</w:t>
+      </w:r>
+    </w:p>
+    <w:p>
+      <w:pPr>
+        <w:spacing w:line="240" w:lineRule="auto" w:before="0" w:after="1400"/>
+        <w:jc w:val="center"/>
+      </w:pPr>
+      <w:r>
+        <w:rPr>
+          <w:rFonts w:ascii="Calibri" w:hAnsi="Calibri" w:eastAsia="Calibri"/>
+          <w:b w:val="0"/>
+          <w:i w:val="0"/>
+          <w:sz w:val="24"/>
+        </w:rPr>
+        <w:t>Capstone (PTY4614) · Sección 302</w:t>
+      </w:r>
+    </w:p>
+    <w:p>
+      <w:pPr>
+        <w:spacing w:line="240" w:lineRule="auto" w:before="0" w:after="80"/>
+        <w:jc w:val="center"/>
+      </w:pPr>
+      <w:r>
+        <w:rPr>
+          <w:rFonts w:ascii="Calibri" w:hAnsi="Calibri" w:eastAsia="Calibri"/>
+          <w:b/>
+          <w:i w:val="0"/>
+          <w:color w:val="1F3864"/>
+          <w:sz w:val="44"/>
+        </w:rPr>
+        <w:t>INFORME DE AVANCE</w:t>
+      </w:r>
+    </w:p>
+    <w:p>
+      <w:pPr>
+        <w:spacing w:line="240" w:lineRule="auto" w:before="0" w:after="1000"/>
+        <w:jc w:val="center"/>
+      </w:pPr>
+      <w:r>
+        <w:rPr>
+          <w:rFonts w:ascii="Calibri" w:hAnsi="Calibri" w:eastAsia="Calibri"/>
+          <w:b w:val="0"/>
+          <w:i w:val="0"/>
+          <w:sz w:val="28"/>
+        </w:rPr>
+        <w:t>Proyecto APT · Fase 2</w:t>
+      </w:r>
+    </w:p>
+    <w:p>
+      <w:pPr>
+        <w:spacing w:line="240" w:lineRule="auto" w:before="0" w:after="160"/>
+        <w:jc w:val="center"/>
+      </w:pPr>
+      <w:r>
+        <w:rPr>
+          <w:rFonts w:ascii="Calibri" w:hAnsi="Calibri" w:eastAsia="Calibri"/>
+          <w:b/>
+          <w:i w:val="0"/>
+          <w:sz w:val="40"/>
+        </w:rPr>
+        <w:t>Volvo Sistema de Gestión</w:t>
+      </w:r>
+    </w:p>
+    <w:p>
+      <w:pPr>
+        <w:spacing w:line="276" w:lineRule="auto" w:before="0" w:after="1400"/>
+        <w:jc w:val="center"/>
+      </w:pPr>
+      <w:r>
+        <w:rPr>
+          <w:rFonts w:ascii="Calibri" w:hAnsi="Calibri" w:eastAsia="Calibri"/>
+          <w:b w:val="0"/>
+          <w:i w:val="0"/>
+          <w:sz w:val="24"/>
+        </w:rPr>
+        <w:t>Plataforma de escritorio para centralizar la gestión de la flota conectada de Volvo Chile (área de Servicios Conectados)</w:t>
+      </w:r>
+    </w:p>
+    <w:p>
+      <w:pPr>
+        <w:spacing w:line="240" w:lineRule="auto" w:before="0" w:after="40"/>
+        <w:jc w:val="center"/>
+      </w:pPr>
+      <w:r>
+        <w:rPr>
+          <w:rFonts w:ascii="Calibri" w:hAnsi="Calibri" w:eastAsia="Calibri"/>
+          <w:b/>
+          <w:i w:val="0"/>
+          <w:sz w:val="24"/>
+        </w:rPr>
+        <w:t>Integrantes</w:t>
+      </w:r>
+    </w:p>
+    <w:p>
+      <w:pPr>
+        <w:spacing w:line="240" w:lineRule="auto" w:before="0" w:after="0"/>
+        <w:jc w:val="center"/>
+      </w:pPr>
+      <w:r>
+        <w:rPr>
+          <w:rFonts w:ascii="Calibri" w:hAnsi="Calibri" w:eastAsia="Calibri"/>
+          <w:b w:val="0"/>
+          <w:i w:val="0"/>
+          <w:sz w:val="24"/>
+        </w:rPr>
+        <w:t>Felipe Monsalve</w:t>
+      </w:r>
+    </w:p>
+    <w:p>
+      <w:pPr>
+        <w:spacing w:line="240" w:lineRule="auto" w:before="0" w:after="800"/>
+        <w:jc w:val="center"/>
+      </w:pPr>
+      <w:r>
+        <w:rPr>
+          <w:rFonts w:ascii="Calibri" w:hAnsi="Calibri" w:eastAsia="Calibri"/>
+          <w:b w:val="0"/>
+          <w:i w:val="0"/>
+          <w:sz w:val="24"/>
+        </w:rPr>
+        <w:t>Irma Beltrán</w:t>
+      </w:r>
+    </w:p>
+    <w:p>
+      <w:pPr>
+        <w:spacing w:line="240" w:lineRule="auto" w:before="0" w:after="120"/>
+        <w:jc w:val="center"/>
+      </w:pPr>
+      <w:r>
+        <w:rPr>
+          <w:rFonts w:ascii="Calibri" w:hAnsi="Calibri" w:eastAsia="Calibri"/>
+          <w:b w:val="0"/>
+          <w:i w:val="0"/>
+          <w:sz w:val="24"/>
+        </w:rPr>
+        <w:t>Octubre de 2026</w:t>
+      </w:r>
+    </w:p>
+    <w:p>
+      <w:pPr>
+        <w:spacing w:after="0"/>
+      </w:pPr>
+      <w:r>
+        <w:br w:type="page"/>
+      </w:r>
+    </w:p>
+    <w:p>
+      <w:pPr>
+        <w:spacing w:line="240" w:lineRule="auto" w:before="0" w:after="200"/>
+      </w:pPr>
+      <w:r>
+        <w:rPr>
+          <w:rFonts w:ascii="Calibri" w:hAnsi="Calibri" w:eastAsia="Calibri"/>
+          <w:b/>
+          <w:i w:val="0"/>
+          <w:color w:val="1F3864"/>
+          <w:sz w:val="30"/>
+        </w:rPr>
+        <w:t>Índice</w:t>
+      </w:r>
+    </w:p>
+    <w:p>
+      <w:pPr>
+        <w:spacing w:line="276" w:lineRule="auto" w:before="0" w:after="80"/>
+      </w:pPr>
+      <w:r>
+        <w:fldChar w:fldCharType="begin"/>
+      </w:r>
+      <w:r>
+        <w:instrText xml:space="preserve"> TOC \o "1-1" \u \h </w:instrText>
+      </w:r>
+      <w:r>
+        <w:fldChar w:fldCharType="separate"/>
+      </w:r>
+      <w:r>
+        <w:rPr>
+          <w:rFonts w:ascii="Calibri" w:hAnsi="Calibri"/>
+          <w:sz w:val="22"/>
+        </w:rPr>
+        <w:t>Resumen</w:t>
+      </w:r>
+    </w:p>
+    <w:p>
+      <w:pPr>
+        <w:spacing w:line="276" w:lineRule="auto" w:before="0" w:after="80"/>
+      </w:pPr>
+      <w:r>
+        <w:rPr>
+          <w:rFonts w:ascii="Calibri" w:hAnsi="Calibri"/>
+          <w:sz w:val="22"/>
+        </w:rPr>
+        <w:t>Abstract</w:t>
+      </w:r>
+    </w:p>
+    <w:p>
+      <w:pPr>
+        <w:spacing w:line="276" w:lineRule="auto" w:before="0" w:after="80"/>
+      </w:pPr>
+      <w:r>
+        <w:rPr>
+          <w:rFonts w:ascii="Calibri" w:hAnsi="Calibri"/>
+          <w:sz w:val="22"/>
+        </w:rPr>
+        <w:t>Desarrollo de ingeniería</w:t>
+      </w:r>
+    </w:p>
+    <w:p>
+      <w:pPr>
+        <w:spacing w:line="276" w:lineRule="auto" w:before="0" w:after="80"/>
+      </w:pPr>
+      <w:r>
+        <w:rPr>
+          <w:rFonts w:ascii="Calibri" w:hAnsi="Calibri"/>
+          <w:sz w:val="22"/>
+        </w:rPr>
+        <w:t>Conclusiones individuales (Individual conclusions)</w:t>
+      </w:r>
+    </w:p>
+    <w:p>
+      <w:pPr>
+        <w:spacing w:line="276" w:lineRule="auto" w:before="0" w:after="80"/>
+      </w:pPr>
+      <w:r>
+        <w:rPr>
+          <w:rFonts w:ascii="Calibri" w:hAnsi="Calibri"/>
+          <w:sz w:val="22"/>
+        </w:rPr>
+        <w:t>Reflexión individual (Individual reflection)</w:t>
+      </w:r>
+    </w:p>
+    <w:p>
+      <w:pPr>
+        <w:spacing w:line="276" w:lineRule="auto" w:before="0" w:after="80"/>
+      </w:pPr>
+      <w:r>
+        <w:rPr>
+          <w:rFonts w:ascii="Calibri" w:hAnsi="Calibri"/>
+          <w:sz w:val="22"/>
+        </w:rPr>
+        <w:t>Referencias</w:t>
+      </w:r>
+    </w:p>
+    <w:p>
+      <w:pPr>
+        <w:spacing w:line="276" w:lineRule="auto" w:before="0" w:after="80"/>
+      </w:pPr>
+      <w:r>
+        <w:rPr>
+          <w:rFonts w:ascii="Calibri" w:hAnsi="Calibri"/>
+          <w:sz w:val="22"/>
+        </w:rPr>
+        <w:t>Anexo de evidencias</w:t>
+      </w:r>
+      <w:r>
+        <w:fldChar w:fldCharType="end"/>
+      </w:r>
+    </w:p>
+    <w:p>
+      <w:pPr>
+        <w:spacing w:line="240" w:lineRule="auto" w:before="200" w:after="120"/>
+      </w:pPr>
+      <w:r>
+        <w:rPr>
+          <w:rFonts w:ascii="Calibri" w:hAnsi="Calibri" w:eastAsia="Calibri"/>
+          <w:b w:val="0"/>
+          <w:i/>
+          <w:color w:val="7F7F7F"/>
+          <w:sz w:val="18"/>
+        </w:rPr>
+        <w:t>Al abrir el documento en Word, acepta actualizar los campos para que el índice muestre los números de página.</w:t>
+      </w:r>
+    </w:p>
+    <w:p>
+      <w:pPr>
+        <w:spacing w:after="0"/>
+      </w:pPr>
+      <w:r>
+        <w:br w:type="page"/>
+      </w:r>
+    </w:p>
+    <w:p>
+      <w:pPr>
+        <w:pStyle w:val="APTTitulo1"/>
+        <w:spacing w:line="360" w:lineRule="auto" w:before="0" w:after="120"/>
+      </w:pPr>
+      <w:r>
+        <w:rPr>
+          <w:rFonts w:ascii="Calibri" w:hAnsi="Calibri" w:eastAsia="Calibri"/>
+          <w:b w:val="0"/>
+          <w:i w:val="0"/>
+          <w:sz w:val="22"/>
+        </w:rPr>
+        <w:t>Resumen</w:t>
+      </w:r>
+    </w:p>
+    <w:p>
+      <w:pPr>
+        <w:spacing w:line="360" w:lineRule="auto" w:before="0" w:after="120"/>
+        <w:jc w:val="both"/>
+      </w:pPr>
+      <w:r>
+        <w:rPr>
+          <w:rFonts w:ascii="Calibri" w:hAnsi="Calibri" w:eastAsia="Calibri"/>
+          <w:b w:val="0"/>
+          <w:i w:val="0"/>
+          <w:sz w:val="22"/>
+        </w:rPr>
+        <w:t>Este informe presenta el avance, con corte al 22 de octubre de 2026, del proyecto Volvo Sistema de Gestión, una aplicación de escritorio desarrollada en Python y PyQt6 para centralizar la información de contratos y flota del área de Servicios Conectados de Volvo Chile, que estaba repartida entre 10 y 15 planillas Excel. Como la política de ciberseguridad de la empresa impide usar bases de datos SQL, la solución trabaja en memoria sobre archivos Excel y CSV compartidos, con respaldo obligatorio, guardado sobre una copia temporal e historial de cambios. Se aplicó una metodología híbrida que combina Scrum y PMBOK (Schwaber y Sutherland, 2020; PMI, 2021). Los sprints 0 al 5 se completaron en las fechas planificadas, la carga de la aplicación bajó de 6,2 s a 0,9 s y el sistema cuenta con más de 1.000 pruebas automáticas. Se realizaron dos ajustes de fondo: la llave del VIN se cambió por el ID de contrato y el dashboard se rehízo dentro de la aplicación. Quedan pendientes las pruebas con usuarios (26-10 al 13-11) y la documentación final.</w:t>
+      </w:r>
+    </w:p>
+    <w:p>
+      <w:pPr>
+        <w:spacing w:line="240" w:lineRule="auto" w:before="0" w:after="120"/>
+      </w:pPr>
+      <w:r>
+        <w:rPr>
+          <w:rFonts w:ascii="Calibri" w:hAnsi="Calibri" w:eastAsia="Calibri"/>
+          <w:b w:val="0"/>
+          <w:i/>
+          <w:sz w:val="20"/>
+        </w:rPr>
+        <w:t>Palabras clave: aplicación de escritorio, integración de datos, Scrum, PMBOK, pruebas automáticas.</w:t>
+      </w:r>
+    </w:p>
+    <w:p>
+      <w:pPr>
+        <w:pStyle w:val="APTTitulo1"/>
+        <w:spacing w:line="360" w:lineRule="auto" w:before="0" w:after="120"/>
+      </w:pPr>
+      <w:r>
+        <w:rPr>
+          <w:rFonts w:ascii="Calibri" w:hAnsi="Calibri" w:eastAsia="Calibri"/>
+          <w:b w:val="0"/>
+          <w:i w:val="0"/>
+          <w:sz w:val="22"/>
+        </w:rPr>
+        <w:t>Abstract</w:t>
+      </w:r>
+    </w:p>
+    <w:p>
+      <w:pPr>
+        <w:spacing w:line="360" w:lineRule="auto" w:before="0" w:after="120"/>
+        <w:jc w:val="both"/>
+      </w:pPr>
+      <w:r>
+        <w:rPr>
+          <w:rFonts w:ascii="Calibri" w:hAnsi="Calibri" w:eastAsia="Calibri"/>
+          <w:b w:val="0"/>
+          <w:i w:val="0"/>
+          <w:sz w:val="22"/>
+        </w:rPr>
+        <w:t>This report presents the progress, as of October 22, 2026, of the Volvo Sistema de Gestión project, a desktop application built with Python and PyQt6 to centralize the contract and fleet information of the Connected Services area at Volvo Chile, which was scattered across 10 to 15 Excel spreadsheets. Because the company's cybersecurity policy does not allow SQL databases, the solution works in memory on shared Excel and CSV files, with a mandatory backup, saving through a temporary copy, and a change history. A hybrid methodology combining Scrum and PMBOK was applied (Schwaber &amp; Sutherland, 2020; PMI, 2021). Sprints 0 to 5 were completed on the planned dates, the application load time dropped from 6.2 s to 0.9 s, and the system has more than 1,000 automated tests. Two major adjustments were made: the key was changed from the VIN to the contract ID, and the dashboard was rebuilt inside the application. User testing (October 26 to November 13) and the final documentation are still pending.</w:t>
+      </w:r>
+    </w:p>
+    <w:p>
+      <w:pPr>
+        <w:spacing w:line="240" w:lineRule="auto" w:before="0" w:after="120"/>
+      </w:pPr>
+      <w:r>
+        <w:rPr>
+          <w:rFonts w:ascii="Calibri" w:hAnsi="Calibri" w:eastAsia="Calibri"/>
+          <w:b w:val="0"/>
+          <w:i/>
+          <w:sz w:val="20"/>
+        </w:rPr>
+        <w:t>Keywords: desktop application, data integration, Scrum, PMBOK, automated testing.</w:t>
+      </w:r>
+    </w:p>
+    <w:p>
+      <w:pPr>
+        <w:spacing w:after="0"/>
+      </w:pPr>
+      <w:r>
+        <w:br w:type="page"/>
+      </w:r>
+    </w:p>
+    <w:p>
+      <w:pPr>
+        <w:pStyle w:val="APTTitulo1"/>
+        <w:spacing w:line="360" w:lineRule="auto" w:before="0" w:after="120"/>
+      </w:pPr>
+      <w:r>
+        <w:rPr>
+          <w:rFonts w:ascii="Calibri" w:hAnsi="Calibri" w:eastAsia="Calibri"/>
+          <w:b w:val="0"/>
+          <w:i w:val="0"/>
+          <w:sz w:val="22"/>
+        </w:rPr>
+        <w:t>Desarrollo de ingeniería</w:t>
+      </w:r>
+    </w:p>
+    <w:p>
+      <w:pPr>
+        <w:spacing w:line="240" w:lineRule="auto" w:before="0" w:after="160"/>
+      </w:pPr>
+      <w:r>
+        <w:rPr>
+          <w:rFonts w:ascii="Calibri" w:hAnsi="Calibri" w:eastAsia="Calibri"/>
+          <w:b w:val="0"/>
+          <w:i/>
+          <w:sz w:val="20"/>
+        </w:rPr>
+        <w:t>Desarrollo del proyecto según la Guía 2 (Desarrollo Proyecto APT): resumen de avance, monitoreo del plan de trabajo y ajustes a partir del monitoreo.</w:t>
+      </w:r>
+    </w:p>
     <w:p/>
     <w:p>
       <w:pPr>
@@ -5514,11 +5932,301 @@
         </w:rPr>
       </w:pPr>
     </w:p>
+    <w:p>
+      <w:pPr>
+        <w:spacing w:after="0"/>
+      </w:pPr>
+      <w:r>
+        <w:br w:type="page"/>
+      </w:r>
+    </w:p>
+    <w:p>
+      <w:pPr>
+        <w:pStyle w:val="APTTitulo1"/>
+        <w:spacing w:line="360" w:lineRule="auto" w:before="0" w:after="120"/>
+      </w:pPr>
+      <w:r>
+        <w:rPr>
+          <w:rFonts w:ascii="Calibri" w:hAnsi="Calibri" w:eastAsia="Calibri"/>
+          <w:b w:val="0"/>
+          <w:i w:val="0"/>
+          <w:sz w:val="22"/>
+        </w:rPr>
+        <w:t>Conclusiones individuales (Individual conclusions)</w:t>
+      </w:r>
+    </w:p>
+    <w:p>
+      <w:pPr>
+        <w:pStyle w:val="APTTitulo2"/>
+        <w:spacing w:line="360" w:lineRule="auto" w:before="0" w:after="120"/>
+      </w:pPr>
+      <w:r>
+        <w:rPr>
+          <w:rFonts w:ascii="Calibri" w:hAnsi="Calibri" w:eastAsia="Calibri"/>
+          <w:b w:val="0"/>
+          <w:i w:val="0"/>
+          <w:sz w:val="22"/>
+        </w:rPr>
+        <w:t>Felipe Monsalve</w:t>
+      </w:r>
+    </w:p>
+    <w:p>
+      <w:pPr>
+        <w:spacing w:line="360" w:lineRule="auto" w:before="0" w:after="120"/>
+        <w:jc w:val="both"/>
+      </w:pPr>
+      <w:r>
+        <w:rPr>
+          <w:rFonts w:ascii="Calibri" w:hAnsi="Calibri" w:eastAsia="Calibri"/>
+          <w:b w:val="0"/>
+          <w:i w:val="0"/>
+          <w:sz w:val="22"/>
+        </w:rPr>
+        <w:t>The project reached its main technical goals for this stage. The application load time dropped from 6.2 s to 0.9 s, and reading the customer database from Power BI went from 11–17 s to 0.5 s. Every optimization was measured before and after the change, so the improvement can be verified and not only claimed. The system also has more than 1,000 automated tests that run on test data and not on real data, and all nine measured save operations were completed with the mandatory backup.</w:t>
+      </w:r>
+    </w:p>
+    <w:p>
+      <w:pPr>
+        <w:spacing w:line="360" w:lineRule="auto" w:before="0" w:after="120"/>
+        <w:jc w:val="both"/>
+      </w:pPr>
+      <w:r>
+        <w:rPr>
+          <w:rFonts w:ascii="Calibri" w:hAnsi="Calibri" w:eastAsia="Calibri"/>
+          <w:b w:val="0"/>
+          <w:i w:val="0"/>
+          <w:sz w:val="22"/>
+        </w:rPr>
+        <w:t>These results show that the design decisions were effective: loading in the background, saving through a temporary copy, and using shared keys such as the VIN and the CDB and, later, the contract ID. Sprints 0 to 5 were completed on schedule, and Sprint 6, the closing of the application, was due on October 23, 2026. What remains is to validate the system with the real users of the area (October 26 to November 13) and to correct the errors they find.</w:t>
+      </w:r>
+    </w:p>
+    <w:p>
+      <w:pPr>
+        <w:pStyle w:val="APTTitulo1"/>
+        <w:spacing w:line="360" w:lineRule="auto" w:before="0" w:after="120"/>
+      </w:pPr>
+      <w:r>
+        <w:rPr>
+          <w:rFonts w:ascii="Calibri" w:hAnsi="Calibri" w:eastAsia="Calibri"/>
+          <w:b w:val="0"/>
+          <w:i w:val="0"/>
+          <w:sz w:val="22"/>
+        </w:rPr>
+        <w:t>Reflexión individual (Individual reflection)</w:t>
+      </w:r>
+    </w:p>
+    <w:p>
+      <w:pPr>
+        <w:pStyle w:val="APTTitulo2"/>
+        <w:spacing w:line="360" w:lineRule="auto" w:before="0" w:after="120"/>
+      </w:pPr>
+      <w:r>
+        <w:rPr>
+          <w:rFonts w:ascii="Calibri" w:hAnsi="Calibri" w:eastAsia="Calibri"/>
+          <w:b w:val="0"/>
+          <w:i w:val="0"/>
+          <w:sz w:val="22"/>
+        </w:rPr>
+        <w:t>Felipe Monsalve</w:t>
+      </w:r>
+    </w:p>
+    <w:p>
+      <w:pPr>
+        <w:spacing w:line="360" w:lineRule="auto" w:before="0" w:after="120"/>
+        <w:jc w:val="both"/>
+      </w:pPr>
+      <w:r>
+        <w:rPr>
+          <w:rFonts w:ascii="Calibri" w:hAnsi="Calibri" w:eastAsia="Calibri"/>
+          <w:b w:val="0"/>
+          <w:i w:val="0"/>
+          <w:sz w:val="22"/>
+        </w:rPr>
+        <w:t>The biggest challenge was building a system that behaves like a relational database without being allowed to use one. The company's cybersecurity policy prohibits SQL databases and our own servers, so I had to think carefully about how each screen communicates with the others and how the files relate to each other, using keys such as the VIN, the CDB and, later, the contract ID. This forced me to design the data model first and only then write the code.</w:t>
+      </w:r>
+    </w:p>
+    <w:p>
+      <w:pPr>
+        <w:spacing w:line="360" w:lineRule="auto" w:before="0" w:after="120"/>
+        <w:jc w:val="both"/>
+      </w:pPr>
+      <w:r>
+        <w:rPr>
+          <w:rFonts w:ascii="Calibri" w:hAnsi="Calibri" w:eastAsia="Calibri"/>
+          <w:b w:val="0"/>
+          <w:i w:val="0"/>
+          <w:sz w:val="22"/>
+        </w:rPr>
+        <w:t>My way of working is to ask myself first how each component should work, draw it in a diagram, move on to the code to see how it turns out, and finally fix what fails. I believe this method is right for this project because it anticipates problems and avoids taking one step forward and two steps back. If I had programmed without planning, I would have discovered along the way problems that a good plan would have shown earlier.</w:t>
+      </w:r>
+    </w:p>
+    <w:p>
+      <w:pPr>
+        <w:spacing w:line="360" w:lineRule="auto" w:before="0" w:after="120"/>
+        <w:jc w:val="both"/>
+      </w:pPr>
+      <w:r>
+        <w:rPr>
+          <w:rFonts w:ascii="Calibri" w:hAnsi="Calibri" w:eastAsia="Calibri"/>
+          <w:b w:val="0"/>
+          <w:i w:val="0"/>
+          <w:sz w:val="22"/>
+        </w:rPr>
+        <w:t>Working directly with the client taught me to validate every business rule with the Product Owner before implementing it, and to record each change formally through a change request (RFC), because the rules kept changing as people used the system.</w:t>
+      </w:r>
+    </w:p>
+    <w:p>
+      <w:pPr>
+        <w:spacing w:line="360" w:lineRule="auto" w:before="0" w:after="120"/>
+        <w:jc w:val="both"/>
+      </w:pPr>
+      <w:r>
+        <w:rPr>
+          <w:rFonts w:ascii="Calibri" w:hAnsi="Calibri" w:eastAsia="Calibri"/>
+          <w:b w:val="0"/>
+          <w:i w:val="0"/>
+          <w:sz w:val="22"/>
+        </w:rPr>
+        <w:t>Looking ahead, I think this system could have been built more easily on a relational database, so I would propose it as a future improvement if the company allows it. In the short term, the next step is the user testing with the area team (October 26 to November 13), where I expect to find and correct errors and to collect improvement requests.</w:t>
+      </w:r>
+    </w:p>
+    <w:p>
+      <w:pPr>
+        <w:pStyle w:val="APTTitulo1"/>
+        <w:spacing w:line="360" w:lineRule="auto" w:before="0" w:after="120"/>
+      </w:pPr>
+      <w:r>
+        <w:rPr>
+          <w:rFonts w:ascii="Calibri" w:hAnsi="Calibri" w:eastAsia="Calibri"/>
+          <w:b w:val="0"/>
+          <w:i w:val="0"/>
+          <w:sz w:val="22"/>
+        </w:rPr>
+        <w:t>Referencias</w:t>
+      </w:r>
+    </w:p>
+    <w:p>
+      <w:pPr>
+        <w:spacing w:line="276" w:lineRule="auto" w:before="0" w:after="120"/>
+        <w:ind w:left="567" w:hanging="567"/>
+      </w:pPr>
+      <w:r>
+        <w:rPr>
+          <w:rFonts w:ascii="Calibri" w:hAnsi="Calibri" w:eastAsia="Calibri"/>
+          <w:b w:val="0"/>
+          <w:i w:val="0"/>
+          <w:sz w:val="22"/>
+        </w:rPr>
+        <w:t>Project Management Institute. (2021). A guide to the project management body of knowledge (PMBOK® guide) (7th ed.). Project Management Institute.</w:t>
+      </w:r>
+    </w:p>
+    <w:p>
+      <w:pPr>
+        <w:spacing w:line="276" w:lineRule="auto" w:before="0" w:after="120"/>
+        <w:ind w:left="567" w:hanging="567"/>
+      </w:pPr>
+      <w:r>
+        <w:rPr>
+          <w:rFonts w:ascii="Calibri" w:hAnsi="Calibri" w:eastAsia="Calibri"/>
+          <w:b w:val="0"/>
+          <w:i w:val="0"/>
+          <w:sz w:val="22"/>
+        </w:rPr>
+        <w:t>Schwaber, K., &amp; Sutherland, J. (2020). The Scrum Guide: The definitive guide to Scrum: The rules of the game. Scrum.org. https://scrumguides.org</w:t>
+      </w:r>
+    </w:p>
+    <w:p>
+      <w:pPr>
+        <w:pStyle w:val="APTTitulo1"/>
+        <w:spacing w:line="360" w:lineRule="auto" w:before="0" w:after="120"/>
+      </w:pPr>
+      <w:r>
+        <w:rPr>
+          <w:rFonts w:ascii="Calibri" w:hAnsi="Calibri" w:eastAsia="Calibri"/>
+          <w:b w:val="0"/>
+          <w:i w:val="0"/>
+          <w:sz w:val="22"/>
+        </w:rPr>
+        <w:t>Anexo de evidencias</w:t>
+      </w:r>
+    </w:p>
+    <w:p>
+      <w:pPr>
+        <w:spacing w:line="276" w:lineRule="auto" w:before="0" w:after="80"/>
+      </w:pPr>
+      <w:r>
+        <w:rPr>
+          <w:rFonts w:ascii="Calibri" w:hAnsi="Calibri" w:eastAsia="Calibri"/>
+          <w:b w:val="0"/>
+          <w:i w:val="0"/>
+          <w:sz w:val="22"/>
+        </w:rPr>
+        <w:t>A. Repositorio del equipo en GitHub: felipeMon20/PTY4614-302-EQUIPO-2, carpeta Fase 2 / Evidencias Proyecto.</w:t>
+      </w:r>
+    </w:p>
+    <w:p>
+      <w:pPr>
+        <w:spacing w:line="276" w:lineRule="auto" w:before="0" w:after="80"/>
+      </w:pPr>
+      <w:r>
+        <w:rPr>
+          <w:rFonts w:ascii="Calibri" w:hAnsi="Calibri" w:eastAsia="Calibri"/>
+          <w:b w:val="0"/>
+          <w:i w:val="0"/>
+          <w:sz w:val="22"/>
+        </w:rPr>
+        <w:t>B. Código y pruebas automáticas: Evidencias de sistema / Aplicación (carpetas src y src/tests).</w:t>
+      </w:r>
+    </w:p>
+    <w:p>
+      <w:pPr>
+        <w:spacing w:line="276" w:lineRule="auto" w:before="0" w:after="80"/>
+      </w:pPr>
+      <w:r>
+        <w:rPr>
+          <w:rFonts w:ascii="Calibri" w:hAnsi="Calibri" w:eastAsia="Calibri"/>
+          <w:b w:val="0"/>
+          <w:i w:val="0"/>
+          <w:sz w:val="22"/>
+        </w:rPr>
+        <w:t>C. Documentación técnica y diagramas: Evidencias de documentación / docs y diagramas.</w:t>
+      </w:r>
+    </w:p>
+    <w:p>
+      <w:pPr>
+        <w:spacing w:line="276" w:lineRule="auto" w:before="0" w:after="80"/>
+      </w:pPr>
+      <w:r>
+        <w:rPr>
+          <w:rFonts w:ascii="Calibri" w:hAnsi="Calibri" w:eastAsia="Calibri"/>
+          <w:b w:val="0"/>
+          <w:i w:val="0"/>
+          <w:sz w:val="22"/>
+        </w:rPr>
+        <w:t>D. Documentación de calidad y gestión: Evidencias de documentación / calidad (plan de pruebas, casos de prueba, reporte de ejecución de pruebas, plan de gestión de cambios, solicitud de cambio RFC y reporte de defectos).</w:t>
+      </w:r>
+    </w:p>
+    <w:p>
+      <w:pPr>
+        <w:spacing w:line="276" w:lineRule="auto" w:before="0" w:after="80"/>
+      </w:pPr>
+      <w:r>
+        <w:rPr>
+          <w:rFonts w:ascii="Calibri" w:hAnsi="Calibri" w:eastAsia="Calibri"/>
+          <w:b w:val="0"/>
+          <w:i w:val="0"/>
+          <w:sz w:val="22"/>
+        </w:rPr>
+        <w:t>E. Capturas de la aplicación con datos ficticios: Figuras 1 y 2 de la sección de evidencias de avance.</w:t>
+      </w:r>
+    </w:p>
     <w:sectPr>
       <w:headerReference w:type="default" r:id="rId12"/>
+      <w:footerReference w:type="default" r:id="rId15"/>
       <w:pgSz w:w="11906" w:h="16838"/>
       <w:pgMar w:top="1417" w:right="1701" w:bottom="1417" w:left="1701" w:header="708" w:footer="708" w:gutter="0"/>
       <w:cols w:space="708"/>
+      <w:titlePg/>
       <w:docGrid w:linePitch="360"/>
     </w:sectPr>
   </w:body>
@@ -5548,6 +6256,27 @@
     </w:p>
   </w:endnote>
 </w:endnotes>
+</file>
+
+<file path=word/footer1.xml><?xml version="1.0" encoding="utf-8"?>
+<w:ftr xmlns:m="http://schemas.openxmlformats.org/officeDocument/2006/math" xmlns:mc="http://schemas.openxmlformats.org/markup-compatibility/2006" xmlns:mo="http://schemas.microsoft.com/office/mac/office/2008/main" xmlns:mv="urn:schemas-microsoft-com:mac:vml" xmlns:o="urn:schemas-microsoft-com:office:office" xmlns:r="http://schemas.openxmlformats.org/officeDocument/2006/relationships" xmlns:v="urn:schemas-microsoft-com:vml" xmlns:w10="urn:schemas-microsoft-com:office:word" xmlns:w14="http://schemas.microsoft.com/office/word/2010/wordml" xmlns:w="http://schemas.openxmlformats.org/wordprocessingml/2006/main" xmlns:wne="http://schemas.microsoft.com/office/word/2006/wordml" xmlns:wp14="http://schemas.microsoft.com/office/word/2010/wordprocessingDrawing" xmlns:wp="http://schemas.openxmlformats.org/drawingml/2006/wordprocessingDrawing" xmlns:wpc="http://schemas.microsoft.com/office/word/2010/wordprocessingCanvas" xmlns:wpg="http://schemas.microsoft.com/office/word/2010/wordprocessingGroup" xmlns:wpi="http://schemas.microsoft.com/office/word/2010/wordprocessingInk" xmlns:wps="http://schemas.microsoft.com/office/word/2010/wordprocessingShape" mc:Ignorable="w14 wp14">
+  <w:p>
+    <w:pPr>
+      <w:pStyle w:val="Footer"/>
+      <w:jc w:val="center"/>
+    </w:pPr>
+    <w:r/>
+    <w:r>
+      <w:rPr>
+        <w:rFonts w:ascii="Calibri" w:hAnsi="Calibri"/>
+        <w:sz w:val="20"/>
+      </w:rPr>
+      <w:fldChar w:fldCharType="begin"/>
+      <w:instrText xml:space="preserve"> PAGE </w:instrText>
+      <w:fldChar w:fldCharType="end"/>
+    </w:r>
+  </w:p>
+</w:ftr>
 </file>
 
 <file path=word/footnotes.xml><?xml version="1.0" encoding="utf-8"?>
@@ -6680,6 +7409,36 @@
       <w:szCs w:val="20"/>
     </w:rPr>
   </w:style>
+  <w:style w:type="paragraph" w:customStyle="1" w:styleId="APTTitulo1">
+    <w:name w:val="APT Titulo 1"/>
+    <w:basedOn w:val="Normal"/>
+    <w:pPr>
+      <w:keepNext/>
+      <w:spacing w:before="280" w:after="120"/>
+      <w:outlineLvl w:val="0"/>
+    </w:pPr>
+    <w:rPr>
+      <w:rFonts w:ascii="Calibri" w:hAnsi="Calibri" w:cs="Calibri" w:eastAsia="Calibri"/>
+      <w:b/>
+      <w:color w:val="1F3864"/>
+      <w:sz w:val="30"/>
+    </w:rPr>
+  </w:style>
+  <w:style w:type="paragraph" w:customStyle="1" w:styleId="APTTitulo2">
+    <w:name w:val="APT Titulo 2"/>
+    <w:basedOn w:val="Normal"/>
+    <w:pPr>
+      <w:keepNext/>
+      <w:spacing w:before="280" w:after="120"/>
+      <w:outlineLvl w:val="1"/>
+    </w:pPr>
+    <w:rPr>
+      <w:rFonts w:ascii="Calibri" w:hAnsi="Calibri" w:cs="Calibri" w:eastAsia="Calibri"/>
+      <w:b/>
+      <w:color w:val="1F3864"/>
+      <w:sz w:val="24"/>
+    </w:rPr>
+  </w:style>
 </w:styles>
 </file>
 

</xml_diff>